<commit_message>
Added colors and data analytics experience
</commit_message>
<xml_diff>
--- a/Mihir_Resume_ME.docx
+++ b/Mihir_Resume_ME.docx
@@ -23,6 +23,7 @@
           <w:rFonts w:ascii="Arial" w:hAnsi="Arial" w:cs="Arial"/>
           <w:b/>
           <w:bCs/>
+          <w:color w:val="4C94D8" w:themeColor="text2" w:themeTint="80"/>
           <w:sz w:val="36"/>
           <w:szCs w:val="36"/>
         </w:rPr>
@@ -32,6 +33,7 @@
           <w:rFonts w:ascii="Arial" w:hAnsi="Arial" w:cs="Arial"/>
           <w:b/>
           <w:bCs/>
+          <w:color w:val="4C94D8" w:themeColor="text2" w:themeTint="80"/>
           <w:sz w:val="36"/>
           <w:szCs w:val="36"/>
         </w:rPr>
@@ -100,22 +102,623 @@
         </w:tabs>
         <w:spacing w:after="0"/>
         <w:rPr>
+          <w:rFonts w:ascii="Times New Roman" w:hAnsi="Times New Roman" w:cs="Times New Roman"/>
+          <w:color w:val="4C94D8" w:themeColor="text2" w:themeTint="80"/>
+        </w:rPr>
+      </w:pPr>
+      <w:r>
+        <w:rPr>
           <w:rFonts w:ascii="Arial" w:hAnsi="Arial" w:cs="Arial"/>
           <w:b/>
           <w:bCs/>
-          <w:sz w:val="26"/>
-          <w:szCs w:val="26"/>
-        </w:rPr>
-      </w:pPr>
+          <w:noProof/>
+          <w:color w:val="0E2841" w:themeColor="text2"/>
+        </w:rPr>
+        <mc:AlternateContent>
+          <mc:Choice Requires="wps">
+            <w:drawing>
+              <wp:anchor distT="0" distB="0" distL="114300" distR="114300" simplePos="0" relativeHeight="251659264" behindDoc="0" locked="0" layoutInCell="1" allowOverlap="1" wp14:anchorId="3C9FE445" wp14:editId="6B26D562">
+                <wp:simplePos x="0" y="0"/>
+                <wp:positionH relativeFrom="column">
+                  <wp:posOffset>14990</wp:posOffset>
+                </wp:positionH>
+                <wp:positionV relativeFrom="paragraph">
+                  <wp:posOffset>192467</wp:posOffset>
+                </wp:positionV>
+                <wp:extent cx="6842770" cy="0"/>
+                <wp:effectExtent l="0" t="12700" r="15240" b="12700"/>
+                <wp:wrapNone/>
+                <wp:docPr id="558566551" name="Straight Connector 1"/>
+                <wp:cNvGraphicFramePr/>
+                <a:graphic xmlns:a="http://schemas.openxmlformats.org/drawingml/2006/main">
+                  <a:graphicData uri="http://schemas.microsoft.com/office/word/2010/wordprocessingShape">
+                    <wps:wsp>
+                      <wps:cNvCnPr/>
+                      <wps:spPr>
+                        <a:xfrm>
+                          <a:off x="0" y="0"/>
+                          <a:ext cx="6842770" cy="0"/>
+                        </a:xfrm>
+                        <a:prstGeom prst="line">
+                          <a:avLst/>
+                        </a:prstGeom>
+                      </wps:spPr>
+                      <wps:style>
+                        <a:lnRef idx="2">
+                          <a:schemeClr val="dk1"/>
+                        </a:lnRef>
+                        <a:fillRef idx="0">
+                          <a:schemeClr val="dk1"/>
+                        </a:fillRef>
+                        <a:effectRef idx="1">
+                          <a:schemeClr val="dk1"/>
+                        </a:effectRef>
+                        <a:fontRef idx="minor">
+                          <a:schemeClr val="tx1"/>
+                        </a:fontRef>
+                      </wps:style>
+                      <wps:bodyPr/>
+                    </wps:wsp>
+                  </a:graphicData>
+                </a:graphic>
+                <wp14:sizeRelH relativeFrom="margin">
+                  <wp14:pctWidth>0</wp14:pctWidth>
+                </wp14:sizeRelH>
+              </wp:anchor>
+            </w:drawing>
+          </mc:Choice>
+          <mc:Fallback>
+            <w:pict>
+              <v:line w14:anchorId="2A558C37" id="Straight Connector 1" o:spid="_x0000_s1026" style="position:absolute;z-index:251659264;visibility:visible;mso-wrap-style:square;mso-width-percent:0;mso-wrap-distance-left:9pt;mso-wrap-distance-top:0;mso-wrap-distance-right:9pt;mso-wrap-distance-bottom:0;mso-position-horizontal:absolute;mso-position-horizontal-relative:text;mso-position-vertical:absolute;mso-position-vertical-relative:text;mso-width-percent:0;mso-width-relative:margin" from="1.2pt,15.15pt" to="540pt,15.15pt" o:gfxdata="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" strokecolor="black [3200]" strokeweight="1.5pt">
+                <v:stroke joinstyle="miter"/>
+              </v:line>
+            </w:pict>
+          </mc:Fallback>
+        </mc:AlternateContent>
+      </w:r>
       <w:r>
         <w:rPr>
           <w:rFonts w:ascii="Arial" w:hAnsi="Arial" w:cs="Arial"/>
           <w:b/>
           <w:bCs/>
-          <w:sz w:val="26"/>
-          <w:szCs w:val="26"/>
-        </w:rPr>
-        <w:t>Professional Summary</w:t>
+          <w:color w:val="4C94D8" w:themeColor="text2" w:themeTint="80"/>
+        </w:rPr>
+        <w:t>Educ</w:t>
+      </w:r>
+      <w:r>
+        <w:rPr>
+          <w:rFonts w:ascii="Arial" w:hAnsi="Arial" w:cs="Arial"/>
+          <w:b/>
+          <w:bCs/>
+          <w:color w:val="4C94D8" w:themeColor="text2" w:themeTint="80"/>
+        </w:rPr>
+        <w:t>ation</w:t>
+      </w:r>
+    </w:p>
+    <w:p>
+      <w:pPr>
+        <w:tabs>
+          <w:tab w:val="right" w:pos="10800"/>
+        </w:tabs>
+        <w:spacing w:after="0" w:line="240" w:lineRule="auto"/>
+        <w:rPr>
+          <w:rFonts w:ascii="Times New Roman" w:hAnsi="Times New Roman" w:cs="Times New Roman"/>
+          <w:b/>
+          <w:bCs/>
+          <w:sz w:val="2"/>
+          <w:szCs w:val="2"/>
+        </w:rPr>
+      </w:pPr>
+    </w:p>
+    <w:p>
+      <w:pPr>
+        <w:tabs>
+          <w:tab w:val="right" w:pos="10800"/>
+        </w:tabs>
+        <w:spacing w:after="0" w:line="240" w:lineRule="auto"/>
+        <w:rPr>
+          <w:rFonts w:ascii="Times New Roman" w:hAnsi="Times New Roman" w:cs="Times New Roman"/>
+          <w:b/>
+          <w:bCs/>
+          <w:sz w:val="22"/>
+          <w:szCs w:val="22"/>
+        </w:rPr>
+      </w:pPr>
+      <w:r>
+        <w:rPr>
+          <w:rFonts w:ascii="Times New Roman" w:hAnsi="Times New Roman" w:cs="Times New Roman"/>
+          <w:b/>
+          <w:bCs/>
+          <w:sz w:val="22"/>
+          <w:szCs w:val="22"/>
+        </w:rPr>
+        <w:t>University of Massachusetts, Amherst</w:t>
+      </w:r>
+      <w:r>
+        <w:rPr>
+          <w:rFonts w:ascii="Times New Roman" w:hAnsi="Times New Roman" w:cs="Times New Roman"/>
+          <w:b/>
+          <w:bCs/>
+          <w:sz w:val="22"/>
+          <w:szCs w:val="22"/>
+        </w:rPr>
+        <w:tab/>
+      </w:r>
+      <w:proofErr w:type="spellStart"/>
+      <w:r>
+        <w:rPr>
+          <w:rFonts w:ascii="Times New Roman" w:hAnsi="Times New Roman" w:cs="Times New Roman"/>
+          <w:b/>
+          <w:bCs/>
+          <w:sz w:val="22"/>
+          <w:szCs w:val="22"/>
+        </w:rPr>
+        <w:t>Amherst</w:t>
+      </w:r>
+      <w:proofErr w:type="spellEnd"/>
+      <w:r>
+        <w:rPr>
+          <w:rFonts w:ascii="Times New Roman" w:hAnsi="Times New Roman" w:cs="Times New Roman"/>
+          <w:b/>
+          <w:bCs/>
+          <w:sz w:val="22"/>
+          <w:szCs w:val="22"/>
+        </w:rPr>
+        <w:t>, MA</w:t>
+      </w:r>
+    </w:p>
+    <w:p>
+      <w:pPr>
+        <w:tabs>
+          <w:tab w:val="right" w:pos="10800"/>
+        </w:tabs>
+        <w:spacing w:after="0" w:line="240" w:lineRule="auto"/>
+        <w:rPr>
+          <w:rFonts w:ascii="Times New Roman" w:hAnsi="Times New Roman" w:cs="Times New Roman"/>
+          <w:sz w:val="22"/>
+          <w:szCs w:val="22"/>
+        </w:rPr>
+      </w:pPr>
+      <w:r>
+        <w:rPr>
+          <w:rFonts w:ascii="Times New Roman" w:hAnsi="Times New Roman" w:cs="Times New Roman"/>
+          <w:sz w:val="22"/>
+          <w:szCs w:val="22"/>
+        </w:rPr>
+        <w:t>Bachelor of Science in Mechanical Engineering</w:t>
+      </w:r>
+      <w:r>
+        <w:rPr>
+          <w:rFonts w:ascii="Times New Roman" w:hAnsi="Times New Roman" w:cs="Times New Roman"/>
+          <w:b/>
+          <w:bCs/>
+          <w:sz w:val="22"/>
+          <w:szCs w:val="22"/>
+        </w:rPr>
+        <w:t xml:space="preserve"> </w:t>
+      </w:r>
+      <w:r>
+        <w:rPr>
+          <w:rFonts w:ascii="Times New Roman" w:hAnsi="Times New Roman" w:cs="Times New Roman"/>
+          <w:b/>
+          <w:bCs/>
+          <w:sz w:val="22"/>
+          <w:szCs w:val="22"/>
+        </w:rPr>
+        <w:tab/>
+      </w:r>
+      <w:r>
+        <w:rPr>
+          <w:rFonts w:ascii="Times New Roman" w:hAnsi="Times New Roman" w:cs="Times New Roman"/>
+          <w:sz w:val="22"/>
+          <w:szCs w:val="22"/>
+        </w:rPr>
+        <w:t xml:space="preserve">Sep 2019 - </w:t>
+      </w:r>
+      <w:r>
+        <w:rPr>
+          <w:rFonts w:ascii="Times New Roman" w:hAnsi="Times New Roman" w:cs="Times New Roman"/>
+          <w:sz w:val="22"/>
+          <w:szCs w:val="22"/>
+        </w:rPr>
+        <w:t>May 2023</w:t>
+      </w:r>
+    </w:p>
+    <w:p>
+      <w:pPr>
+        <w:tabs>
+          <w:tab w:val="right" w:pos="10800"/>
+        </w:tabs>
+        <w:spacing w:after="0" w:line="240" w:lineRule="auto"/>
+        <w:rPr>
+          <w:rFonts w:ascii="Times New Roman" w:hAnsi="Times New Roman" w:cs="Times New Roman"/>
+          <w:sz w:val="22"/>
+          <w:szCs w:val="22"/>
+        </w:rPr>
+      </w:pPr>
+      <w:r>
+        <w:rPr>
+          <w:rFonts w:ascii="Times New Roman" w:hAnsi="Times New Roman" w:cs="Times New Roman"/>
+          <w:sz w:val="22"/>
+          <w:szCs w:val="22"/>
+        </w:rPr>
+        <w:t xml:space="preserve">Relevant Coursework: Heat Transfer, Fluid Mechanics, Vibrations, Statics, Mechanics of Materials, </w:t>
+      </w:r>
+      <w:r>
+        <w:rPr>
+          <w:rFonts w:ascii="Times New Roman" w:hAnsi="Times New Roman" w:cs="Times New Roman"/>
+          <w:sz w:val="22"/>
+          <w:szCs w:val="22"/>
+        </w:rPr>
+        <w:t xml:space="preserve">Mechanical </w:t>
+      </w:r>
+      <w:r>
+        <w:rPr>
+          <w:rFonts w:ascii="Times New Roman" w:hAnsi="Times New Roman" w:cs="Times New Roman"/>
+          <w:sz w:val="22"/>
+          <w:szCs w:val="22"/>
+        </w:rPr>
+        <w:t>Design</w:t>
+      </w:r>
+      <w:r>
+        <w:rPr>
+          <w:rFonts w:ascii="Times New Roman" w:hAnsi="Times New Roman" w:cs="Times New Roman"/>
+          <w:sz w:val="22"/>
+          <w:szCs w:val="22"/>
+        </w:rPr>
+        <w:t>, Manufacturing Processes, Multivariate Calculus, Ordinary Differential Equations</w:t>
+      </w:r>
+    </w:p>
+    <w:p>
+      <w:pPr>
+        <w:tabs>
+          <w:tab w:val="right" w:pos="9000"/>
+        </w:tabs>
+        <w:spacing w:after="0"/>
+        <w:rPr>
+          <w:rFonts w:ascii="Arial" w:hAnsi="Arial" w:cs="Arial"/>
+          <w:b/>
+          <w:bCs/>
+          <w:color w:val="4C94D8" w:themeColor="text2" w:themeTint="80"/>
+          <w:sz w:val="6"/>
+          <w:szCs w:val="6"/>
+        </w:rPr>
+      </w:pPr>
+    </w:p>
+    <w:p>
+      <w:pPr>
+        <w:tabs>
+          <w:tab w:val="right" w:pos="9000"/>
+        </w:tabs>
+        <w:spacing w:after="0"/>
+        <w:rPr>
+          <w:rFonts w:ascii="Arial" w:hAnsi="Arial" w:cs="Arial"/>
+        </w:rPr>
+      </w:pPr>
+      <w:r>
+        <w:rPr>
+          <w:rFonts w:ascii="Arial" w:hAnsi="Arial" w:cs="Arial"/>
+          <w:b/>
+          <w:bCs/>
+          <w:noProof/>
+          <w:color w:val="0E2841" w:themeColor="text2"/>
+        </w:rPr>
+        <mc:AlternateContent>
+          <mc:Choice Requires="wps">
+            <w:drawing>
+              <wp:anchor distT="0" distB="0" distL="114300" distR="114300" simplePos="0" relativeHeight="251660288" behindDoc="0" locked="0" layoutInCell="1" allowOverlap="1" wp14:anchorId="57B09167" wp14:editId="4A3EA304">
+                <wp:simplePos x="0" y="0"/>
+                <wp:positionH relativeFrom="column">
+                  <wp:posOffset>14990</wp:posOffset>
+                </wp:positionH>
+                <wp:positionV relativeFrom="paragraph">
+                  <wp:posOffset>178258</wp:posOffset>
+                </wp:positionV>
+                <wp:extent cx="6842770" cy="0"/>
+                <wp:effectExtent l="0" t="12700" r="15240" b="12700"/>
+                <wp:wrapNone/>
+                <wp:docPr id="526668272" name="Straight Connector 2"/>
+                <wp:cNvGraphicFramePr/>
+                <a:graphic xmlns:a="http://schemas.openxmlformats.org/drawingml/2006/main">
+                  <a:graphicData uri="http://schemas.microsoft.com/office/word/2010/wordprocessingShape">
+                    <wps:wsp>
+                      <wps:cNvCnPr/>
+                      <wps:spPr>
+                        <a:xfrm>
+                          <a:off x="0" y="0"/>
+                          <a:ext cx="6842770" cy="0"/>
+                        </a:xfrm>
+                        <a:prstGeom prst="line">
+                          <a:avLst/>
+                        </a:prstGeom>
+                      </wps:spPr>
+                      <wps:style>
+                        <a:lnRef idx="2">
+                          <a:schemeClr val="dk1"/>
+                        </a:lnRef>
+                        <a:fillRef idx="0">
+                          <a:schemeClr val="dk1"/>
+                        </a:fillRef>
+                        <a:effectRef idx="1">
+                          <a:schemeClr val="dk1"/>
+                        </a:effectRef>
+                        <a:fontRef idx="minor">
+                          <a:schemeClr val="tx1"/>
+                        </a:fontRef>
+                      </wps:style>
+                      <wps:bodyPr/>
+                    </wps:wsp>
+                  </a:graphicData>
+                </a:graphic>
+                <wp14:sizeRelH relativeFrom="margin">
+                  <wp14:pctWidth>0</wp14:pctWidth>
+                </wp14:sizeRelH>
+              </wp:anchor>
+            </w:drawing>
+          </mc:Choice>
+          <mc:Fallback>
+            <w:pict>
+              <v:line w14:anchorId="0A9CF923" id="Straight Connector 2" o:spid="_x0000_s1026" style="position:absolute;z-index:251660288;visibility:visible;mso-wrap-style:square;mso-width-percent:0;mso-wrap-distance-left:9pt;mso-wrap-distance-top:0;mso-wrap-distance-right:9pt;mso-wrap-distance-bottom:0;mso-position-horizontal:absolute;mso-position-horizontal-relative:text;mso-position-vertical:absolute;mso-position-vertical-relative:text;mso-width-percent:0;mso-width-relative:margin" from="1.2pt,14.05pt" to="540pt,14.05pt" o:gfxdata="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" strokecolor="black [3200]" strokeweight="1.5pt">
+                <v:stroke joinstyle="miter"/>
+              </v:line>
+            </w:pict>
+          </mc:Fallback>
+        </mc:AlternateContent>
+      </w:r>
+      <w:r>
+        <w:rPr>
+          <w:rFonts w:ascii="Arial" w:hAnsi="Arial" w:cs="Arial"/>
+          <w:b/>
+          <w:bCs/>
+          <w:color w:val="4C94D8" w:themeColor="text2" w:themeTint="80"/>
+        </w:rPr>
+        <w:t>Skills and Achi</w:t>
+      </w:r>
+      <w:r>
+        <w:rPr>
+          <w:rFonts w:ascii="Arial" w:hAnsi="Arial" w:cs="Arial"/>
+          <w:b/>
+          <w:bCs/>
+          <w:color w:val="4C94D8" w:themeColor="text2" w:themeTint="80"/>
+        </w:rPr>
+        <w:t>evements</w:t>
+      </w:r>
+      <w:r>
+        <w:rPr>
+          <w:rFonts w:ascii="Arial" w:hAnsi="Arial" w:cs="Arial"/>
+        </w:rPr>
+        <w:tab/>
+      </w:r>
+    </w:p>
+    <w:p>
+      <w:pPr>
+        <w:tabs>
+          <w:tab w:val="right" w:pos="9000"/>
+        </w:tabs>
+        <w:spacing w:after="0" w:line="240" w:lineRule="auto"/>
+        <w:rPr>
+          <w:rFonts w:ascii="Times New Roman" w:hAnsi="Times New Roman" w:cs="Times New Roman"/>
+          <w:b/>
+          <w:bCs/>
+          <w:sz w:val="2"/>
+          <w:szCs w:val="2"/>
+        </w:rPr>
+      </w:pPr>
+    </w:p>
+    <w:p>
+      <w:pPr>
+        <w:tabs>
+          <w:tab w:val="right" w:pos="9000"/>
+        </w:tabs>
+        <w:spacing w:after="0" w:line="240" w:lineRule="auto"/>
+        <w:rPr>
+          <w:rFonts w:ascii="Times New Roman" w:hAnsi="Times New Roman" w:cs="Times New Roman"/>
+          <w:sz w:val="22"/>
+          <w:szCs w:val="22"/>
+        </w:rPr>
+      </w:pPr>
+      <w:r>
+        <w:rPr>
+          <w:rFonts w:ascii="Times New Roman" w:hAnsi="Times New Roman" w:cs="Times New Roman"/>
+          <w:b/>
+          <w:bCs/>
+          <w:sz w:val="22"/>
+          <w:szCs w:val="22"/>
+        </w:rPr>
+        <w:t>Programming and Tools:</w:t>
+      </w:r>
+      <w:r>
+        <w:rPr>
+          <w:rFonts w:ascii="Times New Roman" w:hAnsi="Times New Roman" w:cs="Times New Roman"/>
+          <w:sz w:val="22"/>
+          <w:szCs w:val="22"/>
+        </w:rPr>
+        <w:t xml:space="preserve"> </w:t>
+      </w:r>
+      <w:r>
+        <w:rPr>
+          <w:rFonts w:ascii="Times New Roman" w:hAnsi="Times New Roman" w:cs="Times New Roman"/>
+          <w:sz w:val="22"/>
+          <w:szCs w:val="22"/>
+        </w:rPr>
+        <w:t>SolidWorks,</w:t>
+      </w:r>
+      <w:r>
+        <w:rPr>
+          <w:rFonts w:ascii="Times New Roman" w:hAnsi="Times New Roman" w:cs="Times New Roman"/>
+          <w:sz w:val="22"/>
+          <w:szCs w:val="22"/>
+        </w:rPr>
+        <w:t xml:space="preserve"> </w:t>
+      </w:r>
+      <w:r>
+        <w:rPr>
+          <w:rFonts w:ascii="Times New Roman" w:hAnsi="Times New Roman" w:cs="Times New Roman"/>
+          <w:sz w:val="22"/>
+          <w:szCs w:val="22"/>
+        </w:rPr>
+        <w:t>ANSYS</w:t>
+      </w:r>
+      <w:r>
+        <w:rPr>
+          <w:rFonts w:ascii="Times New Roman" w:hAnsi="Times New Roman" w:cs="Times New Roman"/>
+          <w:sz w:val="22"/>
+          <w:szCs w:val="22"/>
+        </w:rPr>
+        <w:t xml:space="preserve">, </w:t>
+      </w:r>
+      <w:r>
+        <w:rPr>
+          <w:rFonts w:ascii="Times New Roman" w:hAnsi="Times New Roman" w:cs="Times New Roman"/>
+          <w:sz w:val="22"/>
+          <w:szCs w:val="22"/>
+        </w:rPr>
+        <w:t xml:space="preserve">Python, </w:t>
+      </w:r>
+      <w:r>
+        <w:rPr>
+          <w:rFonts w:ascii="Times New Roman" w:hAnsi="Times New Roman" w:cs="Times New Roman"/>
+          <w:sz w:val="22"/>
+          <w:szCs w:val="22"/>
+        </w:rPr>
+        <w:t>SQL</w:t>
+      </w:r>
+    </w:p>
+    <w:p>
+      <w:pPr>
+        <w:tabs>
+          <w:tab w:val="right" w:pos="9000"/>
+        </w:tabs>
+        <w:spacing w:after="0" w:line="240" w:lineRule="auto"/>
+        <w:rPr>
+          <w:rFonts w:ascii="Times New Roman" w:hAnsi="Times New Roman" w:cs="Times New Roman"/>
+          <w:sz w:val="22"/>
+          <w:szCs w:val="22"/>
+        </w:rPr>
+      </w:pPr>
+      <w:r>
+        <w:rPr>
+          <w:rFonts w:ascii="Times New Roman" w:hAnsi="Times New Roman" w:cs="Times New Roman"/>
+          <w:b/>
+          <w:bCs/>
+          <w:sz w:val="22"/>
+          <w:szCs w:val="22"/>
+        </w:rPr>
+        <w:t>Technical Skills:</w:t>
+      </w:r>
+      <w:r>
+        <w:rPr>
+          <w:rFonts w:ascii="Times New Roman" w:hAnsi="Times New Roman" w:cs="Times New Roman"/>
+          <w:sz w:val="22"/>
+          <w:szCs w:val="22"/>
+        </w:rPr>
+        <w:t xml:space="preserve"> </w:t>
+      </w:r>
+      <w:r>
+        <w:rPr>
+          <w:rFonts w:ascii="Times New Roman" w:hAnsi="Times New Roman" w:cs="Times New Roman"/>
+          <w:sz w:val="22"/>
+          <w:szCs w:val="22"/>
+        </w:rPr>
+        <w:t xml:space="preserve">3D CAD, </w:t>
+      </w:r>
+      <w:r>
+        <w:rPr>
+          <w:rFonts w:ascii="Times New Roman" w:hAnsi="Times New Roman" w:cs="Times New Roman"/>
+          <w:sz w:val="22"/>
+          <w:szCs w:val="22"/>
+        </w:rPr>
+        <w:t>FEA</w:t>
+      </w:r>
+      <w:r>
+        <w:rPr>
+          <w:rFonts w:ascii="Times New Roman" w:hAnsi="Times New Roman" w:cs="Times New Roman"/>
+          <w:sz w:val="22"/>
+          <w:szCs w:val="22"/>
+        </w:rPr>
+        <w:t>, Tolerance Analysis</w:t>
+      </w:r>
+      <w:r>
+        <w:rPr>
+          <w:rFonts w:ascii="Times New Roman" w:hAnsi="Times New Roman" w:cs="Times New Roman"/>
+          <w:sz w:val="22"/>
+          <w:szCs w:val="22"/>
+        </w:rPr>
+        <w:t>, Engineering Drawings</w:t>
+      </w:r>
+      <w:r>
+        <w:rPr>
+          <w:rFonts w:ascii="Times New Roman" w:hAnsi="Times New Roman" w:cs="Times New Roman"/>
+          <w:sz w:val="22"/>
+          <w:szCs w:val="22"/>
+        </w:rPr>
+        <w:t>, Extract-Transform-Load (ETL)</w:t>
+      </w:r>
+    </w:p>
+    <w:p>
+      <w:pPr>
+        <w:spacing w:after="0" w:line="240" w:lineRule="auto"/>
+        <w:rPr>
+          <w:rFonts w:ascii="Times New Roman" w:hAnsi="Times New Roman" w:cs="Times New Roman"/>
+          <w:sz w:val="22"/>
+          <w:szCs w:val="22"/>
+        </w:rPr>
+      </w:pPr>
+      <w:r>
+        <w:rPr>
+          <w:rFonts w:ascii="Times New Roman" w:hAnsi="Times New Roman" w:cs="Times New Roman"/>
+          <w:b/>
+          <w:bCs/>
+          <w:sz w:val="22"/>
+          <w:szCs w:val="22"/>
+        </w:rPr>
+        <w:t>C</w:t>
+      </w:r>
+      <w:r>
+        <w:rPr>
+          <w:rFonts w:ascii="Times New Roman" w:hAnsi="Times New Roman" w:cs="Times New Roman"/>
+          <w:b/>
+          <w:bCs/>
+          <w:sz w:val="22"/>
+          <w:szCs w:val="22"/>
+        </w:rPr>
+        <w:t xml:space="preserve">ertified </w:t>
+      </w:r>
+      <w:r>
+        <w:rPr>
+          <w:rFonts w:ascii="Times New Roman" w:hAnsi="Times New Roman" w:cs="Times New Roman"/>
+          <w:b/>
+          <w:bCs/>
+          <w:sz w:val="22"/>
+          <w:szCs w:val="22"/>
+        </w:rPr>
+        <w:t xml:space="preserve">Engineer in Training </w:t>
+      </w:r>
+      <w:r>
+        <w:rPr>
+          <w:rFonts w:ascii="Times New Roman" w:hAnsi="Times New Roman" w:cs="Times New Roman"/>
+          <w:b/>
+          <w:bCs/>
+          <w:sz w:val="22"/>
+          <w:szCs w:val="22"/>
+        </w:rPr>
+        <w:t>(EIT)</w:t>
+      </w:r>
+      <w:r>
+        <w:rPr>
+          <w:rFonts w:ascii="Times New Roman" w:hAnsi="Times New Roman" w:cs="Times New Roman"/>
+          <w:sz w:val="22"/>
+          <w:szCs w:val="22"/>
+        </w:rPr>
+        <w:t xml:space="preserve"> - MA</w:t>
+      </w:r>
+      <w:r>
+        <w:rPr>
+          <w:rFonts w:ascii="Times New Roman" w:hAnsi="Times New Roman" w:cs="Times New Roman"/>
+          <w:sz w:val="22"/>
+          <w:szCs w:val="22"/>
+        </w:rPr>
+        <w:t xml:space="preserve"> State Licensing Board</w:t>
       </w:r>
     </w:p>
     <w:p>
@@ -125,19 +728,14 @@
         </w:tabs>
         <w:spacing w:after="0"/>
         <w:rPr>
-          <w:rFonts w:ascii="Times New Roman" w:hAnsi="Times New Roman" w:cs="Times New Roman"/>
-          <w:sz w:val="22"/>
-          <w:szCs w:val="22"/>
-        </w:rPr>
-      </w:pPr>
-      <w:r>
-        <w:rPr>
-          <w:rFonts w:ascii="Times New Roman" w:hAnsi="Times New Roman" w:cs="Times New Roman"/>
-          <w:sz w:val="22"/>
-          <w:szCs w:val="22"/>
-        </w:rPr>
-        <w:t>Mechanical Engineer with 12 months of manufacturing experience seeking a Mechanical Engineering role</w:t>
-      </w:r>
+          <w:rFonts w:ascii="Arial" w:hAnsi="Arial" w:cs="Arial"/>
+          <w:b/>
+          <w:bCs/>
+          <w:color w:val="4C94D8" w:themeColor="text2" w:themeTint="80"/>
+          <w:sz w:val="6"/>
+          <w:szCs w:val="6"/>
+        </w:rPr>
+      </w:pPr>
     </w:p>
     <w:p>
       <w:pPr>
@@ -146,20 +744,221 @@
         </w:tabs>
         <w:spacing w:after="0"/>
         <w:rPr>
-          <w:rFonts w:ascii="Times New Roman" w:hAnsi="Times New Roman" w:cs="Times New Roman"/>
-          <w:sz w:val="22"/>
-          <w:szCs w:val="22"/>
-        </w:rPr>
-      </w:pPr>
-      <w:r>
-        <w:rPr>
           <w:rFonts w:ascii="Arial" w:hAnsi="Arial" w:cs="Arial"/>
           <w:b/>
           <w:bCs/>
-          <w:sz w:val="26"/>
-          <w:szCs w:val="26"/>
-        </w:rPr>
-        <w:t>Education</w:t>
+          <w:color w:val="4C94D8" w:themeColor="text2" w:themeTint="80"/>
+        </w:rPr>
+      </w:pPr>
+      <w:r>
+        <w:rPr>
+          <w:rFonts w:ascii="Arial" w:hAnsi="Arial" w:cs="Arial"/>
+          <w:b/>
+          <w:bCs/>
+          <w:noProof/>
+          <w:color w:val="0E2841" w:themeColor="text2"/>
+        </w:rPr>
+        <mc:AlternateContent>
+          <mc:Choice Requires="wps">
+            <w:drawing>
+              <wp:anchor distT="0" distB="0" distL="114300" distR="114300" simplePos="0" relativeHeight="251662336" behindDoc="0" locked="0" layoutInCell="1" allowOverlap="1" wp14:anchorId="55222343" wp14:editId="20D34611">
+                <wp:simplePos x="0" y="0"/>
+                <wp:positionH relativeFrom="column">
+                  <wp:posOffset>6985</wp:posOffset>
+                </wp:positionH>
+                <wp:positionV relativeFrom="paragraph">
+                  <wp:posOffset>200025</wp:posOffset>
+                </wp:positionV>
+                <wp:extent cx="6842760" cy="0"/>
+                <wp:effectExtent l="0" t="12700" r="15240" b="12700"/>
+                <wp:wrapNone/>
+                <wp:docPr id="10385145" name="Straight Connector 2"/>
+                <wp:cNvGraphicFramePr/>
+                <a:graphic xmlns:a="http://schemas.openxmlformats.org/drawingml/2006/main">
+                  <a:graphicData uri="http://schemas.microsoft.com/office/word/2010/wordprocessingShape">
+                    <wps:wsp>
+                      <wps:cNvCnPr/>
+                      <wps:spPr>
+                        <a:xfrm>
+                          <a:off x="0" y="0"/>
+                          <a:ext cx="6842760" cy="0"/>
+                        </a:xfrm>
+                        <a:prstGeom prst="line">
+                          <a:avLst/>
+                        </a:prstGeom>
+                      </wps:spPr>
+                      <wps:style>
+                        <a:lnRef idx="2">
+                          <a:schemeClr val="dk1"/>
+                        </a:lnRef>
+                        <a:fillRef idx="0">
+                          <a:schemeClr val="dk1"/>
+                        </a:fillRef>
+                        <a:effectRef idx="1">
+                          <a:schemeClr val="dk1"/>
+                        </a:effectRef>
+                        <a:fontRef idx="minor">
+                          <a:schemeClr val="tx1"/>
+                        </a:fontRef>
+                      </wps:style>
+                      <wps:bodyPr/>
+                    </wps:wsp>
+                  </a:graphicData>
+                </a:graphic>
+                <wp14:sizeRelH relativeFrom="margin">
+                  <wp14:pctWidth>0</wp14:pctWidth>
+                </wp14:sizeRelH>
+              </wp:anchor>
+            </w:drawing>
+          </mc:Choice>
+          <mc:Fallback>
+            <w:pict>
+              <v:line w14:anchorId="33638CEB" id="Straight Connector 2" o:spid="_x0000_s1026" style="position:absolute;z-index:251662336;visibility:visible;mso-wrap-style:square;mso-width-percent:0;mso-wrap-distance-left:9pt;mso-wrap-distance-top:0;mso-wrap-distance-right:9pt;mso-wrap-distance-bottom:0;mso-position-horizontal:absolute;mso-position-horizontal-relative:text;mso-position-vertical:absolute;mso-position-vertical-relative:text;mso-width-percent:0;mso-width-relative:margin" from=".55pt,15.75pt" to="539.35pt,15.75pt" o:gfxdata="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" strokecolor="black [3200]" strokeweight="1.5pt">
+                <v:stroke joinstyle="miter"/>
+              </v:line>
+            </w:pict>
+          </mc:Fallback>
+        </mc:AlternateContent>
+      </w:r>
+      <w:r>
+        <w:rPr>
+          <w:rFonts w:ascii="Arial" w:hAnsi="Arial" w:cs="Arial"/>
+          <w:b/>
+          <w:bCs/>
+          <w:color w:val="4C94D8" w:themeColor="text2" w:themeTint="80"/>
+        </w:rPr>
+        <w:t>Professional</w:t>
+      </w:r>
+      <w:r>
+        <w:rPr>
+          <w:rFonts w:ascii="Arial" w:hAnsi="Arial" w:cs="Arial"/>
+          <w:b/>
+          <w:bCs/>
+          <w:color w:val="4C94D8" w:themeColor="text2" w:themeTint="80"/>
+        </w:rPr>
+        <w:t xml:space="preserve"> Experience</w:t>
+      </w:r>
+    </w:p>
+    <w:p>
+      <w:pPr>
+        <w:tabs>
+          <w:tab w:val="right" w:pos="10800"/>
+        </w:tabs>
+        <w:spacing w:after="0"/>
+        <w:rPr>
+          <w:rFonts w:ascii="Times New Roman" w:hAnsi="Times New Roman" w:cs="Times New Roman"/>
+          <w:b/>
+          <w:bCs/>
+          <w:sz w:val="2"/>
+          <w:szCs w:val="2"/>
+        </w:rPr>
+      </w:pPr>
+    </w:p>
+    <w:p>
+      <w:pPr>
+        <w:tabs>
+          <w:tab w:val="right" w:pos="10800"/>
+        </w:tabs>
+        <w:spacing w:after="0"/>
+        <w:rPr>
+          <w:rFonts w:ascii="Times New Roman" w:hAnsi="Times New Roman" w:cs="Times New Roman"/>
+          <w:sz w:val="22"/>
+          <w:szCs w:val="22"/>
+        </w:rPr>
+      </w:pPr>
+      <w:r>
+        <w:rPr>
+          <w:rFonts w:ascii="Times New Roman" w:hAnsi="Times New Roman" w:cs="Times New Roman"/>
+          <w:b/>
+          <w:bCs/>
+          <w:sz w:val="22"/>
+          <w:szCs w:val="22"/>
+        </w:rPr>
+        <w:t xml:space="preserve">Data Engineer Academy </w:t>
+      </w:r>
+      <w:r>
+        <w:rPr>
+          <w:rFonts w:ascii="Times New Roman" w:hAnsi="Times New Roman" w:cs="Times New Roman"/>
+          <w:b/>
+          <w:bCs/>
+          <w:sz w:val="22"/>
+          <w:szCs w:val="22"/>
+        </w:rPr>
+        <w:tab/>
+      </w:r>
+      <w:r>
+        <w:rPr>
+          <w:rFonts w:ascii="Times New Roman" w:hAnsi="Times New Roman" w:cs="Times New Roman"/>
+          <w:sz w:val="22"/>
+          <w:szCs w:val="22"/>
+        </w:rPr>
+        <w:t>Remote</w:t>
+      </w:r>
+    </w:p>
+    <w:p>
+      <w:pPr>
+        <w:tabs>
+          <w:tab w:val="right" w:pos="10800"/>
+        </w:tabs>
+        <w:spacing w:after="0"/>
+        <w:rPr>
+          <w:rFonts w:ascii="Times New Roman" w:hAnsi="Times New Roman" w:cs="Times New Roman"/>
+          <w:b/>
+          <w:bCs/>
+          <w:sz w:val="22"/>
+          <w:szCs w:val="22"/>
+        </w:rPr>
+      </w:pPr>
+      <w:r>
+        <w:rPr>
+          <w:rFonts w:ascii="Times New Roman" w:hAnsi="Times New Roman" w:cs="Times New Roman"/>
+          <w:sz w:val="22"/>
+          <w:szCs w:val="22"/>
+        </w:rPr>
+        <w:t xml:space="preserve">Analytics Engineer Apprentice </w:t>
+      </w:r>
+      <w:r>
+        <w:rPr>
+          <w:rFonts w:ascii="Times New Roman" w:hAnsi="Times New Roman" w:cs="Times New Roman"/>
+          <w:sz w:val="22"/>
+          <w:szCs w:val="22"/>
+        </w:rPr>
+        <w:tab/>
+        <w:t>June 2024 - Current</w:t>
+      </w:r>
+    </w:p>
+    <w:p>
+      <w:pPr>
+        <w:pStyle w:val="ListParagraph"/>
+        <w:numPr>
+          <w:ilvl w:val="0"/>
+          <w:numId w:val="45"/>
+        </w:numPr>
+        <w:tabs>
+          <w:tab w:val="right" w:pos="10800"/>
+        </w:tabs>
+        <w:spacing w:after="0"/>
+        <w:rPr>
+          <w:rFonts w:ascii="Times New Roman" w:hAnsi="Times New Roman" w:cs="Times New Roman"/>
+          <w:sz w:val="22"/>
+          <w:szCs w:val="22"/>
+        </w:rPr>
+      </w:pPr>
+      <w:r>
+        <w:rPr>
+          <w:rFonts w:ascii="Times New Roman" w:hAnsi="Times New Roman" w:cs="Times New Roman"/>
+          <w:sz w:val="22"/>
+          <w:szCs w:val="22"/>
+        </w:rPr>
+        <w:t xml:space="preserve">Built a batch ETL pipeline transforming raw CRM JSON lead data into stage-level funnel conversion metrics by setter and date, enabling bottleneck identification and performance accountability </w:t>
+      </w:r>
+      <w:r>
+        <w:rPr>
+          <w:rFonts w:ascii="Times New Roman" w:hAnsi="Times New Roman" w:cs="Times New Roman"/>
+          <w:sz w:val="22"/>
+          <w:szCs w:val="22"/>
+        </w:rPr>
+        <w:t>for sales team</w:t>
       </w:r>
     </w:p>
     <w:p>
@@ -182,15 +981,7 @@
           <w:sz w:val="22"/>
           <w:szCs w:val="22"/>
         </w:rPr>
-        <w:t>University of Massachusetts, Amherst</w:t>
-      </w:r>
-      <w:r>
-        <w:rPr>
-          <w:rFonts w:ascii="Times New Roman" w:hAnsi="Times New Roman" w:cs="Times New Roman"/>
-          <w:sz w:val="22"/>
-          <w:szCs w:val="22"/>
-        </w:rPr>
-        <w:tab/>
+        <w:t>Boston Metal</w:t>
       </w:r>
       <w:r>
         <w:rPr>
@@ -200,7 +991,15 @@
           <w:sz w:val="22"/>
           <w:szCs w:val="22"/>
         </w:rPr>
-        <w:t>May 2023</w:t>
+        <w:tab/>
+      </w:r>
+      <w:r>
+        <w:rPr>
+          <w:rFonts w:ascii="Times New Roman" w:hAnsi="Times New Roman" w:cs="Times New Roman"/>
+          <w:sz w:val="22"/>
+          <w:szCs w:val="22"/>
+        </w:rPr>
+        <w:t>Woburn, MA</w:t>
       </w:r>
     </w:p>
     <w:p>
@@ -225,7 +1024,7 @@
           <w:sz w:val="22"/>
           <w:szCs w:val="22"/>
         </w:rPr>
-        <w:t xml:space="preserve">Bachelor of Science in Mechanical Engineering </w:t>
+        <w:t>Production</w:t>
       </w:r>
       <w:r>
         <w:rPr>
@@ -235,7 +1034,7 @@
           <w:sz w:val="22"/>
           <w:szCs w:val="22"/>
         </w:rPr>
-        <w:tab/>
+        <w:t xml:space="preserve"> </w:t>
       </w:r>
       <w:r>
         <w:rPr>
@@ -245,376 +1044,7 @@
           <w:sz w:val="22"/>
           <w:szCs w:val="22"/>
         </w:rPr>
-        <w:t>3.54</w:t>
-      </w:r>
-    </w:p>
-    <w:p>
-      <w:pPr>
-        <w:tabs>
-          <w:tab w:val="right" w:pos="10800"/>
-        </w:tabs>
-        <w:spacing w:after="0" w:line="240" w:lineRule="auto"/>
-        <w:rPr>
-          <w:rFonts w:ascii="Times New Roman" w:hAnsi="Times New Roman" w:cs="Times New Roman"/>
-          <w:sz w:val="22"/>
-          <w:szCs w:val="22"/>
-        </w:rPr>
-      </w:pPr>
-      <w:r>
-        <w:rPr>
-          <w:rFonts w:ascii="Times New Roman" w:hAnsi="Times New Roman" w:cs="Times New Roman"/>
-          <w:sz w:val="22"/>
-          <w:szCs w:val="22"/>
-        </w:rPr>
-        <w:t>Relevant Coursework:</w:t>
-      </w:r>
-      <w:r>
-        <w:rPr>
-          <w:rFonts w:ascii="Times New Roman" w:hAnsi="Times New Roman" w:cs="Times New Roman"/>
-          <w:sz w:val="22"/>
-          <w:szCs w:val="22"/>
-        </w:rPr>
-        <w:t xml:space="preserve"> </w:t>
-      </w:r>
-      <w:r>
-        <w:rPr>
-          <w:rFonts w:ascii="Times New Roman" w:hAnsi="Times New Roman" w:cs="Times New Roman"/>
-          <w:sz w:val="22"/>
-          <w:szCs w:val="22"/>
-        </w:rPr>
-        <w:t xml:space="preserve">Numerical Methods (MATLAB), </w:t>
-      </w:r>
-      <w:r>
-        <w:rPr>
-          <w:rFonts w:ascii="Times New Roman" w:hAnsi="Times New Roman" w:cs="Times New Roman"/>
-          <w:sz w:val="22"/>
-          <w:szCs w:val="22"/>
-        </w:rPr>
-        <w:t xml:space="preserve">Data Structures and Algorithms (Python), Fundamentals of Electrical Engineering, </w:t>
-      </w:r>
-      <w:r>
-        <w:rPr>
-          <w:rFonts w:ascii="Times New Roman" w:hAnsi="Times New Roman" w:cs="Times New Roman"/>
-          <w:sz w:val="22"/>
-          <w:szCs w:val="22"/>
-        </w:rPr>
-        <w:t xml:space="preserve">Nanomaterials and Sensors, </w:t>
-      </w:r>
-      <w:r>
-        <w:rPr>
-          <w:rFonts w:ascii="Times New Roman" w:hAnsi="Times New Roman" w:cs="Times New Roman"/>
-          <w:sz w:val="22"/>
-          <w:szCs w:val="22"/>
-        </w:rPr>
-        <w:t xml:space="preserve">Advanced Manufacturing/Polymers, </w:t>
-      </w:r>
-      <w:r>
-        <w:rPr>
-          <w:rFonts w:ascii="Times New Roman" w:hAnsi="Times New Roman" w:cs="Times New Roman"/>
-          <w:sz w:val="22"/>
-          <w:szCs w:val="22"/>
-        </w:rPr>
-        <w:t>Human Factors, System Dynamics, Fluid Dynamics, Heat Transfer, Mechanics of Materials, Calculus III, Ordinary Differential Equations</w:t>
-      </w:r>
-    </w:p>
-    <w:p>
-      <w:pPr>
-        <w:tabs>
-          <w:tab w:val="right" w:pos="9000"/>
-        </w:tabs>
-        <w:spacing w:after="0"/>
-        <w:rPr>
-          <w:rFonts w:ascii="Arial" w:hAnsi="Arial" w:cs="Arial"/>
-          <w:sz w:val="26"/>
-          <w:szCs w:val="26"/>
-        </w:rPr>
-      </w:pPr>
-      <w:r>
-        <w:rPr>
-          <w:rFonts w:ascii="Arial" w:hAnsi="Arial" w:cs="Arial"/>
-          <w:b/>
-          <w:bCs/>
-          <w:sz w:val="26"/>
-          <w:szCs w:val="26"/>
-        </w:rPr>
-        <w:t>Certification</w:t>
-      </w:r>
-      <w:r>
-        <w:rPr>
-          <w:rFonts w:ascii="Arial" w:hAnsi="Arial" w:cs="Arial"/>
-          <w:sz w:val="26"/>
-          <w:szCs w:val="26"/>
-        </w:rPr>
-        <w:tab/>
-      </w:r>
-    </w:p>
-    <w:p>
-      <w:pPr>
-        <w:tabs>
-          <w:tab w:val="right" w:pos="10800"/>
-        </w:tabs>
-        <w:spacing w:after="0" w:line="240" w:lineRule="auto"/>
-        <w:rPr>
-          <w:rFonts w:ascii="Times New Roman" w:hAnsi="Times New Roman" w:cs="Times New Roman"/>
-          <w:sz w:val="10"/>
-          <w:szCs w:val="10"/>
-        </w:rPr>
-      </w:pPr>
-      <w:r>
-        <w:rPr>
-          <w:rFonts w:ascii="Times New Roman" w:hAnsi="Times New Roman" w:cs="Times New Roman"/>
-          <w:sz w:val="22"/>
-          <w:szCs w:val="22"/>
-        </w:rPr>
-        <w:t>Engineer in Training</w:t>
-      </w:r>
-      <w:r>
-        <w:rPr>
-          <w:rFonts w:ascii="Times New Roman" w:hAnsi="Times New Roman" w:cs="Times New Roman"/>
-          <w:sz w:val="22"/>
-          <w:szCs w:val="22"/>
-        </w:rPr>
-        <w:t xml:space="preserve"> / Fundamentals of Engineering (FE)</w:t>
-      </w:r>
-      <w:r>
-        <w:rPr>
-          <w:rFonts w:ascii="Times New Roman" w:hAnsi="Times New Roman" w:cs="Times New Roman"/>
-          <w:b/>
-          <w:bCs/>
-          <w:sz w:val="22"/>
-          <w:szCs w:val="22"/>
-        </w:rPr>
-        <w:t xml:space="preserve"> | </w:t>
-      </w:r>
-      <w:r>
-        <w:rPr>
-          <w:rFonts w:ascii="Times New Roman" w:hAnsi="Times New Roman" w:cs="Times New Roman"/>
-          <w:sz w:val="22"/>
-          <w:szCs w:val="22"/>
-        </w:rPr>
-        <w:t>EIT License #27667</w:t>
-      </w:r>
-      <w:r>
-        <w:rPr>
-          <w:rFonts w:ascii="Times New Roman" w:hAnsi="Times New Roman" w:cs="Times New Roman"/>
-          <w:sz w:val="22"/>
-          <w:szCs w:val="22"/>
-        </w:rPr>
-        <w:t xml:space="preserve"> </w:t>
-      </w:r>
-      <w:r>
-        <w:rPr>
-          <w:rFonts w:ascii="Times New Roman" w:hAnsi="Times New Roman" w:cs="Times New Roman"/>
-          <w:sz w:val="22"/>
-          <w:szCs w:val="22"/>
-        </w:rPr>
-        <w:tab/>
-        <w:t>Feb 2025</w:t>
-      </w:r>
-    </w:p>
-    <w:p>
-      <w:pPr>
-        <w:tabs>
-          <w:tab w:val="right" w:pos="10800"/>
-        </w:tabs>
-        <w:spacing w:after="0" w:line="240" w:lineRule="auto"/>
-        <w:rPr>
-          <w:rFonts w:ascii="Times New Roman" w:hAnsi="Times New Roman" w:cs="Times New Roman"/>
-          <w:sz w:val="10"/>
-          <w:szCs w:val="10"/>
-        </w:rPr>
-      </w:pPr>
-      <w:r>
-        <w:rPr>
-          <w:rFonts w:ascii="Arial" w:hAnsi="Arial" w:cs="Arial"/>
-          <w:b/>
-          <w:bCs/>
-          <w:sz w:val="26"/>
-          <w:szCs w:val="26"/>
-        </w:rPr>
-        <w:t>Skills</w:t>
-      </w:r>
-    </w:p>
-    <w:p>
-      <w:pPr>
-        <w:tabs>
-          <w:tab w:val="right" w:pos="9000"/>
-        </w:tabs>
-        <w:spacing w:after="0" w:line="240" w:lineRule="auto"/>
-        <w:rPr>
-          <w:rFonts w:ascii="Times New Roman" w:hAnsi="Times New Roman" w:cs="Times New Roman"/>
-          <w:sz w:val="22"/>
-          <w:szCs w:val="22"/>
-        </w:rPr>
-      </w:pPr>
-      <w:r>
-        <w:rPr>
-          <w:rFonts w:ascii="Times New Roman" w:hAnsi="Times New Roman" w:cs="Times New Roman"/>
-          <w:b/>
-          <w:bCs/>
-          <w:sz w:val="22"/>
-          <w:szCs w:val="22"/>
-        </w:rPr>
-        <w:t>3D CAD</w:t>
-      </w:r>
-      <w:r>
-        <w:rPr>
-          <w:rFonts w:ascii="Times New Roman" w:hAnsi="Times New Roman" w:cs="Times New Roman"/>
-          <w:sz w:val="22"/>
-          <w:szCs w:val="22"/>
-        </w:rPr>
-        <w:t xml:space="preserve"> (</w:t>
-      </w:r>
-      <w:r>
-        <w:rPr>
-          <w:rFonts w:ascii="Times New Roman" w:hAnsi="Times New Roman" w:cs="Times New Roman"/>
-          <w:sz w:val="22"/>
-          <w:szCs w:val="22"/>
-        </w:rPr>
-        <w:t xml:space="preserve">SolidWorks, </w:t>
-      </w:r>
-      <w:proofErr w:type="spellStart"/>
-      <w:r>
-        <w:rPr>
-          <w:rFonts w:ascii="Times New Roman" w:hAnsi="Times New Roman" w:cs="Times New Roman"/>
-          <w:sz w:val="22"/>
-          <w:szCs w:val="22"/>
-        </w:rPr>
-        <w:t>Onshape</w:t>
-      </w:r>
-      <w:proofErr w:type="spellEnd"/>
-      <w:r>
-        <w:rPr>
-          <w:rFonts w:ascii="Times New Roman" w:hAnsi="Times New Roman" w:cs="Times New Roman"/>
-          <w:sz w:val="22"/>
-          <w:szCs w:val="22"/>
-        </w:rPr>
-        <w:t xml:space="preserve">, ANSYS), </w:t>
-      </w:r>
-      <w:r>
-        <w:rPr>
-          <w:rFonts w:ascii="Times New Roman" w:hAnsi="Times New Roman" w:cs="Times New Roman"/>
-          <w:sz w:val="22"/>
-          <w:szCs w:val="22"/>
-        </w:rPr>
-        <w:t xml:space="preserve">MATLAB, </w:t>
-      </w:r>
-      <w:r>
-        <w:rPr>
-          <w:rFonts w:ascii="Times New Roman" w:hAnsi="Times New Roman" w:cs="Times New Roman"/>
-          <w:sz w:val="22"/>
-          <w:szCs w:val="22"/>
-        </w:rPr>
-        <w:t>LabVIEW, Python, SQL</w:t>
-      </w:r>
-    </w:p>
-    <w:p>
-      <w:pPr>
-        <w:tabs>
-          <w:tab w:val="right" w:pos="10800"/>
-        </w:tabs>
-        <w:spacing w:after="0"/>
-        <w:rPr>
-          <w:rFonts w:ascii="Arial" w:hAnsi="Arial" w:cs="Arial"/>
-          <w:b/>
-          <w:bCs/>
-          <w:sz w:val="26"/>
-          <w:szCs w:val="26"/>
-        </w:rPr>
-      </w:pPr>
-      <w:r>
-        <w:rPr>
-          <w:rFonts w:ascii="Arial" w:hAnsi="Arial" w:cs="Arial"/>
-          <w:b/>
-          <w:bCs/>
-          <w:sz w:val="26"/>
-          <w:szCs w:val="26"/>
-        </w:rPr>
-        <w:t>Work Experience</w:t>
-      </w:r>
-    </w:p>
-    <w:p>
-      <w:pPr>
-        <w:tabs>
-          <w:tab w:val="right" w:pos="10800"/>
-        </w:tabs>
-        <w:spacing w:after="0"/>
-        <w:rPr>
-          <w:rFonts w:ascii="Times New Roman" w:hAnsi="Times New Roman" w:cs="Times New Roman"/>
-          <w:sz w:val="22"/>
-          <w:szCs w:val="22"/>
-        </w:rPr>
-      </w:pPr>
-      <w:r>
-        <w:rPr>
-          <w:rFonts w:ascii="Times New Roman" w:hAnsi="Times New Roman" w:cs="Times New Roman"/>
-          <w:b/>
-          <w:bCs/>
-          <w:sz w:val="22"/>
-          <w:szCs w:val="22"/>
-        </w:rPr>
-        <w:t>Boston Metal</w:t>
-      </w:r>
-      <w:r>
-        <w:rPr>
-          <w:rFonts w:ascii="Times New Roman" w:hAnsi="Times New Roman" w:cs="Times New Roman"/>
-          <w:b/>
-          <w:bCs/>
-          <w:sz w:val="22"/>
-          <w:szCs w:val="22"/>
-        </w:rPr>
-        <w:t xml:space="preserve"> - </w:t>
-      </w:r>
-      <w:r>
-        <w:rPr>
-          <w:rFonts w:ascii="Times New Roman" w:hAnsi="Times New Roman" w:cs="Times New Roman"/>
-          <w:sz w:val="22"/>
-          <w:szCs w:val="22"/>
-        </w:rPr>
-        <w:t>Electrometallurgy startup pioneering green steel manufacturing</w:t>
-      </w:r>
-      <w:r>
-        <w:rPr>
-          <w:rFonts w:ascii="Times New Roman" w:hAnsi="Times New Roman" w:cs="Times New Roman"/>
-          <w:b/>
-          <w:bCs/>
-          <w:sz w:val="22"/>
-          <w:szCs w:val="22"/>
-        </w:rPr>
-        <w:tab/>
-      </w:r>
-      <w:r>
-        <w:rPr>
-          <w:rFonts w:ascii="Times New Roman" w:hAnsi="Times New Roman" w:cs="Times New Roman"/>
-          <w:sz w:val="22"/>
-          <w:szCs w:val="22"/>
-        </w:rPr>
-        <w:t>Woburn, MA</w:t>
-      </w:r>
-    </w:p>
-    <w:p>
-      <w:pPr>
-        <w:tabs>
-          <w:tab w:val="right" w:pos="10800"/>
-        </w:tabs>
-        <w:spacing w:after="0"/>
-        <w:rPr>
-          <w:rFonts w:ascii="Times New Roman" w:hAnsi="Times New Roman" w:cs="Times New Roman"/>
-          <w:b/>
-          <w:bCs/>
-          <w:sz w:val="22"/>
-          <w:szCs w:val="22"/>
-        </w:rPr>
-      </w:pPr>
-      <w:r>
-        <w:rPr>
-          <w:rFonts w:ascii="Times New Roman" w:hAnsi="Times New Roman" w:cs="Times New Roman"/>
-          <w:b/>
-          <w:bCs/>
-          <w:sz w:val="22"/>
-          <w:szCs w:val="22"/>
-        </w:rPr>
-        <w:t xml:space="preserve">Production Engineer </w:t>
+        <w:t xml:space="preserve">Engineer </w:t>
       </w:r>
       <w:r>
         <w:rPr>
@@ -672,55 +1102,71 @@
           <w:sz w:val="22"/>
           <w:szCs w:val="22"/>
         </w:rPr>
-        <w:t xml:space="preserve">Operated and monitored pilot-scale </w:t>
-      </w:r>
-      <w:r>
-        <w:rPr>
-          <w:rFonts w:ascii="Times New Roman" w:hAnsi="Times New Roman" w:cs="Times New Roman"/>
-          <w:sz w:val="22"/>
-          <w:szCs w:val="22"/>
-        </w:rPr>
-        <w:t>M</w:t>
-      </w:r>
-      <w:r>
-        <w:rPr>
-          <w:rFonts w:ascii="Times New Roman" w:hAnsi="Times New Roman" w:cs="Times New Roman"/>
-          <w:sz w:val="22"/>
-          <w:szCs w:val="22"/>
-        </w:rPr>
-        <w:t xml:space="preserve">olten </w:t>
-      </w:r>
-      <w:r>
-        <w:rPr>
-          <w:rFonts w:ascii="Times New Roman" w:hAnsi="Times New Roman" w:cs="Times New Roman"/>
-          <w:sz w:val="22"/>
-          <w:szCs w:val="22"/>
-        </w:rPr>
-        <w:t>O</w:t>
-      </w:r>
-      <w:r>
-        <w:rPr>
-          <w:rFonts w:ascii="Times New Roman" w:hAnsi="Times New Roman" w:cs="Times New Roman"/>
-          <w:sz w:val="22"/>
-          <w:szCs w:val="22"/>
-        </w:rPr>
-        <w:t xml:space="preserve">xide </w:t>
-      </w:r>
-      <w:r>
-        <w:rPr>
-          <w:rFonts w:ascii="Times New Roman" w:hAnsi="Times New Roman" w:cs="Times New Roman"/>
-          <w:sz w:val="22"/>
-          <w:szCs w:val="22"/>
-        </w:rPr>
-        <w:t>E</w:t>
-      </w:r>
-      <w:r>
-        <w:rPr>
-          <w:rFonts w:ascii="Times New Roman" w:hAnsi="Times New Roman" w:cs="Times New Roman"/>
-          <w:sz w:val="22"/>
-          <w:szCs w:val="22"/>
-        </w:rPr>
-        <w:t>lectrolysis (MOE) systems at ~1600 °C, executing startups, shutdowns, and run transitions to maintain stable high-temperature operations for clean iron production</w:t>
+        <w:t xml:space="preserve">Sustained reliable pilot-scale </w:t>
+      </w:r>
+      <w:r>
+        <w:rPr>
+          <w:rFonts w:ascii="Times New Roman" w:hAnsi="Times New Roman" w:cs="Times New Roman"/>
+          <w:sz w:val="22"/>
+          <w:szCs w:val="22"/>
+        </w:rPr>
+        <w:t>Molten Oxide Electrolysis (MOE)</w:t>
+      </w:r>
+      <w:r>
+        <w:rPr>
+          <w:rFonts w:ascii="Times New Roman" w:hAnsi="Times New Roman" w:cs="Times New Roman"/>
+          <w:sz w:val="22"/>
+          <w:szCs w:val="22"/>
+        </w:rPr>
+        <w:t xml:space="preserve"> cell operation </w:t>
+      </w:r>
+      <w:r>
+        <w:rPr>
+          <w:rFonts w:ascii="Times New Roman" w:hAnsi="Times New Roman" w:cs="Times New Roman"/>
+          <w:sz w:val="22"/>
+          <w:szCs w:val="22"/>
+        </w:rPr>
+        <w:t xml:space="preserve">at </w:t>
+      </w:r>
+      <w:r>
+        <w:rPr>
+          <w:rFonts w:ascii="Times New Roman" w:hAnsi="Times New Roman" w:cs="Times New Roman"/>
+          <w:sz w:val="22"/>
+          <w:szCs w:val="22"/>
+        </w:rPr>
+        <w:t>1600 °C</w:t>
+      </w:r>
+      <w:r>
+        <w:rPr>
+          <w:rFonts w:ascii="Times New Roman" w:hAnsi="Times New Roman" w:cs="Times New Roman"/>
+          <w:sz w:val="22"/>
+          <w:szCs w:val="22"/>
+        </w:rPr>
+        <w:t xml:space="preserve"> to support scale-up of a </w:t>
+      </w:r>
+      <w:r>
+        <w:rPr>
+          <w:rFonts w:ascii="Times New Roman" w:hAnsi="Times New Roman" w:cs="Times New Roman"/>
+          <w:sz w:val="22"/>
+          <w:szCs w:val="22"/>
+        </w:rPr>
+        <w:t xml:space="preserve">first-of-its-kind clean-iron production </w:t>
+      </w:r>
+      <w:r>
+        <w:rPr>
+          <w:rFonts w:ascii="Times New Roman" w:hAnsi="Times New Roman" w:cs="Times New Roman"/>
+          <w:sz w:val="22"/>
+          <w:szCs w:val="22"/>
+        </w:rPr>
+        <w:t>process</w:t>
+      </w:r>
+      <w:r>
+        <w:rPr>
+          <w:rFonts w:ascii="Times New Roman" w:hAnsi="Times New Roman" w:cs="Times New Roman"/>
+          <w:sz w:val="22"/>
+          <w:szCs w:val="22"/>
+        </w:rPr>
+        <w:t>.</w:t>
       </w:r>
     </w:p>
     <w:p>
@@ -746,7 +1192,15 @@
           <w:sz w:val="22"/>
           <w:szCs w:val="22"/>
         </w:rPr>
-        <w:t>Performed in-process monitoring, equipment adjustments, and mechanical troubleshooting to maintain product quality and minimize downtime during production runs</w:t>
+        <w:t>Performed XRF and LECO compositional analysis to quantify iron purity and electrolyte chemistry, using results to guide adjustments and maintain product quality during pilot-scale validation</w:t>
+      </w:r>
+      <w:r>
+        <w:rPr>
+          <w:rFonts w:ascii="Times New Roman" w:hAnsi="Times New Roman" w:cs="Times New Roman"/>
+          <w:sz w:val="22"/>
+          <w:szCs w:val="22"/>
+        </w:rPr>
+        <w:t>.</w:t>
       </w:r>
     </w:p>
     <w:p>
@@ -772,7 +1226,81 @@
           <w:sz w:val="22"/>
           <w:szCs w:val="22"/>
         </w:rPr>
-        <w:t>Collected and analyzed operational data while coordinating with operators and engineers to execute experimental campaigns that generated datasets used to improve process performance and reduce scale-up risk</w:t>
+        <w:t>Implemented condition-based monitoring (CBM) strategies—including electrical current signature analysis, voltage stability tracking, and thermal trend evaluation—to detect early performance degradation and proactively mitigate failure modes</w:t>
+      </w:r>
+      <w:r>
+        <w:rPr>
+          <w:rFonts w:ascii="Times New Roman" w:hAnsi="Times New Roman" w:cs="Times New Roman"/>
+          <w:sz w:val="22"/>
+          <w:szCs w:val="22"/>
+        </w:rPr>
+        <w:t>.</w:t>
+      </w:r>
+    </w:p>
+    <w:p>
+      <w:pPr>
+        <w:pStyle w:val="ListParagraph"/>
+        <w:numPr>
+          <w:ilvl w:val="0"/>
+          <w:numId w:val="41"/>
+        </w:numPr>
+        <w:tabs>
+          <w:tab w:val="right" w:pos="10800"/>
+        </w:tabs>
+        <w:spacing w:after="0" w:line="240" w:lineRule="auto"/>
+        <w:rPr>
+          <w:rFonts w:ascii="Times New Roman" w:hAnsi="Times New Roman" w:cs="Times New Roman"/>
+          <w:sz w:val="22"/>
+          <w:szCs w:val="22"/>
+        </w:rPr>
+      </w:pPr>
+      <w:r>
+        <w:rPr>
+          <w:rFonts w:ascii="Times New Roman" w:hAnsi="Times New Roman" w:cs="Times New Roman"/>
+          <w:sz w:val="22"/>
+          <w:szCs w:val="22"/>
+        </w:rPr>
+        <w:t xml:space="preserve">Executed lab-scale </w:t>
+      </w:r>
+      <w:r>
+        <w:rPr>
+          <w:rFonts w:ascii="Times New Roman" w:hAnsi="Times New Roman" w:cs="Times New Roman"/>
+          <w:sz w:val="22"/>
+          <w:szCs w:val="22"/>
+        </w:rPr>
+        <w:t>Design of Experiments (DOE)</w:t>
+      </w:r>
+      <w:r>
+        <w:rPr>
+          <w:rFonts w:ascii="Times New Roman" w:hAnsi="Times New Roman" w:cs="Times New Roman"/>
+          <w:sz w:val="22"/>
+          <w:szCs w:val="22"/>
+        </w:rPr>
+        <w:t xml:space="preserve">, </w:t>
+      </w:r>
+      <w:r>
+        <w:rPr>
+          <w:rFonts w:ascii="Times New Roman" w:hAnsi="Times New Roman" w:cs="Times New Roman"/>
+          <w:sz w:val="22"/>
+          <w:szCs w:val="22"/>
+        </w:rPr>
+        <w:t xml:space="preserve">generating data </w:t>
+      </w:r>
+      <w:r>
+        <w:rPr>
+          <w:rFonts w:ascii="Times New Roman" w:hAnsi="Times New Roman" w:cs="Times New Roman"/>
+          <w:sz w:val="22"/>
+          <w:szCs w:val="22"/>
+        </w:rPr>
+        <w:t>for anode material</w:t>
+      </w:r>
+      <w:r>
+        <w:rPr>
+          <w:rFonts w:ascii="Times New Roman" w:hAnsi="Times New Roman" w:cs="Times New Roman"/>
+          <w:sz w:val="22"/>
+          <w:szCs w:val="22"/>
+        </w:rPr>
+        <w:t xml:space="preserve"> development</w:t>
       </w:r>
     </w:p>
     <w:p>
@@ -783,65 +1311,72 @@
         <w:spacing w:after="0"/>
         <w:rPr>
           <w:rFonts w:ascii="Times New Roman" w:hAnsi="Times New Roman" w:cs="Times New Roman"/>
-          <w:sz w:val="22"/>
-          <w:szCs w:val="22"/>
-        </w:rPr>
-      </w:pPr>
-      <w:proofErr w:type="spellStart"/>
-      <w:r>
-        <w:rPr>
-          <w:rFonts w:ascii="Times New Roman" w:hAnsi="Times New Roman" w:cs="Times New Roman"/>
           <w:b/>
           <w:bCs/>
-          <w:sz w:val="22"/>
-          <w:szCs w:val="22"/>
-        </w:rPr>
-        <w:t>Lantheus</w:t>
-      </w:r>
-      <w:proofErr w:type="spellEnd"/>
-      <w:r>
-        <w:rPr>
-          <w:rFonts w:ascii="Times New Roman" w:hAnsi="Times New Roman" w:cs="Times New Roman"/>
-          <w:b/>
-          <w:bCs/>
-          <w:sz w:val="22"/>
-          <w:szCs w:val="22"/>
-        </w:rPr>
-        <w:t xml:space="preserve"> - </w:t>
-      </w:r>
-      <w:r>
-        <w:rPr>
-          <w:rFonts w:ascii="Times New Roman" w:hAnsi="Times New Roman" w:cs="Times New Roman"/>
-          <w:sz w:val="22"/>
-          <w:szCs w:val="22"/>
-        </w:rPr>
-        <w:t>Radiopharmaceutical Manufacturing Company</w:t>
-      </w:r>
-      <w:r>
-        <w:rPr>
-          <w:rFonts w:ascii="Times New Roman" w:hAnsi="Times New Roman" w:cs="Times New Roman"/>
-          <w:b/>
-          <w:bCs/>
-          <w:sz w:val="22"/>
-          <w:szCs w:val="22"/>
-        </w:rPr>
-        <w:tab/>
-      </w:r>
-      <w:r>
-        <w:rPr>
-          <w:rFonts w:ascii="Times New Roman" w:hAnsi="Times New Roman" w:cs="Times New Roman"/>
-          <w:sz w:val="22"/>
-          <w:szCs w:val="22"/>
-        </w:rPr>
-        <w:t>Billerica, MA</w:t>
-      </w:r>
+          <w:sz w:val="6"/>
+          <w:szCs w:val="6"/>
+        </w:rPr>
+      </w:pPr>
     </w:p>
     <w:p>
       <w:pPr>
         <w:tabs>
           <w:tab w:val="right" w:pos="10800"/>
         </w:tabs>
-        <w:spacing w:after="0"/>
+        <w:spacing w:after="0" w:line="240" w:lineRule="auto"/>
+        <w:rPr>
+          <w:rFonts w:ascii="Times New Roman" w:hAnsi="Times New Roman" w:cs="Times New Roman"/>
+          <w:sz w:val="22"/>
+          <w:szCs w:val="22"/>
+        </w:rPr>
+      </w:pPr>
+      <w:proofErr w:type="spellStart"/>
+      <w:r>
+        <w:rPr>
+          <w:rFonts w:ascii="Times New Roman" w:hAnsi="Times New Roman" w:cs="Times New Roman"/>
+          <w:b/>
+          <w:bCs/>
+          <w:sz w:val="22"/>
+          <w:szCs w:val="22"/>
+        </w:rPr>
+        <w:t>Lantheus</w:t>
+      </w:r>
+      <w:proofErr w:type="spellEnd"/>
+      <w:r>
+        <w:rPr>
+          <w:rFonts w:ascii="Times New Roman" w:hAnsi="Times New Roman" w:cs="Times New Roman"/>
+          <w:b/>
+          <w:bCs/>
+          <w:sz w:val="22"/>
+          <w:szCs w:val="22"/>
+        </w:rPr>
+        <w:t xml:space="preserve"> Medical Imaging</w:t>
+      </w:r>
+      <w:r>
+        <w:rPr>
+          <w:rFonts w:ascii="Times New Roman" w:hAnsi="Times New Roman" w:cs="Times New Roman"/>
+          <w:b/>
+          <w:bCs/>
+          <w:sz w:val="22"/>
+          <w:szCs w:val="22"/>
+        </w:rPr>
+        <w:tab/>
+      </w:r>
+      <w:r>
+        <w:rPr>
+          <w:rFonts w:ascii="Times New Roman" w:hAnsi="Times New Roman" w:cs="Times New Roman"/>
+          <w:sz w:val="22"/>
+          <w:szCs w:val="22"/>
+        </w:rPr>
+        <w:t>Billerica, MA</w:t>
+      </w:r>
+    </w:p>
+    <w:p>
+      <w:pPr>
+        <w:tabs>
+          <w:tab w:val="right" w:pos="10800"/>
+        </w:tabs>
+        <w:spacing w:after="0" w:line="240" w:lineRule="auto"/>
         <w:rPr>
           <w:rFonts w:ascii="Times New Roman" w:hAnsi="Times New Roman" w:cs="Times New Roman"/>
           <w:sz w:val="22"/>
@@ -890,115 +1425,49 @@
         <w:spacing w:after="0" w:line="240" w:lineRule="auto"/>
         <w:rPr>
           <w:rFonts w:ascii="Times New Roman" w:hAnsi="Times New Roman" w:cs="Times New Roman"/>
-          <w:b/>
-          <w:bCs/>
-          <w:sz w:val="22"/>
-          <w:szCs w:val="22"/>
-        </w:rPr>
-      </w:pPr>
-      <w:r>
-        <w:rPr>
-          <w:rFonts w:ascii="Times New Roman" w:hAnsi="Times New Roman" w:cs="Times New Roman"/>
-          <w:sz w:val="22"/>
-          <w:szCs w:val="22"/>
-        </w:rPr>
-        <w:t>Implemented</w:t>
-      </w:r>
-      <w:r>
-        <w:rPr>
-          <w:rFonts w:ascii="Times New Roman" w:hAnsi="Times New Roman" w:cs="Times New Roman"/>
-          <w:sz w:val="22"/>
-          <w:szCs w:val="22"/>
-        </w:rPr>
-        <w:t xml:space="preserve"> a Form-Fit-Function </w:t>
-      </w:r>
-      <w:r>
-        <w:rPr>
-          <w:rFonts w:ascii="Times New Roman" w:hAnsi="Times New Roman" w:cs="Times New Roman"/>
-          <w:sz w:val="22"/>
-          <w:szCs w:val="22"/>
-        </w:rPr>
-        <w:t xml:space="preserve">(FFF) </w:t>
-      </w:r>
-      <w:r>
-        <w:rPr>
-          <w:rFonts w:ascii="Times New Roman" w:hAnsi="Times New Roman" w:cs="Times New Roman"/>
-          <w:sz w:val="22"/>
-          <w:szCs w:val="22"/>
-        </w:rPr>
-        <w:t>a</w:t>
-      </w:r>
-      <w:r>
-        <w:rPr>
-          <w:rFonts w:ascii="Times New Roman" w:hAnsi="Times New Roman" w:cs="Times New Roman"/>
-          <w:sz w:val="22"/>
-          <w:szCs w:val="22"/>
-        </w:rPr>
-        <w:t xml:space="preserve">nalysis </w:t>
-      </w:r>
-      <w:r>
-        <w:rPr>
-          <w:rFonts w:ascii="Times New Roman" w:hAnsi="Times New Roman" w:cs="Times New Roman"/>
-          <w:sz w:val="22"/>
-          <w:szCs w:val="22"/>
-        </w:rPr>
-        <w:t>f</w:t>
-      </w:r>
-      <w:r>
-        <w:rPr>
-          <w:rFonts w:ascii="Times New Roman" w:hAnsi="Times New Roman" w:cs="Times New Roman"/>
-          <w:sz w:val="22"/>
-          <w:szCs w:val="22"/>
-        </w:rPr>
-        <w:t xml:space="preserve">orm to evaluate </w:t>
-      </w:r>
-      <w:r>
-        <w:rPr>
-          <w:rFonts w:ascii="Times New Roman" w:hAnsi="Times New Roman" w:cs="Times New Roman"/>
-          <w:sz w:val="22"/>
-          <w:szCs w:val="22"/>
-        </w:rPr>
-        <w:t xml:space="preserve">functional equivalence between new and existing parts </w:t>
-      </w:r>
-      <w:r>
-        <w:rPr>
-          <w:rFonts w:ascii="Times New Roman" w:hAnsi="Times New Roman" w:cs="Times New Roman"/>
-          <w:sz w:val="22"/>
-          <w:szCs w:val="22"/>
-        </w:rPr>
-        <w:t xml:space="preserve">95% faster than </w:t>
-      </w:r>
-      <w:r>
-        <w:rPr>
-          <w:rFonts w:ascii="Times New Roman" w:hAnsi="Times New Roman" w:cs="Times New Roman"/>
-          <w:sz w:val="22"/>
-          <w:szCs w:val="22"/>
-        </w:rPr>
-        <w:t xml:space="preserve">a </w:t>
-      </w:r>
-      <w:r>
-        <w:rPr>
-          <w:rFonts w:ascii="Times New Roman" w:hAnsi="Times New Roman" w:cs="Times New Roman"/>
-          <w:sz w:val="22"/>
-          <w:szCs w:val="22"/>
-        </w:rPr>
-        <w:t>traditional Change Contro</w:t>
-      </w:r>
-      <w:r>
-        <w:rPr>
-          <w:rFonts w:ascii="Times New Roman" w:hAnsi="Times New Roman" w:cs="Times New Roman"/>
-          <w:sz w:val="22"/>
-          <w:szCs w:val="22"/>
-        </w:rPr>
-        <w:t xml:space="preserve">l, cutting assessment time from </w:t>
-      </w:r>
-      <w:r>
-        <w:rPr>
-          <w:rFonts w:ascii="Times New Roman" w:hAnsi="Times New Roman" w:cs="Times New Roman"/>
-          <w:sz w:val="22"/>
-          <w:szCs w:val="22"/>
-        </w:rPr>
-        <w:t>1 week to 1 day</w:t>
+          <w:sz w:val="22"/>
+          <w:szCs w:val="22"/>
+        </w:rPr>
+      </w:pPr>
+      <w:r>
+        <w:rPr>
+          <w:rFonts w:ascii="Times New Roman" w:hAnsi="Times New Roman" w:cs="Times New Roman"/>
+          <w:sz w:val="22"/>
+          <w:szCs w:val="22"/>
+        </w:rPr>
+        <w:t xml:space="preserve">Designed an innovative fixture </w:t>
+      </w:r>
+      <w:r>
+        <w:rPr>
+          <w:rFonts w:ascii="Times New Roman" w:hAnsi="Times New Roman" w:cs="Times New Roman"/>
+          <w:sz w:val="22"/>
+          <w:szCs w:val="22"/>
+        </w:rPr>
+        <w:t>using</w:t>
+      </w:r>
+      <w:r>
+        <w:rPr>
+          <w:rFonts w:ascii="Times New Roman" w:hAnsi="Times New Roman" w:cs="Times New Roman"/>
+          <w:sz w:val="22"/>
+          <w:szCs w:val="22"/>
+        </w:rPr>
+        <w:t xml:space="preserve"> SolidWorks</w:t>
+      </w:r>
+      <w:r>
+        <w:rPr>
+          <w:rFonts w:ascii="Times New Roman" w:hAnsi="Times New Roman" w:cs="Times New Roman"/>
+          <w:sz w:val="22"/>
+          <w:szCs w:val="22"/>
+        </w:rPr>
+        <w:t xml:space="preserve"> to resolve an employee safety risk on manufacturing floor</w:t>
+      </w:r>
+      <w:r>
+        <w:rPr>
+          <w:rFonts w:ascii="Times New Roman" w:hAnsi="Times New Roman" w:cs="Times New Roman"/>
+          <w:sz w:val="22"/>
+          <w:szCs w:val="22"/>
+        </w:rPr>
+        <w:t>.</w:t>
       </w:r>
     </w:p>
     <w:p>
@@ -1014,17 +1483,35 @@
         <w:spacing w:after="0" w:line="240" w:lineRule="auto"/>
         <w:rPr>
           <w:rFonts w:ascii="Times New Roman" w:hAnsi="Times New Roman" w:cs="Times New Roman"/>
-          <w:sz w:val="22"/>
-          <w:szCs w:val="22"/>
-        </w:rPr>
-      </w:pPr>
-      <w:r>
-        <w:rPr>
-          <w:rFonts w:ascii="Times New Roman" w:hAnsi="Times New Roman" w:cs="Times New Roman"/>
-          <w:sz w:val="22"/>
-          <w:szCs w:val="22"/>
-        </w:rPr>
-        <w:t>Created a central knowledge repository</w:t>
+          <w:b/>
+          <w:bCs/>
+          <w:sz w:val="22"/>
+          <w:szCs w:val="22"/>
+        </w:rPr>
+      </w:pPr>
+      <w:r>
+        <w:rPr>
+          <w:rFonts w:ascii="Times New Roman" w:hAnsi="Times New Roman" w:cs="Times New Roman"/>
+          <w:sz w:val="22"/>
+          <w:szCs w:val="22"/>
+        </w:rPr>
+        <w:t>Designed and i</w:t>
+      </w:r>
+      <w:r>
+        <w:rPr>
+          <w:rFonts w:ascii="Times New Roman" w:hAnsi="Times New Roman" w:cs="Times New Roman"/>
+          <w:sz w:val="22"/>
+          <w:szCs w:val="22"/>
+        </w:rPr>
+        <w:t>mplemented</w:t>
+      </w:r>
+      <w:r>
+        <w:rPr>
+          <w:rFonts w:ascii="Times New Roman" w:hAnsi="Times New Roman" w:cs="Times New Roman"/>
+          <w:sz w:val="22"/>
+          <w:szCs w:val="22"/>
+        </w:rPr>
+        <w:t xml:space="preserve"> a Form-Fit-Function</w:t>
       </w:r>
       <w:r>
         <w:rPr>
@@ -1040,23 +1527,119 @@
           <w:sz w:val="22"/>
           <w:szCs w:val="22"/>
         </w:rPr>
-        <w:t xml:space="preserve">that reduced lookup time by </w:t>
-      </w:r>
-      <w:r>
-        <w:rPr>
-          <w:rFonts w:ascii="Times New Roman" w:hAnsi="Times New Roman" w:cs="Times New Roman"/>
-          <w:sz w:val="22"/>
-          <w:szCs w:val="22"/>
-        </w:rPr>
-        <w:t>90%</w:t>
-      </w:r>
-      <w:r>
-        <w:rPr>
-          <w:rFonts w:ascii="Times New Roman" w:hAnsi="Times New Roman" w:cs="Times New Roman"/>
-          <w:sz w:val="22"/>
-          <w:szCs w:val="22"/>
-        </w:rPr>
-        <w:t xml:space="preserve"> by replacing a file-based system</w:t>
+        <w:t>a</w:t>
+      </w:r>
+      <w:r>
+        <w:rPr>
+          <w:rFonts w:ascii="Times New Roman" w:hAnsi="Times New Roman" w:cs="Times New Roman"/>
+          <w:sz w:val="22"/>
+          <w:szCs w:val="22"/>
+        </w:rPr>
+        <w:t xml:space="preserve">nalysis </w:t>
+      </w:r>
+      <w:r>
+        <w:rPr>
+          <w:rFonts w:ascii="Times New Roman" w:hAnsi="Times New Roman" w:cs="Times New Roman"/>
+          <w:sz w:val="22"/>
+          <w:szCs w:val="22"/>
+        </w:rPr>
+        <w:t>f</w:t>
+      </w:r>
+      <w:r>
+        <w:rPr>
+          <w:rFonts w:ascii="Times New Roman" w:hAnsi="Times New Roman" w:cs="Times New Roman"/>
+          <w:sz w:val="22"/>
+          <w:szCs w:val="22"/>
+        </w:rPr>
+        <w:t xml:space="preserve">orm to </w:t>
+      </w:r>
+      <w:r>
+        <w:rPr>
+          <w:rFonts w:ascii="Times New Roman" w:hAnsi="Times New Roman" w:cs="Times New Roman"/>
+          <w:sz w:val="22"/>
+          <w:szCs w:val="22"/>
+        </w:rPr>
+        <w:t>increase efficiency of</w:t>
+      </w:r>
+      <w:r>
+        <w:rPr>
+          <w:rFonts w:ascii="Times New Roman" w:hAnsi="Times New Roman" w:cs="Times New Roman"/>
+          <w:sz w:val="22"/>
+          <w:szCs w:val="22"/>
+        </w:rPr>
+        <w:t xml:space="preserve"> </w:t>
+      </w:r>
+      <w:r>
+        <w:rPr>
+          <w:rFonts w:ascii="Times New Roman" w:hAnsi="Times New Roman" w:cs="Times New Roman"/>
+          <w:sz w:val="22"/>
+          <w:szCs w:val="22"/>
+        </w:rPr>
+        <w:t>functionally equivalent</w:t>
+      </w:r>
+      <w:r>
+        <w:rPr>
+          <w:rFonts w:ascii="Times New Roman" w:hAnsi="Times New Roman" w:cs="Times New Roman"/>
+          <w:sz w:val="22"/>
+          <w:szCs w:val="22"/>
+        </w:rPr>
+        <w:t xml:space="preserve"> part replacements by </w:t>
+      </w:r>
+      <w:r>
+        <w:rPr>
+          <w:rFonts w:ascii="Times New Roman" w:hAnsi="Times New Roman" w:cs="Times New Roman"/>
+          <w:sz w:val="22"/>
+          <w:szCs w:val="22"/>
+        </w:rPr>
+        <w:t xml:space="preserve">95% </w:t>
+      </w:r>
+      <w:r>
+        <w:rPr>
+          <w:rFonts w:ascii="Times New Roman" w:hAnsi="Times New Roman" w:cs="Times New Roman"/>
+          <w:sz w:val="22"/>
+          <w:szCs w:val="22"/>
+        </w:rPr>
+        <w:t xml:space="preserve">- </w:t>
+      </w:r>
+      <w:r>
+        <w:rPr>
+          <w:rFonts w:ascii="Times New Roman" w:hAnsi="Times New Roman" w:cs="Times New Roman"/>
+          <w:sz w:val="22"/>
+          <w:szCs w:val="22"/>
+        </w:rPr>
+        <w:t xml:space="preserve">cutting </w:t>
+      </w:r>
+      <w:r>
+        <w:rPr>
+          <w:rFonts w:ascii="Times New Roman" w:hAnsi="Times New Roman" w:cs="Times New Roman"/>
+          <w:sz w:val="22"/>
+          <w:szCs w:val="22"/>
+        </w:rPr>
+        <w:t xml:space="preserve">Change Control </w:t>
+      </w:r>
+      <w:r>
+        <w:rPr>
+          <w:rFonts w:ascii="Times New Roman" w:hAnsi="Times New Roman" w:cs="Times New Roman"/>
+          <w:sz w:val="22"/>
+          <w:szCs w:val="22"/>
+        </w:rPr>
+        <w:t xml:space="preserve">time from </w:t>
+      </w:r>
+      <w:r>
+        <w:rPr>
+          <w:rFonts w:ascii="Times New Roman" w:hAnsi="Times New Roman" w:cs="Times New Roman"/>
+          <w:sz w:val="22"/>
+          <w:szCs w:val="22"/>
+        </w:rPr>
+        <w:t>1 week to 1 day</w:t>
+      </w:r>
+      <w:r>
+        <w:rPr>
+          <w:rFonts w:ascii="Times New Roman" w:hAnsi="Times New Roman" w:cs="Times New Roman"/>
+          <w:sz w:val="22"/>
+          <w:szCs w:val="22"/>
+        </w:rPr>
+        <w:t>.</w:t>
       </w:r>
     </w:p>
     <w:p>
@@ -1082,23 +1665,15 @@
           <w:sz w:val="22"/>
           <w:szCs w:val="22"/>
         </w:rPr>
-        <w:t xml:space="preserve">Designed </w:t>
-      </w:r>
-      <w:r>
-        <w:rPr>
-          <w:rFonts w:ascii="Times New Roman" w:hAnsi="Times New Roman" w:cs="Times New Roman"/>
-          <w:sz w:val="22"/>
-          <w:szCs w:val="22"/>
-        </w:rPr>
-        <w:t xml:space="preserve">an </w:t>
-      </w:r>
-      <w:r>
-        <w:rPr>
-          <w:rFonts w:ascii="Times New Roman" w:hAnsi="Times New Roman" w:cs="Times New Roman"/>
-          <w:sz w:val="22"/>
-          <w:szCs w:val="22"/>
-        </w:rPr>
-        <w:t>innovative fixture in SolidWorks</w:t>
+        <w:t xml:space="preserve">Redesigned a </w:t>
+      </w:r>
+      <w:r>
+        <w:rPr>
+          <w:rFonts w:ascii="Times New Roman" w:hAnsi="Times New Roman" w:cs="Times New Roman"/>
+          <w:sz w:val="22"/>
+          <w:szCs w:val="22"/>
+        </w:rPr>
+        <w:t>documentation</w:t>
       </w:r>
       <w:r>
         <w:rPr>
@@ -1114,23 +1689,97 @@
           <w:sz w:val="22"/>
           <w:szCs w:val="22"/>
         </w:rPr>
-        <w:t>to resolve a</w:t>
-      </w:r>
-      <w:r>
-        <w:rPr>
-          <w:rFonts w:ascii="Times New Roman" w:hAnsi="Times New Roman" w:cs="Times New Roman"/>
-          <w:sz w:val="22"/>
-          <w:szCs w:val="22"/>
-        </w:rPr>
-        <w:t>n</w:t>
-      </w:r>
-      <w:r>
-        <w:rPr>
-          <w:rFonts w:ascii="Times New Roman" w:hAnsi="Times New Roman" w:cs="Times New Roman"/>
-          <w:sz w:val="22"/>
-          <w:szCs w:val="22"/>
-        </w:rPr>
-        <w:t xml:space="preserve"> employee safety risk on manufacturing floor</w:t>
+        <w:t xml:space="preserve">management system </w:t>
+      </w:r>
+      <w:r>
+        <w:rPr>
+          <w:rFonts w:ascii="Times New Roman" w:hAnsi="Times New Roman" w:cs="Times New Roman"/>
+          <w:sz w:val="22"/>
+          <w:szCs w:val="22"/>
+        </w:rPr>
+        <w:t>reduc</w:t>
+      </w:r>
+      <w:r>
+        <w:rPr>
+          <w:rFonts w:ascii="Times New Roman" w:hAnsi="Times New Roman" w:cs="Times New Roman"/>
+          <w:sz w:val="22"/>
+          <w:szCs w:val="22"/>
+        </w:rPr>
+        <w:t>ing</w:t>
+      </w:r>
+      <w:r>
+        <w:rPr>
+          <w:rFonts w:ascii="Times New Roman" w:hAnsi="Times New Roman" w:cs="Times New Roman"/>
+          <w:sz w:val="22"/>
+          <w:szCs w:val="22"/>
+        </w:rPr>
+        <w:t xml:space="preserve"> </w:t>
+      </w:r>
+      <w:r>
+        <w:rPr>
+          <w:rFonts w:ascii="Times New Roman" w:hAnsi="Times New Roman" w:cs="Times New Roman"/>
+          <w:sz w:val="22"/>
+          <w:szCs w:val="22"/>
+        </w:rPr>
+        <w:t xml:space="preserve">file </w:t>
+      </w:r>
+      <w:r>
+        <w:rPr>
+          <w:rFonts w:ascii="Times New Roman" w:hAnsi="Times New Roman" w:cs="Times New Roman"/>
+          <w:sz w:val="22"/>
+          <w:szCs w:val="22"/>
+        </w:rPr>
+        <w:t>search</w:t>
+      </w:r>
+      <w:r>
+        <w:rPr>
+          <w:rFonts w:ascii="Times New Roman" w:hAnsi="Times New Roman" w:cs="Times New Roman"/>
+          <w:sz w:val="22"/>
+          <w:szCs w:val="22"/>
+        </w:rPr>
+        <w:t xml:space="preserve"> time by 90%</w:t>
+      </w:r>
+      <w:r>
+        <w:rPr>
+          <w:rFonts w:ascii="Times New Roman" w:hAnsi="Times New Roman" w:cs="Times New Roman"/>
+          <w:sz w:val="22"/>
+          <w:szCs w:val="22"/>
+        </w:rPr>
+        <w:t>.</w:t>
+      </w:r>
+    </w:p>
+    <w:p>
+      <w:pPr>
+        <w:pStyle w:val="ListParagraph"/>
+        <w:numPr>
+          <w:ilvl w:val="0"/>
+          <w:numId w:val="38"/>
+        </w:numPr>
+        <w:tabs>
+          <w:tab w:val="right" w:pos="10800"/>
+        </w:tabs>
+        <w:spacing w:after="0" w:line="240" w:lineRule="auto"/>
+        <w:rPr>
+          <w:rFonts w:ascii="Times New Roman" w:hAnsi="Times New Roman" w:cs="Times New Roman"/>
+          <w:sz w:val="22"/>
+          <w:szCs w:val="22"/>
+        </w:rPr>
+      </w:pPr>
+      <w:r>
+        <w:rPr>
+          <w:rFonts w:ascii="Times New Roman" w:hAnsi="Times New Roman" w:cs="Times New Roman"/>
+          <w:sz w:val="22"/>
+          <w:szCs w:val="22"/>
+        </w:rPr>
+        <w:t>Developed technical specifications for an Uninterruptable Power Supply (UPS)</w:t>
+      </w:r>
+      <w:r>
+        <w:rPr>
+          <w:rFonts w:ascii="Times New Roman" w:hAnsi="Times New Roman" w:cs="Times New Roman"/>
+          <w:sz w:val="22"/>
+          <w:szCs w:val="22"/>
+        </w:rPr>
+        <w:t xml:space="preserve"> to backup critical equipment.</w:t>
       </w:r>
     </w:p>
     <w:p>
@@ -1141,79 +1790,86 @@
         <w:spacing w:after="0"/>
         <w:rPr>
           <w:rFonts w:ascii="Times New Roman" w:hAnsi="Times New Roman" w:cs="Times New Roman"/>
-          <w:sz w:val="22"/>
-          <w:szCs w:val="22"/>
-        </w:rPr>
-      </w:pPr>
-      <w:r>
-        <w:rPr>
-          <w:rFonts w:ascii="Times New Roman" w:hAnsi="Times New Roman" w:cs="Times New Roman"/>
           <w:b/>
           <w:bCs/>
-          <w:sz w:val="22"/>
-          <w:szCs w:val="22"/>
-        </w:rPr>
-        <w:t>Mauser</w:t>
-      </w:r>
-      <w:r>
-        <w:rPr>
-          <w:rFonts w:ascii="Times New Roman" w:hAnsi="Times New Roman" w:cs="Times New Roman"/>
-          <w:b/>
-          <w:bCs/>
-          <w:sz w:val="22"/>
-          <w:szCs w:val="22"/>
-        </w:rPr>
-        <w:t xml:space="preserve"> - </w:t>
-      </w:r>
-      <w:r>
-        <w:rPr>
-          <w:rFonts w:ascii="Times New Roman" w:hAnsi="Times New Roman" w:cs="Times New Roman"/>
-          <w:sz w:val="22"/>
-          <w:szCs w:val="22"/>
-        </w:rPr>
-        <w:t>Global Packaging Company</w:t>
-      </w:r>
-      <w:r>
-        <w:rPr>
-          <w:rFonts w:ascii="Times New Roman" w:hAnsi="Times New Roman" w:cs="Times New Roman"/>
-          <w:b/>
-          <w:bCs/>
-          <w:sz w:val="22"/>
-          <w:szCs w:val="22"/>
-        </w:rPr>
-        <w:tab/>
-      </w:r>
-      <w:r>
-        <w:rPr>
-          <w:rFonts w:ascii="Times New Roman" w:hAnsi="Times New Roman" w:cs="Times New Roman"/>
-          <w:sz w:val="22"/>
-          <w:szCs w:val="22"/>
-        </w:rPr>
-        <w:t>Chicago</w:t>
-      </w:r>
-      <w:r>
-        <w:rPr>
-          <w:rFonts w:ascii="Times New Roman" w:hAnsi="Times New Roman" w:cs="Times New Roman"/>
-          <w:sz w:val="22"/>
-          <w:szCs w:val="22"/>
-        </w:rPr>
-        <w:t xml:space="preserve">, </w:t>
-      </w:r>
-      <w:r>
-        <w:rPr>
-          <w:rFonts w:ascii="Times New Roman" w:hAnsi="Times New Roman" w:cs="Times New Roman"/>
-          <w:sz w:val="22"/>
-          <w:szCs w:val="22"/>
-        </w:rPr>
-        <w:t>IL</w:t>
-      </w:r>
+          <w:sz w:val="6"/>
+          <w:szCs w:val="6"/>
+        </w:rPr>
+      </w:pPr>
     </w:p>
     <w:p>
       <w:pPr>
         <w:tabs>
           <w:tab w:val="right" w:pos="10800"/>
         </w:tabs>
-        <w:spacing w:after="0"/>
+        <w:spacing w:after="0" w:line="240" w:lineRule="auto"/>
+        <w:rPr>
+          <w:rFonts w:ascii="Times New Roman" w:hAnsi="Times New Roman" w:cs="Times New Roman"/>
+          <w:sz w:val="22"/>
+          <w:szCs w:val="22"/>
+        </w:rPr>
+      </w:pPr>
+      <w:r>
+        <w:rPr>
+          <w:rFonts w:ascii="Times New Roman" w:hAnsi="Times New Roman" w:cs="Times New Roman"/>
+          <w:b/>
+          <w:bCs/>
+          <w:sz w:val="22"/>
+          <w:szCs w:val="22"/>
+        </w:rPr>
+        <w:t>Mauser</w:t>
+      </w:r>
+      <w:r>
+        <w:rPr>
+          <w:rFonts w:ascii="Times New Roman" w:hAnsi="Times New Roman" w:cs="Times New Roman"/>
+          <w:b/>
+          <w:bCs/>
+          <w:sz w:val="22"/>
+          <w:szCs w:val="22"/>
+        </w:rPr>
+        <w:t xml:space="preserve"> Packaging Solutions</w:t>
+      </w:r>
+      <w:r>
+        <w:rPr>
+          <w:rFonts w:ascii="Times New Roman" w:hAnsi="Times New Roman" w:cs="Times New Roman"/>
+          <w:b/>
+          <w:bCs/>
+          <w:sz w:val="22"/>
+          <w:szCs w:val="22"/>
+        </w:rPr>
+        <w:tab/>
+      </w:r>
+      <w:r>
+        <w:rPr>
+          <w:rFonts w:ascii="Times New Roman" w:hAnsi="Times New Roman" w:cs="Times New Roman"/>
+          <w:sz w:val="22"/>
+          <w:szCs w:val="22"/>
+        </w:rPr>
+        <w:t>Chicago</w:t>
+      </w:r>
+      <w:r>
+        <w:rPr>
+          <w:rFonts w:ascii="Times New Roman" w:hAnsi="Times New Roman" w:cs="Times New Roman"/>
+          <w:sz w:val="22"/>
+          <w:szCs w:val="22"/>
+        </w:rPr>
+        <w:t xml:space="preserve">, </w:t>
+      </w:r>
+      <w:r>
+        <w:rPr>
+          <w:rFonts w:ascii="Times New Roman" w:hAnsi="Times New Roman" w:cs="Times New Roman"/>
+          <w:sz w:val="22"/>
+          <w:szCs w:val="22"/>
+        </w:rPr>
+        <w:t>IL</w:t>
+      </w:r>
+    </w:p>
+    <w:p>
+      <w:pPr>
+        <w:tabs>
+          <w:tab w:val="right" w:pos="10800"/>
+        </w:tabs>
+        <w:spacing w:after="0" w:line="240" w:lineRule="auto"/>
         <w:rPr>
           <w:rFonts w:ascii="Times New Roman" w:hAnsi="Times New Roman" w:cs="Times New Roman"/>
           <w:sz w:val="22"/>
@@ -1288,7 +1944,326 @@
           <w:sz w:val="22"/>
           <w:szCs w:val="22"/>
         </w:rPr>
-        <w:t>Standardized SPC limits across multiple plants by auditing process controls against engineering drawing tolerances and collaborating with design and plant engineers to align quality controls with design intent</w:t>
+        <w:t>Reconciled</w:t>
+      </w:r>
+      <w:r>
+        <w:rPr>
+          <w:rFonts w:ascii="Times New Roman" w:hAnsi="Times New Roman" w:cs="Times New Roman"/>
+          <w:sz w:val="22"/>
+          <w:szCs w:val="22"/>
+        </w:rPr>
+        <w:t xml:space="preserve"> </w:t>
+      </w:r>
+      <w:r>
+        <w:rPr>
+          <w:rFonts w:ascii="Times New Roman" w:hAnsi="Times New Roman" w:cs="Times New Roman"/>
+          <w:sz w:val="22"/>
+          <w:szCs w:val="22"/>
+        </w:rPr>
+        <w:t>SPC control</w:t>
+      </w:r>
+      <w:r>
+        <w:rPr>
+          <w:rFonts w:ascii="Times New Roman" w:hAnsi="Times New Roman" w:cs="Times New Roman"/>
+          <w:sz w:val="22"/>
+          <w:szCs w:val="22"/>
+        </w:rPr>
+        <w:t xml:space="preserve"> limits </w:t>
+      </w:r>
+      <w:r>
+        <w:rPr>
+          <w:rFonts w:ascii="Times New Roman" w:hAnsi="Times New Roman" w:cs="Times New Roman"/>
+          <w:sz w:val="22"/>
+          <w:szCs w:val="22"/>
+        </w:rPr>
+        <w:t xml:space="preserve">with </w:t>
+      </w:r>
+      <w:r>
+        <w:rPr>
+          <w:rFonts w:ascii="Times New Roman" w:hAnsi="Times New Roman" w:cs="Times New Roman"/>
+          <w:sz w:val="22"/>
+          <w:szCs w:val="22"/>
+        </w:rPr>
+        <w:t>engineering drawing</w:t>
+      </w:r>
+      <w:r>
+        <w:rPr>
+          <w:rFonts w:ascii="Times New Roman" w:hAnsi="Times New Roman" w:cs="Times New Roman"/>
+          <w:sz w:val="22"/>
+          <w:szCs w:val="22"/>
+        </w:rPr>
+        <w:t xml:space="preserve"> tolerances, ensure statistical process monitoring accurately reflected engineering design requirements</w:t>
+      </w:r>
+    </w:p>
+    <w:p>
+      <w:pPr>
+        <w:tabs>
+          <w:tab w:val="right" w:pos="10800"/>
+        </w:tabs>
+        <w:spacing w:after="0"/>
+        <w:rPr>
+          <w:rFonts w:ascii="Times New Roman" w:hAnsi="Times New Roman" w:cs="Times New Roman"/>
+          <w:b/>
+          <w:bCs/>
+          <w:sz w:val="6"/>
+          <w:szCs w:val="6"/>
+        </w:rPr>
+      </w:pPr>
+    </w:p>
+    <w:p>
+      <w:pPr>
+        <w:tabs>
+          <w:tab w:val="right" w:pos="10800"/>
+        </w:tabs>
+        <w:spacing w:after="0" w:line="240" w:lineRule="auto"/>
+        <w:rPr>
+          <w:rFonts w:ascii="Times New Roman" w:hAnsi="Times New Roman" w:cs="Times New Roman"/>
+          <w:sz w:val="22"/>
+          <w:szCs w:val="22"/>
+        </w:rPr>
+      </w:pPr>
+      <w:r>
+        <w:rPr>
+          <w:rFonts w:ascii="Times New Roman" w:hAnsi="Times New Roman" w:cs="Times New Roman"/>
+          <w:b/>
+          <w:bCs/>
+          <w:sz w:val="22"/>
+          <w:szCs w:val="22"/>
+        </w:rPr>
+        <w:t xml:space="preserve">GPC </w:t>
+      </w:r>
+      <w:r>
+        <w:rPr>
+          <w:rFonts w:ascii="Times New Roman" w:hAnsi="Times New Roman" w:cs="Times New Roman"/>
+          <w:b/>
+          <w:bCs/>
+          <w:sz w:val="22"/>
+          <w:szCs w:val="22"/>
+        </w:rPr>
+        <w:t>Lab</w:t>
+      </w:r>
+      <w:r>
+        <w:rPr>
+          <w:rFonts w:ascii="Times New Roman" w:hAnsi="Times New Roman" w:cs="Times New Roman"/>
+          <w:b/>
+          <w:bCs/>
+          <w:sz w:val="22"/>
+          <w:szCs w:val="22"/>
+        </w:rPr>
+        <w:tab/>
+      </w:r>
+      <w:r>
+        <w:rPr>
+          <w:rFonts w:ascii="Times New Roman" w:hAnsi="Times New Roman" w:cs="Times New Roman"/>
+          <w:sz w:val="22"/>
+          <w:szCs w:val="22"/>
+        </w:rPr>
+        <w:t>Amherst, MA</w:t>
+      </w:r>
+    </w:p>
+    <w:p>
+      <w:pPr>
+        <w:tabs>
+          <w:tab w:val="right" w:pos="10800"/>
+        </w:tabs>
+        <w:spacing w:after="0" w:line="240" w:lineRule="auto"/>
+        <w:rPr>
+          <w:rFonts w:ascii="Times New Roman" w:hAnsi="Times New Roman" w:cs="Times New Roman"/>
+          <w:sz w:val="22"/>
+          <w:szCs w:val="22"/>
+        </w:rPr>
+      </w:pPr>
+      <w:r>
+        <w:rPr>
+          <w:rFonts w:ascii="Times New Roman" w:hAnsi="Times New Roman" w:cs="Times New Roman"/>
+          <w:b/>
+          <w:bCs/>
+          <w:sz w:val="22"/>
+          <w:szCs w:val="22"/>
+        </w:rPr>
+        <w:t>Assistant Director</w:t>
+      </w:r>
+      <w:r>
+        <w:rPr>
+          <w:rFonts w:ascii="Times New Roman" w:hAnsi="Times New Roman" w:cs="Times New Roman"/>
+          <w:b/>
+          <w:bCs/>
+          <w:sz w:val="22"/>
+          <w:szCs w:val="22"/>
+        </w:rPr>
+        <w:tab/>
+      </w:r>
+      <w:r>
+        <w:rPr>
+          <w:rFonts w:ascii="Times New Roman" w:hAnsi="Times New Roman" w:cs="Times New Roman"/>
+          <w:sz w:val="22"/>
+          <w:szCs w:val="22"/>
+        </w:rPr>
+        <w:t>Sep</w:t>
+      </w:r>
+      <w:r>
+        <w:rPr>
+          <w:rFonts w:ascii="Times New Roman" w:hAnsi="Times New Roman" w:cs="Times New Roman"/>
+          <w:sz w:val="22"/>
+          <w:szCs w:val="22"/>
+        </w:rPr>
+        <w:t xml:space="preserve"> </w:t>
+      </w:r>
+      <w:r>
+        <w:rPr>
+          <w:rFonts w:ascii="Times New Roman" w:hAnsi="Times New Roman" w:cs="Times New Roman"/>
+          <w:sz w:val="22"/>
+          <w:szCs w:val="22"/>
+        </w:rPr>
+        <w:t xml:space="preserve">2019 </w:t>
+      </w:r>
+      <w:r>
+        <w:rPr>
+          <w:rFonts w:ascii="Times New Roman" w:hAnsi="Times New Roman" w:cs="Times New Roman"/>
+          <w:sz w:val="22"/>
+          <w:szCs w:val="22"/>
+        </w:rPr>
+        <w:t xml:space="preserve">- </w:t>
+      </w:r>
+      <w:r>
+        <w:rPr>
+          <w:rFonts w:ascii="Times New Roman" w:hAnsi="Times New Roman" w:cs="Times New Roman"/>
+          <w:sz w:val="22"/>
+          <w:szCs w:val="22"/>
+        </w:rPr>
+        <w:t>Mar 2020</w:t>
+      </w:r>
+    </w:p>
+    <w:p>
+      <w:pPr>
+        <w:pStyle w:val="ListParagraph"/>
+        <w:numPr>
+          <w:ilvl w:val="0"/>
+          <w:numId w:val="44"/>
+        </w:numPr>
+        <w:tabs>
+          <w:tab w:val="right" w:pos="10800"/>
+        </w:tabs>
+        <w:spacing w:after="0"/>
+        <w:rPr>
+          <w:rFonts w:ascii="Times New Roman" w:hAnsi="Times New Roman" w:cs="Times New Roman"/>
+          <w:sz w:val="22"/>
+          <w:szCs w:val="22"/>
+        </w:rPr>
+      </w:pPr>
+      <w:r>
+        <w:rPr>
+          <w:rFonts w:ascii="Times New Roman" w:hAnsi="Times New Roman" w:cs="Times New Roman"/>
+          <w:sz w:val="22"/>
+          <w:szCs w:val="22"/>
+        </w:rPr>
+        <w:t>Designed and implemented</w:t>
+      </w:r>
+      <w:r>
+        <w:rPr>
+          <w:rFonts w:ascii="Times New Roman" w:hAnsi="Times New Roman" w:cs="Times New Roman"/>
+          <w:sz w:val="22"/>
+          <w:szCs w:val="22"/>
+        </w:rPr>
+        <w:t xml:space="preserve"> </w:t>
+      </w:r>
+      <w:r>
+        <w:rPr>
+          <w:rFonts w:ascii="Times New Roman" w:hAnsi="Times New Roman" w:cs="Times New Roman"/>
+          <w:sz w:val="22"/>
+          <w:szCs w:val="22"/>
+        </w:rPr>
+        <w:t>comprehensive technical documentation</w:t>
+      </w:r>
+      <w:r>
+        <w:rPr>
+          <w:rFonts w:ascii="Times New Roman" w:hAnsi="Times New Roman" w:cs="Times New Roman"/>
+          <w:sz w:val="22"/>
+          <w:szCs w:val="22"/>
+        </w:rPr>
+        <w:t xml:space="preserve"> for </w:t>
+      </w:r>
+      <w:r>
+        <w:rPr>
+          <w:rFonts w:ascii="Times New Roman" w:hAnsi="Times New Roman" w:cs="Times New Roman"/>
+          <w:sz w:val="22"/>
+          <w:szCs w:val="22"/>
+        </w:rPr>
+        <w:t>G</w:t>
+      </w:r>
+      <w:r>
+        <w:rPr>
+          <w:rFonts w:ascii="Times New Roman" w:hAnsi="Times New Roman" w:cs="Times New Roman"/>
+          <w:sz w:val="22"/>
+          <w:szCs w:val="22"/>
+        </w:rPr>
+        <w:t>el Permeation Chromatography (G</w:t>
+      </w:r>
+      <w:r>
+        <w:rPr>
+          <w:rFonts w:ascii="Times New Roman" w:hAnsi="Times New Roman" w:cs="Times New Roman"/>
+          <w:sz w:val="22"/>
+          <w:szCs w:val="22"/>
+        </w:rPr>
+        <w:t>PC</w:t>
+      </w:r>
+      <w:r>
+        <w:rPr>
+          <w:rFonts w:ascii="Times New Roman" w:hAnsi="Times New Roman" w:cs="Times New Roman"/>
+          <w:sz w:val="22"/>
+          <w:szCs w:val="22"/>
+        </w:rPr>
+        <w:t>)</w:t>
+      </w:r>
+      <w:r>
+        <w:rPr>
+          <w:rFonts w:ascii="Times New Roman" w:hAnsi="Times New Roman" w:cs="Times New Roman"/>
+          <w:sz w:val="22"/>
+          <w:szCs w:val="22"/>
+        </w:rPr>
+        <w:t xml:space="preserve"> </w:t>
+      </w:r>
+    </w:p>
+    <w:p>
+      <w:pPr>
+        <w:pStyle w:val="ListParagraph"/>
+        <w:numPr>
+          <w:ilvl w:val="0"/>
+          <w:numId w:val="44"/>
+        </w:numPr>
+        <w:tabs>
+          <w:tab w:val="right" w:pos="10800"/>
+        </w:tabs>
+        <w:spacing w:after="0"/>
+        <w:rPr>
+          <w:rFonts w:ascii="Times New Roman" w:hAnsi="Times New Roman" w:cs="Times New Roman"/>
+          <w:sz w:val="22"/>
+          <w:szCs w:val="22"/>
+        </w:rPr>
+      </w:pPr>
+      <w:r>
+        <w:rPr>
+          <w:rFonts w:ascii="Times New Roman" w:hAnsi="Times New Roman" w:cs="Times New Roman"/>
+          <w:sz w:val="22"/>
+          <w:szCs w:val="22"/>
+        </w:rPr>
+        <w:t xml:space="preserve">Trained new laboratory personnel on </w:t>
+      </w:r>
+      <w:r>
+        <w:rPr>
+          <w:rFonts w:ascii="Times New Roman" w:hAnsi="Times New Roman" w:cs="Times New Roman"/>
+          <w:sz w:val="22"/>
+          <w:szCs w:val="22"/>
+        </w:rPr>
+        <w:t xml:space="preserve">sample preparation, </w:t>
+      </w:r>
+      <w:r>
+        <w:rPr>
+          <w:rFonts w:ascii="Times New Roman" w:hAnsi="Times New Roman" w:cs="Times New Roman"/>
+          <w:sz w:val="22"/>
+          <w:szCs w:val="22"/>
+        </w:rPr>
+        <w:t xml:space="preserve">instrument operation, calibration and data interpretation </w:t>
       </w:r>
     </w:p>
     <w:p>
@@ -1299,8 +2274,7 @@
         <w:spacing w:after="0"/>
         <w:rPr>
           <w:rFonts w:ascii="Times New Roman" w:hAnsi="Times New Roman" w:cs="Times New Roman"/>
-          <w:sz w:val="26"/>
-          <w:szCs w:val="26"/>
+          <w:color w:val="4C94D8" w:themeColor="text2" w:themeTint="80"/>
         </w:rPr>
       </w:pPr>
       <w:r>
@@ -1308,11 +2282,110 @@
           <w:rFonts w:ascii="Arial" w:hAnsi="Arial" w:cs="Arial"/>
           <w:b/>
           <w:bCs/>
-          <w:sz w:val="26"/>
-          <w:szCs w:val="26"/>
+          <w:color w:val="4C94D8" w:themeColor="text2" w:themeTint="80"/>
         </w:rPr>
         <w:t>Projects</w:t>
       </w:r>
+    </w:p>
+    <w:p>
+      <w:pPr>
+        <w:tabs>
+          <w:tab w:val="right" w:pos="10800"/>
+        </w:tabs>
+        <w:spacing w:after="0"/>
+        <w:rPr>
+          <w:rFonts w:ascii="Times New Roman" w:hAnsi="Times New Roman" w:cs="Times New Roman"/>
+          <w:b/>
+          <w:bCs/>
+          <w:sz w:val="6"/>
+          <w:szCs w:val="6"/>
+        </w:rPr>
+      </w:pPr>
+      <w:r>
+        <w:rPr>
+          <w:rFonts w:ascii="Arial" w:hAnsi="Arial" w:cs="Arial"/>
+          <w:b/>
+          <w:bCs/>
+          <w:noProof/>
+          <w:color w:val="0E2841" w:themeColor="text2"/>
+        </w:rPr>
+        <mc:AlternateContent>
+          <mc:Choice Requires="wps">
+            <w:drawing>
+              <wp:anchor distT="0" distB="0" distL="114300" distR="114300" simplePos="0" relativeHeight="251664384" behindDoc="0" locked="0" layoutInCell="1" allowOverlap="1" wp14:anchorId="1896703C" wp14:editId="04915179">
+                <wp:simplePos x="0" y="0"/>
+                <wp:positionH relativeFrom="column">
+                  <wp:posOffset>0</wp:posOffset>
+                </wp:positionH>
+                <wp:positionV relativeFrom="paragraph">
+                  <wp:posOffset>12065</wp:posOffset>
+                </wp:positionV>
+                <wp:extent cx="6842760" cy="0"/>
+                <wp:effectExtent l="0" t="12700" r="15240" b="12700"/>
+                <wp:wrapNone/>
+                <wp:docPr id="694178175" name="Straight Connector 2"/>
+                <wp:cNvGraphicFramePr/>
+                <a:graphic xmlns:a="http://schemas.openxmlformats.org/drawingml/2006/main">
+                  <a:graphicData uri="http://schemas.microsoft.com/office/word/2010/wordprocessingShape">
+                    <wps:wsp>
+                      <wps:cNvCnPr/>
+                      <wps:spPr>
+                        <a:xfrm>
+                          <a:off x="0" y="0"/>
+                          <a:ext cx="6842760" cy="0"/>
+                        </a:xfrm>
+                        <a:prstGeom prst="line">
+                          <a:avLst/>
+                        </a:prstGeom>
+                      </wps:spPr>
+                      <wps:style>
+                        <a:lnRef idx="2">
+                          <a:schemeClr val="dk1"/>
+                        </a:lnRef>
+                        <a:fillRef idx="0">
+                          <a:schemeClr val="dk1"/>
+                        </a:fillRef>
+                        <a:effectRef idx="1">
+                          <a:schemeClr val="dk1"/>
+                        </a:effectRef>
+                        <a:fontRef idx="minor">
+                          <a:schemeClr val="tx1"/>
+                        </a:fontRef>
+                      </wps:style>
+                      <wps:bodyPr/>
+                    </wps:wsp>
+                  </a:graphicData>
+                </a:graphic>
+                <wp14:sizeRelH relativeFrom="margin">
+                  <wp14:pctWidth>0</wp14:pctWidth>
+                </wp14:sizeRelH>
+              </wp:anchor>
+            </w:drawing>
+          </mc:Choice>
+          <mc:Fallback>
+            <w:pict>
+              <v:line w14:anchorId="0962A6A2" id="Straight Connector 2" o:spid="_x0000_s1026" style="position:absolute;z-index:251664384;visibility:visible;mso-wrap-style:square;mso-width-percent:0;mso-wrap-distance-left:9pt;mso-wrap-distance-top:0;mso-wrap-distance-right:9pt;mso-wrap-distance-bottom:0;mso-position-horizontal:absolute;mso-position-horizontal-relative:text;mso-position-vertical:absolute;mso-position-vertical-relative:text;mso-width-percent:0;mso-width-relative:margin" from="0,.95pt" to="538.8pt,.95pt" o:gfxdata="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" strokecolor="black [3200]" strokeweight="1.5pt">
+                <v:stroke joinstyle="miter"/>
+              </v:line>
+            </w:pict>
+          </mc:Fallback>
+        </mc:AlternateContent>
+      </w:r>
+    </w:p>
+    <w:p>
+      <w:pPr>
+        <w:tabs>
+          <w:tab w:val="right" w:pos="10800"/>
+        </w:tabs>
+        <w:spacing w:after="0"/>
+        <w:rPr>
+          <w:rFonts w:ascii="Times New Roman" w:hAnsi="Times New Roman" w:cs="Times New Roman"/>
+          <w:b/>
+          <w:bCs/>
+          <w:sz w:val="2"/>
+          <w:szCs w:val="2"/>
+        </w:rPr>
+      </w:pPr>
     </w:p>
     <w:p>
       <w:pPr>
@@ -1467,84 +2540,6 @@
         </w:rPr>
         <w:t xml:space="preserve"> iterating geometry to balance strength, weight, and manufacturability constraints; delivered the longest beam meeting all criteria and won the engineering design competition.</w:t>
       </w:r>
-    </w:p>
-    <w:p>
-      <w:pPr>
-        <w:tabs>
-          <w:tab w:val="right" w:pos="10800"/>
-        </w:tabs>
-        <w:spacing w:after="0" w:line="240" w:lineRule="auto"/>
-        <w:rPr>
-          <w:rFonts w:ascii="Times New Roman" w:hAnsi="Times New Roman" w:cs="Times New Roman"/>
-          <w:sz w:val="22"/>
-          <w:szCs w:val="22"/>
-        </w:rPr>
-      </w:pPr>
-      <w:r>
-        <w:rPr>
-          <w:rFonts w:ascii="Arial" w:hAnsi="Arial" w:cs="Arial"/>
-          <w:b/>
-          <w:bCs/>
-          <w:sz w:val="26"/>
-          <w:szCs w:val="26"/>
-        </w:rPr>
-        <w:t>Interests and Hobbies</w:t>
-      </w:r>
-    </w:p>
-    <w:p>
-      <w:pPr>
-        <w:tabs>
-          <w:tab w:val="right" w:pos="10800"/>
-        </w:tabs>
-        <w:spacing w:after="0" w:line="240" w:lineRule="auto"/>
-        <w:rPr>
-          <w:rFonts w:ascii="Times New Roman" w:hAnsi="Times New Roman" w:cs="Times New Roman"/>
-          <w:sz w:val="22"/>
-          <w:szCs w:val="22"/>
-        </w:rPr>
-      </w:pPr>
-      <w:r>
-        <w:rPr>
-          <w:rFonts w:ascii="Times New Roman" w:hAnsi="Times New Roman" w:cs="Times New Roman"/>
-          <w:sz w:val="22"/>
-          <w:szCs w:val="22"/>
-        </w:rPr>
-        <w:t>Skiing, Soccer,</w:t>
-      </w:r>
-      <w:r>
-        <w:rPr>
-          <w:rFonts w:ascii="Times New Roman" w:hAnsi="Times New Roman" w:cs="Times New Roman"/>
-          <w:sz w:val="22"/>
-          <w:szCs w:val="22"/>
-        </w:rPr>
-        <w:t xml:space="preserve"> Pickleball,</w:t>
-      </w:r>
-      <w:r>
-        <w:rPr>
-          <w:rFonts w:ascii="Times New Roman" w:hAnsi="Times New Roman" w:cs="Times New Roman"/>
-          <w:sz w:val="22"/>
-          <w:szCs w:val="22"/>
-        </w:rPr>
-        <w:t xml:space="preserve"> Chess, Bollywood</w:t>
-      </w:r>
-      <w:r>
-        <w:rPr>
-          <w:rFonts w:ascii="Times New Roman" w:hAnsi="Times New Roman" w:cs="Times New Roman"/>
-          <w:sz w:val="22"/>
-          <w:szCs w:val="22"/>
-        </w:rPr>
-        <w:t>/</w:t>
-      </w:r>
-      <w:proofErr w:type="spellStart"/>
-      <w:r>
-        <w:rPr>
-          <w:rFonts w:ascii="Times New Roman" w:hAnsi="Times New Roman" w:cs="Times New Roman"/>
-          <w:sz w:val="22"/>
-          <w:szCs w:val="22"/>
-        </w:rPr>
-        <w:t>Hiphop</w:t>
-      </w:r>
-      <w:proofErr w:type="spellEnd"/>
     </w:p>
     <w:p>
       <w:pPr>
@@ -3888,6 +4883,119 @@
     </w:lvl>
   </w:abstractNum>
   <w:abstractNum w:abstractNumId="21" w15:restartNumberingAfterBreak="0">
+    <w:nsid w:val="359C6068"/>
+    <w:multiLevelType w:val="hybridMultilevel"/>
+    <w:tmpl w:val="5C5464CC"/>
+    <w:lvl w:ilvl="0" w:tplc="04090001">
+      <w:start w:val="1"/>
+      <w:numFmt w:val="bullet"/>
+      <w:lvlText w:val=""/>
+      <w:lvlJc w:val="left"/>
+      <w:pPr>
+        <w:ind w:left="720" w:hanging="360"/>
+      </w:pPr>
+      <w:rPr>
+        <w:rFonts w:ascii="Symbol" w:hAnsi="Symbol" w:hint="default"/>
+      </w:rPr>
+    </w:lvl>
+    <w:lvl w:ilvl="1" w:tplc="04090003" w:tentative="1">
+      <w:start w:val="1"/>
+      <w:numFmt w:val="bullet"/>
+      <w:lvlText w:val="o"/>
+      <w:lvlJc w:val="left"/>
+      <w:pPr>
+        <w:ind w:left="1440" w:hanging="360"/>
+      </w:pPr>
+      <w:rPr>
+        <w:rFonts w:ascii="Courier New" w:hAnsi="Courier New" w:cs="Courier New" w:hint="default"/>
+      </w:rPr>
+    </w:lvl>
+    <w:lvl w:ilvl="2" w:tplc="04090005" w:tentative="1">
+      <w:start w:val="1"/>
+      <w:numFmt w:val="bullet"/>
+      <w:lvlText w:val=""/>
+      <w:lvlJc w:val="left"/>
+      <w:pPr>
+        <w:ind w:left="2160" w:hanging="360"/>
+      </w:pPr>
+      <w:rPr>
+        <w:rFonts w:ascii="Wingdings" w:hAnsi="Wingdings" w:hint="default"/>
+      </w:rPr>
+    </w:lvl>
+    <w:lvl w:ilvl="3" w:tplc="04090001" w:tentative="1">
+      <w:start w:val="1"/>
+      <w:numFmt w:val="bullet"/>
+      <w:lvlText w:val=""/>
+      <w:lvlJc w:val="left"/>
+      <w:pPr>
+        <w:ind w:left="2880" w:hanging="360"/>
+      </w:pPr>
+      <w:rPr>
+        <w:rFonts w:ascii="Symbol" w:hAnsi="Symbol" w:hint="default"/>
+      </w:rPr>
+    </w:lvl>
+    <w:lvl w:ilvl="4" w:tplc="04090003" w:tentative="1">
+      <w:start w:val="1"/>
+      <w:numFmt w:val="bullet"/>
+      <w:lvlText w:val="o"/>
+      <w:lvlJc w:val="left"/>
+      <w:pPr>
+        <w:ind w:left="3600" w:hanging="360"/>
+      </w:pPr>
+      <w:rPr>
+        <w:rFonts w:ascii="Courier New" w:hAnsi="Courier New" w:cs="Courier New" w:hint="default"/>
+      </w:rPr>
+    </w:lvl>
+    <w:lvl w:ilvl="5" w:tplc="04090005" w:tentative="1">
+      <w:start w:val="1"/>
+      <w:numFmt w:val="bullet"/>
+      <w:lvlText w:val=""/>
+      <w:lvlJc w:val="left"/>
+      <w:pPr>
+        <w:ind w:left="4320" w:hanging="360"/>
+      </w:pPr>
+      <w:rPr>
+        <w:rFonts w:ascii="Wingdings" w:hAnsi="Wingdings" w:hint="default"/>
+      </w:rPr>
+    </w:lvl>
+    <w:lvl w:ilvl="6" w:tplc="04090001" w:tentative="1">
+      <w:start w:val="1"/>
+      <w:numFmt w:val="bullet"/>
+      <w:lvlText w:val=""/>
+      <w:lvlJc w:val="left"/>
+      <w:pPr>
+        <w:ind w:left="5040" w:hanging="360"/>
+      </w:pPr>
+      <w:rPr>
+        <w:rFonts w:ascii="Symbol" w:hAnsi="Symbol" w:hint="default"/>
+      </w:rPr>
+    </w:lvl>
+    <w:lvl w:ilvl="7" w:tplc="04090003" w:tentative="1">
+      <w:start w:val="1"/>
+      <w:numFmt w:val="bullet"/>
+      <w:lvlText w:val="o"/>
+      <w:lvlJc w:val="left"/>
+      <w:pPr>
+        <w:ind w:left="5760" w:hanging="360"/>
+      </w:pPr>
+      <w:rPr>
+        <w:rFonts w:ascii="Courier New" w:hAnsi="Courier New" w:cs="Courier New" w:hint="default"/>
+      </w:rPr>
+    </w:lvl>
+    <w:lvl w:ilvl="8" w:tplc="04090005" w:tentative="1">
+      <w:start w:val="1"/>
+      <w:numFmt w:val="bullet"/>
+      <w:lvlText w:val=""/>
+      <w:lvlJc w:val="left"/>
+      <w:pPr>
+        <w:ind w:left="6480" w:hanging="360"/>
+      </w:pPr>
+      <w:rPr>
+        <w:rFonts w:ascii="Wingdings" w:hAnsi="Wingdings" w:hint="default"/>
+      </w:rPr>
+    </w:lvl>
+  </w:abstractNum>
+  <w:abstractNum w:abstractNumId="22" w15:restartNumberingAfterBreak="0">
     <w:nsid w:val="39041B10"/>
     <w:multiLevelType w:val="hybridMultilevel"/>
     <w:tmpl w:val="D3365E5C"/>
@@ -4000,7 +5108,7 @@
       </w:rPr>
     </w:lvl>
   </w:abstractNum>
-  <w:abstractNum w:abstractNumId="22" w15:restartNumberingAfterBreak="0">
+  <w:abstractNum w:abstractNumId="23" w15:restartNumberingAfterBreak="0">
     <w:nsid w:val="3B13009C"/>
     <w:multiLevelType w:val="hybridMultilevel"/>
     <w:tmpl w:val="3D7AF682"/>
@@ -4113,7 +5221,7 @@
       </w:rPr>
     </w:lvl>
   </w:abstractNum>
-  <w:abstractNum w:abstractNumId="23" w15:restartNumberingAfterBreak="0">
+  <w:abstractNum w:abstractNumId="24" w15:restartNumberingAfterBreak="0">
     <w:nsid w:val="409C725E"/>
     <w:multiLevelType w:val="hybridMultilevel"/>
     <w:tmpl w:val="B66C02A2"/>
@@ -4226,7 +5334,7 @@
       </w:rPr>
     </w:lvl>
   </w:abstractNum>
-  <w:abstractNum w:abstractNumId="24" w15:restartNumberingAfterBreak="0">
+  <w:abstractNum w:abstractNumId="25" w15:restartNumberingAfterBreak="0">
     <w:nsid w:val="44BC34FE"/>
     <w:multiLevelType w:val="hybridMultilevel"/>
     <w:tmpl w:val="53007D7E"/>
@@ -4339,7 +5447,7 @@
       </w:rPr>
     </w:lvl>
   </w:abstractNum>
-  <w:abstractNum w:abstractNumId="25" w15:restartNumberingAfterBreak="0">
+  <w:abstractNum w:abstractNumId="26" w15:restartNumberingAfterBreak="0">
     <w:nsid w:val="45D06E5C"/>
     <w:multiLevelType w:val="hybridMultilevel"/>
     <w:tmpl w:val="4282C4D6"/>
@@ -4452,7 +5560,7 @@
       </w:rPr>
     </w:lvl>
   </w:abstractNum>
-  <w:abstractNum w:abstractNumId="26" w15:restartNumberingAfterBreak="0">
+  <w:abstractNum w:abstractNumId="27" w15:restartNumberingAfterBreak="0">
     <w:nsid w:val="4D8D54C3"/>
     <w:multiLevelType w:val="hybridMultilevel"/>
     <w:tmpl w:val="EDD83AFC"/>
@@ -4565,7 +5673,7 @@
       </w:rPr>
     </w:lvl>
   </w:abstractNum>
-  <w:abstractNum w:abstractNumId="27" w15:restartNumberingAfterBreak="0">
+  <w:abstractNum w:abstractNumId="28" w15:restartNumberingAfterBreak="0">
     <w:nsid w:val="4E4F725D"/>
     <w:multiLevelType w:val="hybridMultilevel"/>
     <w:tmpl w:val="596041C2"/>
@@ -4678,7 +5786,7 @@
       </w:rPr>
     </w:lvl>
   </w:abstractNum>
-  <w:abstractNum w:abstractNumId="28" w15:restartNumberingAfterBreak="0">
+  <w:abstractNum w:abstractNumId="29" w15:restartNumberingAfterBreak="0">
     <w:nsid w:val="52956C57"/>
     <w:multiLevelType w:val="hybridMultilevel"/>
     <w:tmpl w:val="37566882"/>
@@ -4791,7 +5899,7 @@
       </w:rPr>
     </w:lvl>
   </w:abstractNum>
-  <w:abstractNum w:abstractNumId="29" w15:restartNumberingAfterBreak="0">
+  <w:abstractNum w:abstractNumId="30" w15:restartNumberingAfterBreak="0">
     <w:nsid w:val="5A8E3080"/>
     <w:multiLevelType w:val="hybridMultilevel"/>
     <w:tmpl w:val="7044509C"/>
@@ -4904,7 +6012,7 @@
       </w:rPr>
     </w:lvl>
   </w:abstractNum>
-  <w:abstractNum w:abstractNumId="30" w15:restartNumberingAfterBreak="0">
+  <w:abstractNum w:abstractNumId="31" w15:restartNumberingAfterBreak="0">
     <w:nsid w:val="5D7D4ACB"/>
     <w:multiLevelType w:val="hybridMultilevel"/>
     <w:tmpl w:val="04AEE37A"/>
@@ -5017,7 +6125,7 @@
       </w:rPr>
     </w:lvl>
   </w:abstractNum>
-  <w:abstractNum w:abstractNumId="31" w15:restartNumberingAfterBreak="0">
+  <w:abstractNum w:abstractNumId="32" w15:restartNumberingAfterBreak="0">
     <w:nsid w:val="66633C11"/>
     <w:multiLevelType w:val="hybridMultilevel"/>
     <w:tmpl w:val="149870D0"/>
@@ -5130,7 +6238,7 @@
       </w:rPr>
     </w:lvl>
   </w:abstractNum>
-  <w:abstractNum w:abstractNumId="32" w15:restartNumberingAfterBreak="0">
+  <w:abstractNum w:abstractNumId="33" w15:restartNumberingAfterBreak="0">
     <w:nsid w:val="68985324"/>
     <w:multiLevelType w:val="hybridMultilevel"/>
     <w:tmpl w:val="A7F28EFA"/>
@@ -5243,7 +6351,7 @@
       </w:rPr>
     </w:lvl>
   </w:abstractNum>
-  <w:abstractNum w:abstractNumId="33" w15:restartNumberingAfterBreak="0">
+  <w:abstractNum w:abstractNumId="34" w15:restartNumberingAfterBreak="0">
     <w:nsid w:val="68A84F18"/>
     <w:multiLevelType w:val="hybridMultilevel"/>
     <w:tmpl w:val="3078C6A8"/>
@@ -5356,7 +6464,7 @@
       </w:rPr>
     </w:lvl>
   </w:abstractNum>
-  <w:abstractNum w:abstractNumId="34" w15:restartNumberingAfterBreak="0">
+  <w:abstractNum w:abstractNumId="35" w15:restartNumberingAfterBreak="0">
     <w:nsid w:val="69342FD7"/>
     <w:multiLevelType w:val="hybridMultilevel"/>
     <w:tmpl w:val="EEEC966A"/>
@@ -5469,10 +6577,10 @@
       </w:rPr>
     </w:lvl>
   </w:abstractNum>
-  <w:abstractNum w:abstractNumId="35" w15:restartNumberingAfterBreak="0">
+  <w:abstractNum w:abstractNumId="36" w15:restartNumberingAfterBreak="0">
     <w:nsid w:val="69621777"/>
     <w:multiLevelType w:val="hybridMultilevel"/>
-    <w:tmpl w:val="E96A3C8E"/>
+    <w:tmpl w:val="A79451F4"/>
     <w:lvl w:ilvl="0" w:tplc="04090001">
       <w:start w:val="1"/>
       <w:numFmt w:val="bullet"/>
@@ -5582,7 +6690,7 @@
       </w:rPr>
     </w:lvl>
   </w:abstractNum>
-  <w:abstractNum w:abstractNumId="36" w15:restartNumberingAfterBreak="0">
+  <w:abstractNum w:abstractNumId="37" w15:restartNumberingAfterBreak="0">
     <w:nsid w:val="6E1D2BD3"/>
     <w:multiLevelType w:val="hybridMultilevel"/>
     <w:tmpl w:val="E06EA030"/>
@@ -5695,7 +6803,7 @@
       </w:rPr>
     </w:lvl>
   </w:abstractNum>
-  <w:abstractNum w:abstractNumId="37" w15:restartNumberingAfterBreak="0">
+  <w:abstractNum w:abstractNumId="38" w15:restartNumberingAfterBreak="0">
     <w:nsid w:val="6EAC1399"/>
     <w:multiLevelType w:val="hybridMultilevel"/>
     <w:tmpl w:val="515CBC54"/>
@@ -5808,7 +6916,7 @@
       </w:rPr>
     </w:lvl>
   </w:abstractNum>
-  <w:abstractNum w:abstractNumId="38" w15:restartNumberingAfterBreak="0">
+  <w:abstractNum w:abstractNumId="39" w15:restartNumberingAfterBreak="0">
     <w:nsid w:val="70EA1A73"/>
     <w:multiLevelType w:val="hybridMultilevel"/>
     <w:tmpl w:val="E968D3FC"/>
@@ -5921,7 +7029,7 @@
       </w:rPr>
     </w:lvl>
   </w:abstractNum>
-  <w:abstractNum w:abstractNumId="39" w15:restartNumberingAfterBreak="0">
+  <w:abstractNum w:abstractNumId="40" w15:restartNumberingAfterBreak="0">
     <w:nsid w:val="76F9736E"/>
     <w:multiLevelType w:val="multilevel"/>
     <w:tmpl w:val="396AED1C"/>
@@ -6070,7 +7178,7 @@
       </w:rPr>
     </w:lvl>
   </w:abstractNum>
-  <w:abstractNum w:abstractNumId="40" w15:restartNumberingAfterBreak="0">
+  <w:abstractNum w:abstractNumId="41" w15:restartNumberingAfterBreak="0">
     <w:nsid w:val="776776E9"/>
     <w:multiLevelType w:val="hybridMultilevel"/>
     <w:tmpl w:val="5B5A20AA"/>
@@ -6183,7 +7291,7 @@
       </w:rPr>
     </w:lvl>
   </w:abstractNum>
-  <w:abstractNum w:abstractNumId="41" w15:restartNumberingAfterBreak="0">
+  <w:abstractNum w:abstractNumId="42" w15:restartNumberingAfterBreak="0">
     <w:nsid w:val="7BEA0A8F"/>
     <w:multiLevelType w:val="hybridMultilevel"/>
     <w:tmpl w:val="0A06D7B4"/>
@@ -6296,7 +7404,7 @@
       </w:rPr>
     </w:lvl>
   </w:abstractNum>
-  <w:abstractNum w:abstractNumId="42" w15:restartNumberingAfterBreak="0">
+  <w:abstractNum w:abstractNumId="43" w15:restartNumberingAfterBreak="0">
     <w:nsid w:val="7D1D250B"/>
     <w:multiLevelType w:val="hybridMultilevel"/>
     <w:tmpl w:val="7DDE36F8"/>
@@ -6409,7 +7517,7 @@
       </w:rPr>
     </w:lvl>
   </w:abstractNum>
-  <w:abstractNum w:abstractNumId="43" w15:restartNumberingAfterBreak="0">
+  <w:abstractNum w:abstractNumId="44" w15:restartNumberingAfterBreak="0">
     <w:nsid w:val="7DE20E47"/>
     <w:multiLevelType w:val="hybridMultilevel"/>
     <w:tmpl w:val="B300A1A2"/>
@@ -6523,34 +7631,34 @@
     </w:lvl>
   </w:abstractNum>
   <w:num w:numId="1" w16cid:durableId="828862710">
-    <w:abstractNumId w:val="30"/>
+    <w:abstractNumId w:val="31"/>
   </w:num>
   <w:num w:numId="2" w16cid:durableId="1356692034">
-    <w:abstractNumId w:val="42"/>
+    <w:abstractNumId w:val="43"/>
   </w:num>
   <w:num w:numId="3" w16cid:durableId="756830097">
     <w:abstractNumId w:val="20"/>
   </w:num>
   <w:num w:numId="4" w16cid:durableId="1341852627">
-    <w:abstractNumId w:val="26"/>
+    <w:abstractNumId w:val="27"/>
   </w:num>
   <w:num w:numId="5" w16cid:durableId="680158528">
     <w:abstractNumId w:val="11"/>
   </w:num>
   <w:num w:numId="6" w16cid:durableId="2006785698">
-    <w:abstractNumId w:val="32"/>
+    <w:abstractNumId w:val="33"/>
   </w:num>
   <w:num w:numId="7" w16cid:durableId="219486840">
     <w:abstractNumId w:val="13"/>
   </w:num>
   <w:num w:numId="8" w16cid:durableId="1253509742">
-    <w:abstractNumId w:val="24"/>
+    <w:abstractNumId w:val="25"/>
   </w:num>
   <w:num w:numId="9" w16cid:durableId="95488419">
-    <w:abstractNumId w:val="36"/>
+    <w:abstractNumId w:val="37"/>
   </w:num>
   <w:num w:numId="10" w16cid:durableId="806163805">
-    <w:abstractNumId w:val="28"/>
+    <w:abstractNumId w:val="29"/>
   </w:num>
   <w:num w:numId="11" w16cid:durableId="912352183">
     <w:abstractNumId w:val="15"/>
@@ -6562,16 +7670,16 @@
     <w:abstractNumId w:val="18"/>
   </w:num>
   <w:num w:numId="14" w16cid:durableId="263415914">
-    <w:abstractNumId w:val="31"/>
+    <w:abstractNumId w:val="32"/>
   </w:num>
   <w:num w:numId="15" w16cid:durableId="92630070">
     <w:abstractNumId w:val="16"/>
   </w:num>
   <w:num w:numId="16" w16cid:durableId="2029671194">
-    <w:abstractNumId w:val="27"/>
+    <w:abstractNumId w:val="28"/>
   </w:num>
   <w:num w:numId="17" w16cid:durableId="728959302">
-    <w:abstractNumId w:val="43"/>
+    <w:abstractNumId w:val="44"/>
   </w:num>
   <w:num w:numId="18" w16cid:durableId="1258370805">
     <w:abstractNumId w:val="6"/>
@@ -6580,19 +7688,19 @@
     <w:abstractNumId w:val="0"/>
   </w:num>
   <w:num w:numId="20" w16cid:durableId="1424378757">
-    <w:abstractNumId w:val="40"/>
+    <w:abstractNumId w:val="41"/>
   </w:num>
   <w:num w:numId="21" w16cid:durableId="1290938039">
-    <w:abstractNumId w:val="41"/>
+    <w:abstractNumId w:val="42"/>
   </w:num>
   <w:num w:numId="22" w16cid:durableId="459105670">
     <w:abstractNumId w:val="7"/>
   </w:num>
   <w:num w:numId="23" w16cid:durableId="505637807">
-    <w:abstractNumId w:val="34"/>
+    <w:abstractNumId w:val="35"/>
   </w:num>
   <w:num w:numId="24" w16cid:durableId="1843545721">
-    <w:abstractNumId w:val="39"/>
+    <w:abstractNumId w:val="40"/>
   </w:num>
   <w:num w:numId="25" w16cid:durableId="1808279424">
     <w:abstractNumId w:val="4"/>
@@ -6601,28 +7709,28 @@
     <w:abstractNumId w:val="19"/>
   </w:num>
   <w:num w:numId="27" w16cid:durableId="129788310">
-    <w:abstractNumId w:val="29"/>
+    <w:abstractNumId w:val="30"/>
   </w:num>
   <w:num w:numId="28" w16cid:durableId="1095327119">
     <w:abstractNumId w:val="1"/>
   </w:num>
   <w:num w:numId="29" w16cid:durableId="1199666349">
-    <w:abstractNumId w:val="37"/>
+    <w:abstractNumId w:val="38"/>
   </w:num>
   <w:num w:numId="30" w16cid:durableId="1091463587">
-    <w:abstractNumId w:val="38"/>
+    <w:abstractNumId w:val="39"/>
   </w:num>
   <w:num w:numId="31" w16cid:durableId="815924855">
-    <w:abstractNumId w:val="21"/>
+    <w:abstractNumId w:val="22"/>
   </w:num>
   <w:num w:numId="32" w16cid:durableId="1139807878">
-    <w:abstractNumId w:val="23"/>
+    <w:abstractNumId w:val="24"/>
   </w:num>
   <w:num w:numId="33" w16cid:durableId="1238200991">
     <w:abstractNumId w:val="2"/>
   </w:num>
   <w:num w:numId="34" w16cid:durableId="2007439656">
-    <w:abstractNumId w:val="25"/>
+    <w:abstractNumId w:val="26"/>
   </w:num>
   <w:num w:numId="35" w16cid:durableId="195385350">
     <w:abstractNumId w:val="14"/>
@@ -6631,13 +7739,13 @@
     <w:abstractNumId w:val="12"/>
   </w:num>
   <w:num w:numId="37" w16cid:durableId="1356074323">
-    <w:abstractNumId w:val="33"/>
+    <w:abstractNumId w:val="34"/>
   </w:num>
   <w:num w:numId="38" w16cid:durableId="746608782">
     <w:abstractNumId w:val="9"/>
   </w:num>
   <w:num w:numId="39" w16cid:durableId="584654120">
-    <w:abstractNumId w:val="22"/>
+    <w:abstractNumId w:val="23"/>
   </w:num>
   <w:num w:numId="40" w16cid:durableId="1114666044">
     <w:abstractNumId w:val="3"/>
@@ -6652,7 +7760,10 @@
     <w:abstractNumId w:val="5"/>
   </w:num>
   <w:num w:numId="44" w16cid:durableId="331952820">
-    <w:abstractNumId w:val="35"/>
+    <w:abstractNumId w:val="36"/>
+  </w:num>
+  <w:num w:numId="45" w16cid:durableId="1569539938">
+    <w:abstractNumId w:val="21"/>
   </w:num>
 </w:numbering>
 </file>
@@ -7261,7 +8372,6 @@
   <w:style w:type="character" w:default="1" w:styleId="DefaultParagraphFont">
     <w:name w:val="Default Paragraph Font"/>
     <w:uiPriority w:val="1"/>
-    <w:semiHidden/>
     <w:unhideWhenUsed/>
   </w:style>
   <w:style w:type="table" w:default="1" w:styleId="TableNormal">

</xml_diff>

<commit_message>
Added mechanial design exp
</commit_message>
<xml_diff>
--- a/Mihir_Resume_ME.docx
+++ b/Mihir_Resume_ME.docx
@@ -4,7 +4,7 @@
   <w:body>
     <w:p>
       <w:pPr>
-        <w:spacing w:after="0"/>
+        <w:spacing w:after="0" w:line="240" w:lineRule="auto"/>
         <w:jc w:val="center"/>
         <w:rPr>
           <w:rFonts w:ascii="Arial" w:hAnsi="Arial" w:cs="Arial"/>
@@ -29,20 +29,31 @@
     </w:p>
     <w:p>
       <w:pPr>
+        <w:spacing w:after="0" w:line="240" w:lineRule="auto"/>
         <w:jc w:val="center"/>
         <w:rPr>
           <w:rFonts w:ascii="Times New Roman" w:hAnsi="Times New Roman" w:cs="Times New Roman"/>
         </w:rPr>
       </w:pPr>
-      <w:hyperlink r:id="rId6" w:history="1">
-        <w:r>
-          <w:rPr>
-            <w:rStyle w:val="Hyperlink"/>
-            <w:rFonts w:ascii="Times New Roman" w:hAnsi="Times New Roman" w:cs="Times New Roman"/>
-          </w:rPr>
-          <w:t>mihir.patki01@gmail.com</w:t>
-        </w:r>
-      </w:hyperlink>
+      <w:r>
+        <w:fldChar w:fldCharType="begin"/>
+      </w:r>
+      <w:r>
+        <w:instrText>HYPERLINK "mailto:mihir.patki01@gmail.com"</w:instrText>
+      </w:r>
+      <w:r>
+        <w:fldChar w:fldCharType="separate"/>
+      </w:r>
+      <w:r>
+        <w:rPr>
+          <w:rStyle w:val="Hyperlink"/>
+          <w:rFonts w:ascii="Times New Roman" w:hAnsi="Times New Roman" w:cs="Times New Roman"/>
+        </w:rPr>
+        <w:t>mihir.patki01@gmail.com</w:t>
+      </w:r>
+      <w:r>
+        <w:fldChar w:fldCharType="end"/>
+      </w:r>
       <w:r>
         <w:rPr>
           <w:rFonts w:ascii="Times New Roman" w:hAnsi="Times New Roman" w:cs="Times New Roman"/>
@@ -55,10 +66,33 @@
         <w:tabs>
           <w:tab w:val="right" w:pos="10800"/>
         </w:tabs>
-        <w:spacing w:after="0"/>
+        <w:spacing w:after="0" w:line="240" w:lineRule="auto"/>
         <w:rPr>
           <w:rFonts w:ascii="Times New Roman" w:hAnsi="Times New Roman" w:cs="Times New Roman"/>
           <w:color w:val="4C94D8" w:themeColor="text2" w:themeTint="80"/>
+        </w:rPr>
+      </w:pPr>
+      <w:r>
+        <w:rPr>
+          <w:rFonts w:ascii="Arial" w:hAnsi="Arial" w:cs="Arial"/>
+          <w:b/>
+          <w:bCs/>
+          <w:color w:val="4C94D8" w:themeColor="text2" w:themeTint="80"/>
+        </w:rPr>
+        <w:t>Objective</w:t>
+      </w:r>
+    </w:p>
+    <w:p>
+      <w:pPr>
+        <w:tabs>
+          <w:tab w:val="right" w:pos="10800"/>
+        </w:tabs>
+        <w:spacing w:after="0" w:line="240" w:lineRule="auto"/>
+        <w:rPr>
+          <w:rFonts w:ascii="Times New Roman" w:hAnsi="Times New Roman" w:cs="Times New Roman"/>
+          <w:color w:val="000000" w:themeColor="text1"/>
+          <w:sz w:val="6"/>
+          <w:szCs w:val="6"/>
         </w:rPr>
       </w:pPr>
       <w:r>
@@ -72,15 +106,15 @@
         <mc:AlternateContent>
           <mc:Choice Requires="wps">
             <w:drawing>
-              <wp:anchor distT="0" distB="0" distL="114300" distR="114300" simplePos="0" relativeHeight="251666432" behindDoc="0" locked="0" layoutInCell="1" allowOverlap="1" wp14:anchorId="363002FC" wp14:editId="1B741748">
+              <wp:anchor distT="0" distB="0" distL="114300" distR="114300" simplePos="0" relativeHeight="251666432" behindDoc="0" locked="0" layoutInCell="1" allowOverlap="1" wp14:anchorId="363002FC" wp14:editId="3C8008F3">
                 <wp:simplePos x="0" y="0"/>
                 <wp:positionH relativeFrom="column">
                   <wp:posOffset>6985</wp:posOffset>
                 </wp:positionH>
                 <wp:positionV relativeFrom="paragraph">
-                  <wp:posOffset>191895</wp:posOffset>
+                  <wp:posOffset>36070</wp:posOffset>
                 </wp:positionV>
-                <wp:extent cx="6842770" cy="0"/>
+                <wp:extent cx="6842760" cy="0"/>
                 <wp:effectExtent l="0" t="12700" r="15240" b="12700"/>
                 <wp:wrapNone/>
                 <wp:docPr id="1826805249" name="Straight Connector 1"/>
@@ -92,7 +126,7 @@
                       <wps:spPr>
                         <a:xfrm>
                           <a:off x="0" y="0"/>
-                          <a:ext cx="6842770" cy="0"/>
+                          <a:ext cx="6842760" cy="0"/>
                         </a:xfrm>
                         <a:prstGeom prst="line">
                           <a:avLst/>
@@ -124,109 +158,91 @@
           </mc:Choice>
           <mc:Fallback>
             <w:pict>
-              <v:line w14:anchorId="426FF3EA" id="Straight Connector 1" o:spid="_x0000_s1026" style="position:absolute;z-index:251666432;visibility:visible;mso-wrap-style:square;mso-width-percent:0;mso-wrap-distance-left:9pt;mso-wrap-distance-top:0;mso-wrap-distance-right:9pt;mso-wrap-distance-bottom:0;mso-position-horizontal:absolute;mso-position-horizontal-relative:text;mso-position-vertical:absolute;mso-position-vertical-relative:text;mso-width-percent:0;mso-width-relative:margin" from=".55pt,15.1pt" to="539.35pt,15.1pt" o:gfxdata="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" strokecolor="black [3200]" strokeweight="1.5pt">
+              <v:line w14:anchorId="5C6E5070" id="Straight Connector 1" o:spid="_x0000_s1026" style="position:absolute;z-index:251666432;visibility:visible;mso-wrap-style:square;mso-width-percent:0;mso-wrap-distance-left:9pt;mso-wrap-distance-top:0;mso-wrap-distance-right:9pt;mso-wrap-distance-bottom:0;mso-position-horizontal:absolute;mso-position-horizontal-relative:text;mso-position-vertical:absolute;mso-position-vertical-relative:text;mso-width-percent:0;mso-width-relative:margin" from=".55pt,2.85pt" to="539.35pt,2.85pt" o:gfxdata="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" strokecolor="black [3200]" strokeweight="1.5pt">
                 <v:stroke joinstyle="miter"/>
               </v:line>
             </w:pict>
           </mc:Fallback>
         </mc:AlternateContent>
       </w:r>
-      <w:r>
+    </w:p>
+    <w:p>
+      <w:pPr>
+        <w:tabs>
+          <w:tab w:val="right" w:pos="10800"/>
+        </w:tabs>
+        <w:spacing w:after="0" w:line="240" w:lineRule="auto"/>
+        <w:rPr>
+          <w:rFonts w:ascii="Times New Roman" w:hAnsi="Times New Roman" w:cs="Times New Roman"/>
+          <w:color w:val="000000" w:themeColor="text1"/>
+          <w:sz w:val="22"/>
+          <w:szCs w:val="22"/>
+        </w:rPr>
+      </w:pPr>
+      <w:r>
+        <w:rPr>
+          <w:rFonts w:ascii="Times New Roman" w:hAnsi="Times New Roman" w:cs="Times New Roman"/>
+          <w:color w:val="000000" w:themeColor="text1"/>
+          <w:sz w:val="22"/>
+          <w:szCs w:val="22"/>
+        </w:rPr>
+        <w:t xml:space="preserve">To obtain a mechanical engineer </w:t>
+      </w:r>
+      <w:r>
+        <w:rPr>
+          <w:rFonts w:ascii="Times New Roman" w:hAnsi="Times New Roman" w:cs="Times New Roman"/>
+          <w:color w:val="000000" w:themeColor="text1"/>
+          <w:sz w:val="22"/>
+          <w:szCs w:val="22"/>
+        </w:rPr>
+        <w:t>positio</w:t>
+      </w:r>
+      <w:r>
+        <w:rPr>
+          <w:rFonts w:ascii="Times New Roman" w:hAnsi="Times New Roman" w:cs="Times New Roman"/>
+          <w:color w:val="000000" w:themeColor="text1"/>
+          <w:sz w:val="22"/>
+          <w:szCs w:val="22"/>
+        </w:rPr>
+        <w:t xml:space="preserve">n with XYZ company, </w:t>
+      </w:r>
+      <w:r>
+        <w:rPr>
+          <w:rFonts w:ascii="Times New Roman" w:hAnsi="Times New Roman" w:cs="Times New Roman"/>
+          <w:color w:val="000000" w:themeColor="text1"/>
+          <w:sz w:val="22"/>
+          <w:szCs w:val="22"/>
+        </w:rPr>
+        <w:t xml:space="preserve">where I can utilize my technical skills and experience in designing and developing mechanical systems and products. </w:t>
+      </w:r>
+    </w:p>
+    <w:p>
+      <w:pPr>
+        <w:tabs>
+          <w:tab w:val="right" w:pos="10800"/>
+        </w:tabs>
+        <w:spacing w:after="0" w:line="240" w:lineRule="auto"/>
         <w:rPr>
           <w:rFonts w:ascii="Arial" w:hAnsi="Arial" w:cs="Arial"/>
           <w:b/>
           <w:bCs/>
           <w:color w:val="4C94D8" w:themeColor="text2" w:themeTint="80"/>
-        </w:rPr>
-        <w:t>Objective</w:t>
-      </w:r>
+          <w:sz w:val="6"/>
+          <w:szCs w:val="6"/>
+        </w:rPr>
+      </w:pPr>
     </w:p>
     <w:p>
       <w:pPr>
         <w:tabs>
           <w:tab w:val="right" w:pos="10800"/>
         </w:tabs>
-        <w:spacing w:after="0"/>
+        <w:spacing w:after="0" w:line="240" w:lineRule="auto"/>
         <w:rPr>
           <w:rFonts w:ascii="Times New Roman" w:hAnsi="Times New Roman" w:cs="Times New Roman"/>
           <w:color w:val="000000" w:themeColor="text1"/>
           <w:sz w:val="22"/>
           <w:szCs w:val="22"/>
-        </w:rPr>
-      </w:pPr>
-      <w:r>
-        <w:rPr>
-          <w:rFonts w:ascii="Times New Roman" w:hAnsi="Times New Roman" w:cs="Times New Roman"/>
-          <w:color w:val="000000" w:themeColor="text1"/>
-          <w:sz w:val="22"/>
-          <w:szCs w:val="22"/>
-        </w:rPr>
-        <w:t xml:space="preserve">Motivated Mechanical Engineer seeking an opportunity to work at Belcan, supporting the design and analysis of aerospace mechanical systems </w:t>
-      </w:r>
-      <w:r>
-        <w:rPr>
-          <w:rFonts w:ascii="Times New Roman" w:hAnsi="Times New Roman" w:cs="Times New Roman"/>
-          <w:color w:val="000000" w:themeColor="text1"/>
-          <w:sz w:val="22"/>
-          <w:szCs w:val="22"/>
-        </w:rPr>
-        <w:t>utilizing</w:t>
-      </w:r>
-      <w:r>
-        <w:rPr>
-          <w:rFonts w:ascii="Times New Roman" w:hAnsi="Times New Roman" w:cs="Times New Roman"/>
-          <w:color w:val="000000" w:themeColor="text1"/>
-          <w:sz w:val="22"/>
-          <w:szCs w:val="22"/>
-        </w:rPr>
-        <w:t xml:space="preserve"> </w:t>
-      </w:r>
-      <w:r>
-        <w:rPr>
-          <w:rFonts w:ascii="Times New Roman" w:hAnsi="Times New Roman" w:cs="Times New Roman"/>
-          <w:color w:val="000000" w:themeColor="text1"/>
-          <w:sz w:val="22"/>
-          <w:szCs w:val="22"/>
-        </w:rPr>
-        <w:t>fundamental</w:t>
-      </w:r>
-      <w:r>
-        <w:rPr>
-          <w:rFonts w:ascii="Times New Roman" w:hAnsi="Times New Roman" w:cs="Times New Roman"/>
-          <w:color w:val="000000" w:themeColor="text1"/>
-          <w:sz w:val="22"/>
-          <w:szCs w:val="22"/>
-        </w:rPr>
-        <w:t xml:space="preserve"> </w:t>
-      </w:r>
-      <w:r>
-        <w:rPr>
-          <w:rFonts w:ascii="Times New Roman" w:hAnsi="Times New Roman" w:cs="Times New Roman"/>
-          <w:color w:val="000000" w:themeColor="text1"/>
-          <w:sz w:val="22"/>
-          <w:szCs w:val="22"/>
-        </w:rPr>
-        <w:t>principles</w:t>
-      </w:r>
-      <w:r>
-        <w:rPr>
-          <w:rFonts w:ascii="Times New Roman" w:hAnsi="Times New Roman" w:cs="Times New Roman"/>
-          <w:color w:val="000000" w:themeColor="text1"/>
-          <w:sz w:val="22"/>
-          <w:szCs w:val="22"/>
-        </w:rPr>
-        <w:t xml:space="preserve"> of structural mechanics, heat transfer and CAD design. </w:t>
-      </w:r>
-    </w:p>
-    <w:p>
-      <w:pPr>
-        <w:tabs>
-          <w:tab w:val="right" w:pos="10800"/>
-        </w:tabs>
-        <w:spacing w:after="0"/>
-        <w:rPr>
-          <w:rFonts w:ascii="Times New Roman" w:hAnsi="Times New Roman" w:cs="Times New Roman"/>
-          <w:color w:val="4C94D8" w:themeColor="text2" w:themeTint="80"/>
         </w:rPr>
       </w:pPr>
       <w:r>
@@ -341,41 +357,27 @@
         <w:spacing w:after="0" w:line="240" w:lineRule="auto"/>
         <w:rPr>
           <w:rFonts w:ascii="Times New Roman" w:hAnsi="Times New Roman" w:cs="Times New Roman"/>
+          <w:sz w:val="22"/>
+          <w:szCs w:val="22"/>
+        </w:rPr>
+      </w:pPr>
+      <w:r>
+        <w:rPr>
+          <w:rFonts w:ascii="Times New Roman" w:hAnsi="Times New Roman" w:cs="Times New Roman"/>
           <w:b/>
           <w:bCs/>
           <w:sz w:val="22"/>
           <w:szCs w:val="22"/>
         </w:rPr>
-      </w:pPr>
-      <w:r>
-        <w:rPr>
-          <w:rFonts w:ascii="Times New Roman" w:hAnsi="Times New Roman" w:cs="Times New Roman"/>
-          <w:b/>
-          <w:bCs/>
-          <w:sz w:val="22"/>
-          <w:szCs w:val="22"/>
-        </w:rPr>
         <w:t>University of Massachusetts, Amherst</w:t>
       </w:r>
       <w:r>
         <w:rPr>
           <w:rFonts w:ascii="Times New Roman" w:hAnsi="Times New Roman" w:cs="Times New Roman"/>
-          <w:b/>
-          <w:bCs/>
           <w:sz w:val="22"/>
           <w:szCs w:val="22"/>
         </w:rPr>
         <w:tab/>
-      </w:r>
-      <w:r>
-        <w:rPr>
-          <w:rFonts w:ascii="Times New Roman" w:hAnsi="Times New Roman" w:cs="Times New Roman"/>
-          <w:b/>
-          <w:bCs/>
-          <w:sz w:val="22"/>
-          <w:szCs w:val="22"/>
-        </w:rPr>
-        <w:t>Amherst, MA</w:t>
       </w:r>
     </w:p>
     <w:p>
@@ -400,7 +402,27 @@
           <w:sz w:val="22"/>
           <w:szCs w:val="22"/>
         </w:rPr>
-        <w:t xml:space="preserve">Bachelor of Science in Mechanical Engineering </w:t>
+        <w:t>Bachelor of Science</w:t>
+      </w:r>
+      <w:r>
+        <w:rPr>
+          <w:rFonts w:ascii="Times New Roman" w:hAnsi="Times New Roman" w:cs="Times New Roman"/>
+          <w:b/>
+          <w:bCs/>
+          <w:sz w:val="22"/>
+          <w:szCs w:val="22"/>
+        </w:rPr>
+        <w:t xml:space="preserve"> (B.S.)</w:t>
+      </w:r>
+      <w:r>
+        <w:rPr>
+          <w:rFonts w:ascii="Times New Roman" w:hAnsi="Times New Roman" w:cs="Times New Roman"/>
+          <w:b/>
+          <w:bCs/>
+          <w:sz w:val="22"/>
+          <w:szCs w:val="22"/>
+        </w:rPr>
+        <w:t xml:space="preserve"> in Mechanical Engineering </w:t>
       </w:r>
       <w:r>
         <w:rPr>
@@ -449,7 +471,87 @@
           <w:sz w:val="22"/>
           <w:szCs w:val="22"/>
         </w:rPr>
-        <w:t xml:space="preserve">Design of Mech Components, Design of Mech Assemblies, Design of Mech Systems, </w:t>
+        <w:t>Advanced Manufacturing/Polymers, Numerical Methods, Advanced Programming,</w:t>
+      </w:r>
+      <w:r>
+        <w:rPr>
+          <w:rFonts w:ascii="Times New Roman" w:hAnsi="Times New Roman" w:cs="Times New Roman"/>
+          <w:sz w:val="22"/>
+          <w:szCs w:val="22"/>
+        </w:rPr>
+        <w:t xml:space="preserve"> </w:t>
+      </w:r>
+      <w:r>
+        <w:rPr>
+          <w:rFonts w:ascii="Times New Roman" w:hAnsi="Times New Roman" w:cs="Times New Roman"/>
+          <w:sz w:val="22"/>
+          <w:szCs w:val="22"/>
+        </w:rPr>
+        <w:t>Nanomaterials and Sensors</w:t>
+      </w:r>
+      <w:r>
+        <w:rPr>
+          <w:rFonts w:ascii="Times New Roman" w:hAnsi="Times New Roman" w:cs="Times New Roman"/>
+          <w:sz w:val="22"/>
+          <w:szCs w:val="22"/>
+        </w:rPr>
+        <w:t>,</w:t>
+      </w:r>
+      <w:r>
+        <w:rPr>
+          <w:rFonts w:ascii="Times New Roman" w:hAnsi="Times New Roman" w:cs="Times New Roman"/>
+          <w:sz w:val="22"/>
+          <w:szCs w:val="22"/>
+        </w:rPr>
+        <w:t xml:space="preserve"> </w:t>
+      </w:r>
+      <w:r>
+        <w:rPr>
+          <w:rFonts w:ascii="Times New Roman" w:hAnsi="Times New Roman" w:cs="Times New Roman"/>
+          <w:sz w:val="22"/>
+          <w:szCs w:val="22"/>
+        </w:rPr>
+        <w:t>Fluid Mechanics</w:t>
+      </w:r>
+      <w:r>
+        <w:rPr>
+          <w:rFonts w:ascii="Times New Roman" w:hAnsi="Times New Roman" w:cs="Times New Roman"/>
+          <w:sz w:val="22"/>
+          <w:szCs w:val="22"/>
+        </w:rPr>
+        <w:t xml:space="preserve">, </w:t>
+      </w:r>
+      <w:r>
+        <w:rPr>
+          <w:rFonts w:ascii="Times New Roman" w:hAnsi="Times New Roman" w:cs="Times New Roman"/>
+          <w:sz w:val="22"/>
+          <w:szCs w:val="22"/>
+        </w:rPr>
+        <w:t>Heat Transfer</w:t>
+      </w:r>
+      <w:r>
+        <w:rPr>
+          <w:rFonts w:ascii="Times New Roman" w:hAnsi="Times New Roman" w:cs="Times New Roman"/>
+          <w:sz w:val="22"/>
+          <w:szCs w:val="22"/>
+        </w:rPr>
+        <w:t xml:space="preserve">, </w:t>
+      </w:r>
+      <w:r>
+        <w:rPr>
+          <w:rFonts w:ascii="Times New Roman" w:hAnsi="Times New Roman" w:cs="Times New Roman"/>
+          <w:sz w:val="22"/>
+          <w:szCs w:val="22"/>
+        </w:rPr>
+        <w:t>Machine Design,</w:t>
+      </w:r>
+      <w:r>
+        <w:rPr>
+          <w:rFonts w:ascii="Times New Roman" w:hAnsi="Times New Roman" w:cs="Times New Roman"/>
+          <w:sz w:val="22"/>
+          <w:szCs w:val="22"/>
+        </w:rPr>
+        <w:t xml:space="preserve"> </w:t>
       </w:r>
       <w:r>
         <w:rPr>
@@ -465,22 +567,6 @@
           <w:sz w:val="22"/>
           <w:szCs w:val="22"/>
         </w:rPr>
-        <w:t xml:space="preserve"> Strength of Materials, Mechanics of Materials, Engr Econ Dec Making,</w:t>
-      </w:r>
-      <w:r>
-        <w:rPr>
-          <w:rFonts w:ascii="Times New Roman" w:hAnsi="Times New Roman" w:cs="Times New Roman"/>
-          <w:sz w:val="22"/>
-          <w:szCs w:val="22"/>
-        </w:rPr>
-        <w:t xml:space="preserve"> Thermodynamics, Fluid Mechanics, Heat Transfer,</w:t>
-      </w:r>
-      <w:r>
-        <w:rPr>
-          <w:rFonts w:ascii="Times New Roman" w:hAnsi="Times New Roman" w:cs="Times New Roman"/>
-          <w:sz w:val="22"/>
-          <w:szCs w:val="22"/>
-        </w:rPr>
         <w:t xml:space="preserve"> </w:t>
       </w:r>
       <w:r>
@@ -489,78 +575,15 @@
           <w:sz w:val="22"/>
           <w:szCs w:val="22"/>
         </w:rPr>
-        <w:t>Calculus IV, Ordinary Differential Equations</w:t>
-      </w:r>
-    </w:p>
-    <w:p>
-      <w:pPr>
-        <w:tabs>
-          <w:tab w:val="right" w:pos="10800"/>
-        </w:tabs>
-        <w:spacing w:after="0" w:line="240" w:lineRule="auto"/>
-        <w:rPr>
-          <w:rFonts w:ascii="Times New Roman" w:hAnsi="Times New Roman" w:cs="Times New Roman"/>
-          <w:sz w:val="22"/>
-          <w:szCs w:val="22"/>
-        </w:rPr>
-      </w:pPr>
-      <w:r>
-        <w:rPr>
-          <w:rFonts w:ascii="Times New Roman" w:hAnsi="Times New Roman" w:cs="Times New Roman"/>
-          <w:b/>
-          <w:bCs/>
-          <w:sz w:val="22"/>
-          <w:szCs w:val="22"/>
-        </w:rPr>
-        <w:t>Tech Electives:</w:t>
-      </w:r>
-      <w:r>
-        <w:rPr>
-          <w:rFonts w:ascii="Times New Roman" w:hAnsi="Times New Roman" w:cs="Times New Roman"/>
-          <w:sz w:val="22"/>
-          <w:szCs w:val="22"/>
-        </w:rPr>
-        <w:t xml:space="preserve"> </w:t>
-      </w:r>
-      <w:r>
-        <w:rPr>
-          <w:rFonts w:ascii="Times New Roman" w:hAnsi="Times New Roman" w:cs="Times New Roman"/>
-          <w:sz w:val="22"/>
-          <w:szCs w:val="22"/>
-        </w:rPr>
-        <w:t xml:space="preserve">Advanced Manufacturing/Polymers, </w:t>
-      </w:r>
-      <w:r>
-        <w:rPr>
-          <w:rFonts w:ascii="Times New Roman" w:hAnsi="Times New Roman" w:cs="Times New Roman"/>
-          <w:sz w:val="22"/>
-          <w:szCs w:val="22"/>
-        </w:rPr>
-        <w:t xml:space="preserve">Numerical Methods, </w:t>
-      </w:r>
-      <w:r>
-        <w:rPr>
-          <w:rFonts w:ascii="Times New Roman" w:hAnsi="Times New Roman" w:cs="Times New Roman"/>
-          <w:sz w:val="22"/>
-          <w:szCs w:val="22"/>
-        </w:rPr>
-        <w:t xml:space="preserve">Advanced Programming, </w:t>
-      </w:r>
-      <w:r>
-        <w:rPr>
-          <w:rFonts w:ascii="Times New Roman" w:hAnsi="Times New Roman" w:cs="Times New Roman"/>
-          <w:sz w:val="22"/>
-          <w:szCs w:val="22"/>
-        </w:rPr>
-        <w:t>Nanomaterials and Sensors</w:t>
-      </w:r>
-      <w:r>
-        <w:rPr>
-          <w:rFonts w:ascii="Times New Roman" w:hAnsi="Times New Roman" w:cs="Times New Roman"/>
-          <w:sz w:val="22"/>
-          <w:szCs w:val="22"/>
-        </w:rPr>
-        <w:t>, Human Factors</w:t>
+        <w:t>Mechanics of Materials</w:t>
+      </w:r>
+      <w:r>
+        <w:rPr>
+          <w:rFonts w:ascii="Times New Roman" w:hAnsi="Times New Roman" w:cs="Times New Roman"/>
+          <w:sz w:val="22"/>
+          <w:szCs w:val="22"/>
+        </w:rPr>
+        <w:t>, Manufacturing Processes, Dynamic Systems, Calculus IV, Ordinary Differential Equations</w:t>
       </w:r>
     </w:p>
     <w:p>
@@ -568,7 +591,7 @@
         <w:tabs>
           <w:tab w:val="right" w:pos="9000"/>
         </w:tabs>
-        <w:spacing w:after="0"/>
+        <w:spacing w:after="0" w:line="240" w:lineRule="auto"/>
         <w:rPr>
           <w:rFonts w:ascii="Arial" w:hAnsi="Arial" w:cs="Arial"/>
           <w:b/>
@@ -584,7 +607,7 @@
         <w:tabs>
           <w:tab w:val="right" w:pos="9000"/>
         </w:tabs>
-        <w:spacing w:after="0"/>
+        <w:spacing w:after="0" w:line="240" w:lineRule="auto"/>
         <w:rPr>
           <w:rFonts w:ascii="Arial" w:hAnsi="Arial" w:cs="Arial"/>
         </w:rPr>
@@ -600,13 +623,185 @@
         <mc:AlternateContent>
           <mc:Choice Requires="wps">
             <w:drawing>
-              <wp:anchor distT="0" distB="0" distL="114300" distR="114300" simplePos="0" relativeHeight="251660288" behindDoc="0" locked="0" layoutInCell="1" allowOverlap="1" wp14:anchorId="57B09167" wp14:editId="4EEF2A65">
+              <wp:anchor distT="0" distB="0" distL="114300" distR="114300" simplePos="0" relativeHeight="251668480" behindDoc="0" locked="0" layoutInCell="1" allowOverlap="1" wp14:anchorId="2CA6075B" wp14:editId="7874FFBA">
                 <wp:simplePos x="0" y="0"/>
                 <wp:positionH relativeFrom="column">
                   <wp:posOffset>7110</wp:posOffset>
                 </wp:positionH>
                 <wp:positionV relativeFrom="paragraph">
                   <wp:posOffset>184150</wp:posOffset>
+                </wp:positionV>
+                <wp:extent cx="6842770" cy="0"/>
+                <wp:effectExtent l="0" t="12700" r="15240" b="12700"/>
+                <wp:wrapNone/>
+                <wp:docPr id="1259654044" name="Straight Connector 2"/>
+                <wp:cNvGraphicFramePr/>
+                <a:graphic xmlns:a="http://schemas.openxmlformats.org/drawingml/2006/main">
+                  <a:graphicData uri="http://schemas.microsoft.com/office/word/2010/wordprocessingShape">
+                    <wps:wsp>
+                      <wps:cNvCnPr/>
+                      <wps:spPr>
+                        <a:xfrm>
+                          <a:off x="0" y="0"/>
+                          <a:ext cx="6842770" cy="0"/>
+                        </a:xfrm>
+                        <a:prstGeom prst="line">
+                          <a:avLst/>
+                        </a:prstGeom>
+                      </wps:spPr>
+                      <wps:style>
+                        <a:lnRef idx="2">
+                          <a:schemeClr val="dk1"/>
+                        </a:lnRef>
+                        <a:fillRef idx="0">
+                          <a:schemeClr val="dk1"/>
+                        </a:fillRef>
+                        <a:effectRef idx="1">
+                          <a:schemeClr val="dk1"/>
+                        </a:effectRef>
+                        <a:fontRef idx="minor">
+                          <a:schemeClr val="tx1"/>
+                        </a:fontRef>
+                      </wps:style>
+                      <wps:bodyPr/>
+                    </wps:wsp>
+                  </a:graphicData>
+                </a:graphic>
+                <wp14:sizeRelH relativeFrom="margin">
+                  <wp14:pctWidth>0</wp14:pctWidth>
+                </wp14:sizeRelH>
+              </wp:anchor>
+            </w:drawing>
+          </mc:Choice>
+          <mc:Fallback>
+            <w:pict>
+              <v:line w14:anchorId="0387DA62" id="Straight Connector 2" o:spid="_x0000_s1026" style="position:absolute;z-index:251668480;visibility:visible;mso-wrap-style:square;mso-width-percent:0;mso-wrap-distance-left:9pt;mso-wrap-distance-top:0;mso-wrap-distance-right:9pt;mso-wrap-distance-bottom:0;mso-position-horizontal:absolute;mso-position-horizontal-relative:text;mso-position-vertical:absolute;mso-position-vertical-relative:text;mso-width-percent:0;mso-width-relative:margin" from=".55pt,14.5pt" to="539.35pt,14.5pt" o:gfxdata="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" strokecolor="black [3200]" strokeweight="1.5pt">
+                <v:stroke joinstyle="miter"/>
+              </v:line>
+            </w:pict>
+          </mc:Fallback>
+        </mc:AlternateContent>
+      </w:r>
+      <w:r>
+        <w:rPr>
+          <w:rFonts w:ascii="Arial" w:hAnsi="Arial" w:cs="Arial"/>
+          <w:b/>
+          <w:bCs/>
+          <w:color w:val="4C94D8" w:themeColor="text2" w:themeTint="80"/>
+        </w:rPr>
+        <w:t>Certification</w:t>
+      </w:r>
+      <w:r>
+        <w:rPr>
+          <w:rFonts w:ascii="Arial" w:hAnsi="Arial" w:cs="Arial"/>
+        </w:rPr>
+        <w:tab/>
+      </w:r>
+    </w:p>
+    <w:p>
+      <w:pPr>
+        <w:tabs>
+          <w:tab w:val="right" w:pos="9000"/>
+        </w:tabs>
+        <w:spacing w:after="0" w:line="240" w:lineRule="auto"/>
+        <w:rPr>
+          <w:rFonts w:ascii="Times New Roman" w:hAnsi="Times New Roman" w:cs="Times New Roman"/>
+          <w:b/>
+          <w:bCs/>
+          <w:sz w:val="2"/>
+          <w:szCs w:val="2"/>
+        </w:rPr>
+      </w:pPr>
+    </w:p>
+    <w:p>
+      <w:pPr>
+        <w:tabs>
+          <w:tab w:val="right" w:pos="9000"/>
+        </w:tabs>
+        <w:spacing w:after="0" w:line="240" w:lineRule="auto"/>
+        <w:rPr>
+          <w:rFonts w:ascii="Times New Roman" w:hAnsi="Times New Roman" w:cs="Times New Roman"/>
+          <w:sz w:val="22"/>
+          <w:szCs w:val="22"/>
+        </w:rPr>
+      </w:pPr>
+      <w:r>
+        <w:rPr>
+          <w:rFonts w:ascii="Times New Roman" w:hAnsi="Times New Roman" w:cs="Times New Roman"/>
+          <w:sz w:val="22"/>
+          <w:szCs w:val="22"/>
+        </w:rPr>
+        <w:t xml:space="preserve">Engineer in Training (EIT) - Passed </w:t>
+      </w:r>
+      <w:r>
+        <w:rPr>
+          <w:rFonts w:ascii="Times New Roman" w:hAnsi="Times New Roman" w:cs="Times New Roman"/>
+          <w:sz w:val="22"/>
+          <w:szCs w:val="22"/>
+        </w:rPr>
+        <w:t xml:space="preserve">NCEES </w:t>
+      </w:r>
+      <w:r>
+        <w:rPr>
+          <w:rFonts w:ascii="Times New Roman" w:hAnsi="Times New Roman" w:cs="Times New Roman"/>
+          <w:sz w:val="22"/>
+          <w:szCs w:val="22"/>
+        </w:rPr>
+        <w:t>Fundamentals of Engineering (FE) exam</w:t>
+      </w:r>
+      <w:r>
+        <w:rPr>
+          <w:rFonts w:ascii="Times New Roman" w:hAnsi="Times New Roman" w:cs="Times New Roman"/>
+          <w:sz w:val="22"/>
+          <w:szCs w:val="22"/>
+        </w:rPr>
+        <w:t xml:space="preserve">, comprehensive 6-hour exam covering core mechanical engineering fundamentals </w:t>
+      </w:r>
+    </w:p>
+    <w:p>
+      <w:pPr>
+        <w:tabs>
+          <w:tab w:val="right" w:pos="9000"/>
+        </w:tabs>
+        <w:spacing w:after="0" w:line="240" w:lineRule="auto"/>
+        <w:rPr>
+          <w:rFonts w:ascii="Arial" w:hAnsi="Arial" w:cs="Arial"/>
+          <w:b/>
+          <w:bCs/>
+          <w:color w:val="4C94D8" w:themeColor="text2" w:themeTint="80"/>
+          <w:sz w:val="6"/>
+          <w:szCs w:val="6"/>
+        </w:rPr>
+      </w:pPr>
+    </w:p>
+    <w:p>
+      <w:pPr>
+        <w:tabs>
+          <w:tab w:val="right" w:pos="9000"/>
+        </w:tabs>
+        <w:spacing w:after="0" w:line="240" w:lineRule="auto"/>
+        <w:rPr>
+          <w:rFonts w:ascii="Arial" w:hAnsi="Arial" w:cs="Arial"/>
+        </w:rPr>
+      </w:pPr>
+      <w:r>
+        <w:rPr>
+          <w:rFonts w:ascii="Arial" w:hAnsi="Arial" w:cs="Arial"/>
+          <w:b/>
+          <w:bCs/>
+          <w:noProof/>
+          <w:color w:val="0E2841" w:themeColor="text2"/>
+        </w:rPr>
+        <mc:AlternateContent>
+          <mc:Choice Requires="wps">
+            <w:drawing>
+              <wp:anchor distT="0" distB="0" distL="114300" distR="114300" simplePos="0" relativeHeight="251660288" behindDoc="0" locked="0" layoutInCell="1" allowOverlap="1" wp14:anchorId="57B09167" wp14:editId="35711D43">
+                <wp:simplePos x="0" y="0"/>
+                <wp:positionH relativeFrom="column">
+                  <wp:posOffset>6985</wp:posOffset>
+                </wp:positionH>
+                <wp:positionV relativeFrom="paragraph">
+                  <wp:posOffset>184025</wp:posOffset>
                 </wp:positionV>
                 <wp:extent cx="6842770" cy="0"/>
                 <wp:effectExtent l="0" t="12700" r="15240" b="12700"/>
@@ -652,7 +847,7 @@
           </mc:Choice>
           <mc:Fallback>
             <w:pict>
-              <v:line w14:anchorId="21CF9F36" id="Straight Connector 2" o:spid="_x0000_s1026" style="position:absolute;z-index:251660288;visibility:visible;mso-wrap-style:square;mso-width-percent:0;mso-wrap-distance-left:9pt;mso-wrap-distance-top:0;mso-wrap-distance-right:9pt;mso-wrap-distance-bottom:0;mso-position-horizontal:absolute;mso-position-horizontal-relative:text;mso-position-vertical:absolute;mso-position-vertical-relative:text;mso-width-percent:0;mso-width-relative:margin" from=".55pt,14.5pt" to="539.35pt,14.5pt" o:gfxdata="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" strokecolor="black [3200]" strokeweight="1.5pt">
+              <v:line w14:anchorId="07219074" id="Straight Connector 2" o:spid="_x0000_s1026" style="position:absolute;z-index:251660288;visibility:visible;mso-wrap-style:square;mso-width-percent:0;mso-wrap-distance-left:9pt;mso-wrap-distance-top:0;mso-wrap-distance-right:9pt;mso-wrap-distance-bottom:0;mso-position-horizontal:absolute;mso-position-horizontal-relative:text;mso-position-vertical:absolute;mso-position-vertical-relative:text;mso-width-percent:0;mso-width-relative:margin" from=".55pt,14.5pt" to="539.35pt,14.5pt" o:gfxdata="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" strokecolor="black [3200]" strokeweight="1.5pt">
                 <v:stroke joinstyle="miter"/>
               </v:line>
             </w:pict>
@@ -666,16 +861,7 @@
           <w:bCs/>
           <w:color w:val="4C94D8" w:themeColor="text2" w:themeTint="80"/>
         </w:rPr>
-        <w:t xml:space="preserve">Skills and </w:t>
-      </w:r>
-      <w:r>
-        <w:rPr>
-          <w:rFonts w:ascii="Arial" w:hAnsi="Arial" w:cs="Arial"/>
-          <w:b/>
-          <w:bCs/>
-          <w:color w:val="4C94D8" w:themeColor="text2" w:themeTint="80"/>
-        </w:rPr>
-        <w:t>Achievements</w:t>
+        <w:t>Skills</w:t>
       </w:r>
       <w:r>
         <w:rPr>
@@ -769,6 +955,24 @@
           <w:sz w:val="22"/>
           <w:szCs w:val="22"/>
         </w:rPr>
+        <w:t xml:space="preserve">, </w:t>
+      </w:r>
+      <w:proofErr w:type="spellStart"/>
+      <w:r>
+        <w:rPr>
+          <w:rFonts w:ascii="Times New Roman" w:hAnsi="Times New Roman" w:cs="Times New Roman"/>
+          <w:sz w:val="22"/>
+          <w:szCs w:val="22"/>
+        </w:rPr>
+        <w:t>Onshape</w:t>
+      </w:r>
+      <w:proofErr w:type="spellEnd"/>
+      <w:r>
+        <w:rPr>
+          <w:rFonts w:ascii="Times New Roman" w:hAnsi="Times New Roman" w:cs="Times New Roman"/>
+          <w:sz w:val="22"/>
+          <w:szCs w:val="22"/>
+        </w:rPr>
         <w:t>)</w:t>
       </w:r>
       <w:r>
@@ -809,7 +1013,7 @@
           <w:sz w:val="22"/>
           <w:szCs w:val="22"/>
         </w:rPr>
-        <w:t xml:space="preserve">, MATLAB, Python, </w:t>
+        <w:t xml:space="preserve">, Python, </w:t>
       </w:r>
       <w:r>
         <w:rPr>
@@ -818,76 +1022,6 @@
           <w:szCs w:val="22"/>
         </w:rPr>
         <w:t>Excel, SQL</w:t>
-      </w:r>
-    </w:p>
-    <w:p>
-      <w:pPr>
-        <w:spacing w:after="0" w:line="240" w:lineRule="auto"/>
-        <w:rPr>
-          <w:rFonts w:ascii="Times New Roman" w:hAnsi="Times New Roman" w:cs="Times New Roman"/>
-          <w:sz w:val="22"/>
-          <w:szCs w:val="22"/>
-        </w:rPr>
-      </w:pPr>
-      <w:r>
-        <w:rPr>
-          <w:rFonts w:ascii="Times New Roman" w:hAnsi="Times New Roman" w:cs="Times New Roman"/>
-          <w:b/>
-          <w:bCs/>
-          <w:sz w:val="22"/>
-          <w:szCs w:val="22"/>
-        </w:rPr>
-        <w:t xml:space="preserve">Certified Engineer in Training (EIT) </w:t>
-      </w:r>
-      <w:r>
-        <w:rPr>
-          <w:rFonts w:ascii="Times New Roman" w:hAnsi="Times New Roman" w:cs="Times New Roman"/>
-          <w:sz w:val="22"/>
-          <w:szCs w:val="22"/>
-        </w:rPr>
-        <w:t xml:space="preserve">- </w:t>
-      </w:r>
-      <w:r>
-        <w:rPr>
-          <w:rFonts w:ascii="Times New Roman" w:hAnsi="Times New Roman" w:cs="Times New Roman"/>
-          <w:sz w:val="22"/>
-          <w:szCs w:val="22"/>
-        </w:rPr>
-        <w:t>Passed Fundamentals of Engineering (FE) exam</w:t>
-      </w:r>
-      <w:r>
-        <w:rPr>
-          <w:rFonts w:ascii="Times New Roman" w:hAnsi="Times New Roman" w:cs="Times New Roman"/>
-          <w:b/>
-          <w:bCs/>
-          <w:sz w:val="22"/>
-          <w:szCs w:val="22"/>
-        </w:rPr>
-        <w:t xml:space="preserve"> </w:t>
-      </w:r>
-      <w:r>
-        <w:rPr>
-          <w:rFonts w:ascii="Times New Roman" w:hAnsi="Times New Roman" w:cs="Times New Roman"/>
-          <w:sz w:val="22"/>
-          <w:szCs w:val="22"/>
-        </w:rPr>
-        <w:t xml:space="preserve">- </w:t>
-      </w:r>
-      <w:r>
-        <w:rPr>
-          <w:rFonts w:ascii="Times New Roman" w:hAnsi="Times New Roman" w:cs="Times New Roman"/>
-          <w:sz w:val="22"/>
-          <w:szCs w:val="22"/>
-        </w:rPr>
-        <w:t>MA</w:t>
-      </w:r>
-      <w:r>
-        <w:rPr>
-          <w:rFonts w:ascii="Times New Roman" w:hAnsi="Times New Roman" w:cs="Times New Roman"/>
-          <w:sz w:val="22"/>
-          <w:szCs w:val="22"/>
-        </w:rPr>
-        <w:t xml:space="preserve"> State Licensing Board</w:t>
       </w:r>
     </w:p>
     <w:p>
@@ -895,7 +1029,7 @@
         <w:tabs>
           <w:tab w:val="right" w:pos="10800"/>
         </w:tabs>
-        <w:spacing w:after="0"/>
+        <w:spacing w:after="0" w:line="240" w:lineRule="auto"/>
         <w:rPr>
           <w:rFonts w:ascii="Arial" w:hAnsi="Arial" w:cs="Arial"/>
           <w:b/>
@@ -911,7 +1045,7 @@
         <w:tabs>
           <w:tab w:val="right" w:pos="10800"/>
         </w:tabs>
-        <w:spacing w:after="0"/>
+        <w:spacing w:after="0" w:line="240" w:lineRule="auto"/>
         <w:rPr>
           <w:rFonts w:ascii="Arial" w:hAnsi="Arial" w:cs="Arial"/>
           <w:b/>
@@ -1053,7 +1187,7 @@
           <w:sz w:val="22"/>
           <w:szCs w:val="22"/>
         </w:rPr>
-        <w:t xml:space="preserve">Varsity Tutors </w:t>
+        <w:t xml:space="preserve">Data Engineer Academy </w:t>
       </w:r>
       <w:r>
         <w:rPr>
@@ -1094,7 +1228,15 @@
           <w:sz w:val="22"/>
           <w:szCs w:val="22"/>
         </w:rPr>
-        <w:t>Mechanical Engineering Tutor</w:t>
+        <w:t>Data Engineer Apprentice</w:t>
+      </w:r>
+      <w:r>
+        <w:rPr>
+          <w:rFonts w:ascii="Times New Roman" w:hAnsi="Times New Roman" w:cs="Times New Roman"/>
+          <w:sz w:val="22"/>
+          <w:szCs w:val="22"/>
+        </w:rPr>
+        <w:t xml:space="preserve"> </w:t>
       </w:r>
       <w:r>
         <w:rPr>
@@ -1103,7 +1245,23 @@
           <w:szCs w:val="22"/>
         </w:rPr>
         <w:tab/>
-        <w:t>Sep 2024 - Current</w:t>
+        <w:t>June 202</w:t>
+      </w:r>
+      <w:r>
+        <w:rPr>
+          <w:rFonts w:ascii="Times New Roman" w:hAnsi="Times New Roman" w:cs="Times New Roman"/>
+          <w:sz w:val="22"/>
+          <w:szCs w:val="22"/>
+        </w:rPr>
+        <w:t>5</w:t>
+      </w:r>
+      <w:r>
+        <w:rPr>
+          <w:rFonts w:ascii="Times New Roman" w:hAnsi="Times New Roman" w:cs="Times New Roman"/>
+          <w:sz w:val="22"/>
+          <w:szCs w:val="22"/>
+        </w:rPr>
+        <w:t xml:space="preserve"> - Current</w:t>
       </w:r>
     </w:p>
     <w:p>
@@ -1111,7 +1269,7 @@
         <w:pStyle w:val="ListParagraph"/>
         <w:numPr>
           <w:ilvl w:val="0"/>
-          <w:numId w:val="48"/>
+          <w:numId w:val="50"/>
         </w:numPr>
         <w:tabs>
           <w:tab w:val="right" w:pos="10800"/>
@@ -1129,31 +1287,47 @@
           <w:sz w:val="22"/>
           <w:szCs w:val="22"/>
         </w:rPr>
-        <w:t>Mentor</w:t>
-      </w:r>
-      <w:r>
-        <w:rPr>
-          <w:rFonts w:ascii="Times New Roman" w:hAnsi="Times New Roman" w:cs="Times New Roman"/>
-          <w:sz w:val="22"/>
-          <w:szCs w:val="22"/>
-        </w:rPr>
-        <w:t>ed hundreds of</w:t>
-      </w:r>
-      <w:r>
-        <w:rPr>
-          <w:rFonts w:ascii="Times New Roman" w:hAnsi="Times New Roman" w:cs="Times New Roman"/>
-          <w:sz w:val="22"/>
-          <w:szCs w:val="22"/>
-        </w:rPr>
-        <w:t xml:space="preserve"> students in </w:t>
-      </w:r>
-      <w:r>
-        <w:rPr>
-          <w:rFonts w:ascii="Times New Roman" w:hAnsi="Times New Roman" w:cs="Times New Roman"/>
-          <w:sz w:val="22"/>
-          <w:szCs w:val="22"/>
-        </w:rPr>
-        <w:t>Mechanics of Materials, Thermodynamics</w:t>
+        <w:t xml:space="preserve">Built a data </w:t>
+      </w:r>
+      <w:r>
+        <w:rPr>
+          <w:rFonts w:ascii="Times New Roman" w:hAnsi="Times New Roman" w:cs="Times New Roman"/>
+          <w:sz w:val="22"/>
+          <w:szCs w:val="22"/>
+        </w:rPr>
+        <w:t>analytics</w:t>
+      </w:r>
+      <w:r>
+        <w:rPr>
+          <w:rFonts w:ascii="Times New Roman" w:hAnsi="Times New Roman" w:cs="Times New Roman"/>
+          <w:sz w:val="22"/>
+          <w:szCs w:val="22"/>
+        </w:rPr>
+        <w:t xml:space="preserve"> pipeline from </w:t>
+      </w:r>
+      <w:r>
+        <w:rPr>
+          <w:rFonts w:ascii="Times New Roman" w:hAnsi="Times New Roman" w:cs="Times New Roman"/>
+          <w:sz w:val="22"/>
+          <w:szCs w:val="22"/>
+        </w:rPr>
+        <w:t>raw</w:t>
+      </w:r>
+      <w:r>
+        <w:rPr>
+          <w:rFonts w:ascii="Times New Roman" w:hAnsi="Times New Roman" w:cs="Times New Roman"/>
+          <w:sz w:val="22"/>
+          <w:szCs w:val="22"/>
+        </w:rPr>
+        <w:t xml:space="preserve"> healthcare CSV </w:t>
+      </w:r>
+      <w:r>
+        <w:rPr>
+          <w:rFonts w:ascii="Times New Roman" w:hAnsi="Times New Roman" w:cs="Times New Roman"/>
+          <w:sz w:val="22"/>
+          <w:szCs w:val="22"/>
+        </w:rPr>
+        <w:t>datasets</w:t>
       </w:r>
       <w:r>
         <w:rPr>
@@ -1169,31 +1343,7 @@
           <w:sz w:val="22"/>
           <w:szCs w:val="22"/>
         </w:rPr>
-        <w:t>Heat Transfer</w:t>
-      </w:r>
-      <w:r>
-        <w:rPr>
-          <w:rFonts w:ascii="Times New Roman" w:hAnsi="Times New Roman" w:cs="Times New Roman"/>
-          <w:sz w:val="22"/>
-          <w:szCs w:val="22"/>
-        </w:rPr>
-        <w:t>, Fluid Mechanics</w:t>
-      </w:r>
-      <w:r>
-        <w:rPr>
-          <w:rFonts w:ascii="Times New Roman" w:hAnsi="Times New Roman" w:cs="Times New Roman"/>
-          <w:sz w:val="22"/>
-          <w:szCs w:val="22"/>
-        </w:rPr>
-        <w:t xml:space="preserve"> </w:t>
-      </w:r>
-      <w:r>
-        <w:rPr>
-          <w:rFonts w:ascii="Times New Roman" w:hAnsi="Times New Roman" w:cs="Times New Roman"/>
-          <w:sz w:val="22"/>
-          <w:szCs w:val="22"/>
-        </w:rPr>
-        <w:t>and Design of Components</w:t>
+        <w:t>computing key operational metrics and delivering insights through an interactive dashboard using Python</w:t>
       </w:r>
     </w:p>
     <w:p>
@@ -1204,31 +1354,59 @@
         <w:spacing w:after="0" w:line="240" w:lineRule="auto"/>
         <w:rPr>
           <w:rFonts w:ascii="Times New Roman" w:hAnsi="Times New Roman" w:cs="Times New Roman"/>
-          <w:sz w:val="22"/>
-          <w:szCs w:val="22"/>
-        </w:rPr>
-      </w:pPr>
-      <w:proofErr w:type="spellStart"/>
-      <w:r>
-        <w:rPr>
-          <w:rFonts w:ascii="Times New Roman" w:hAnsi="Times New Roman" w:cs="Times New Roman"/>
           <w:b/>
           <w:bCs/>
-          <w:sz w:val="22"/>
-          <w:szCs w:val="22"/>
-        </w:rPr>
-        <w:t>Gorus</w:t>
-      </w:r>
-      <w:proofErr w:type="spellEnd"/>
-      <w:r>
+          <w:sz w:val="6"/>
+          <w:szCs w:val="6"/>
+        </w:rPr>
+      </w:pPr>
+    </w:p>
+    <w:p>
+      <w:pPr>
+        <w:tabs>
+          <w:tab w:val="left" w:pos="2538"/>
+          <w:tab w:val="right" w:pos="10800"/>
+        </w:tabs>
+        <w:spacing w:after="0" w:line="240" w:lineRule="auto"/>
         <w:rPr>
           <w:rFonts w:ascii="Times New Roman" w:hAnsi="Times New Roman" w:cs="Times New Roman"/>
           <w:b/>
           <w:bCs/>
+          <w:sz w:val="6"/>
+          <w:szCs w:val="6"/>
+        </w:rPr>
+      </w:pPr>
+      <w:proofErr w:type="spellStart"/>
+      <w:r>
+        <w:rPr>
+          <w:rFonts w:ascii="Times New Roman" w:hAnsi="Times New Roman" w:cs="Times New Roman"/>
+          <w:b/>
+          <w:bCs/>
+          <w:sz w:val="22"/>
+          <w:szCs w:val="22"/>
+        </w:rPr>
+        <w:t>Gorus</w:t>
+      </w:r>
+      <w:proofErr w:type="spellEnd"/>
+      <w:r>
+        <w:rPr>
+          <w:rFonts w:ascii="Times New Roman" w:hAnsi="Times New Roman" w:cs="Times New Roman"/>
+          <w:b/>
+          <w:bCs/>
           <w:sz w:val="22"/>
           <w:szCs w:val="22"/>
         </w:rPr>
         <w:t xml:space="preserve"> Organic Farm </w:t>
+      </w:r>
+      <w:r>
+        <w:rPr>
+          <w:rFonts w:ascii="Times New Roman" w:hAnsi="Times New Roman" w:cs="Times New Roman"/>
+          <w:b/>
+          <w:bCs/>
+          <w:sz w:val="22"/>
+          <w:szCs w:val="22"/>
+        </w:rPr>
+        <w:tab/>
       </w:r>
       <w:r>
         <w:rPr>
@@ -1302,7 +1480,7 @@
         <w:pStyle w:val="ListParagraph"/>
         <w:numPr>
           <w:ilvl w:val="0"/>
-          <w:numId w:val="47"/>
+          <w:numId w:val="50"/>
         </w:numPr>
         <w:tabs>
           <w:tab w:val="right" w:pos="10800"/>
@@ -1310,27 +1488,17 @@
         <w:spacing w:after="0" w:line="240" w:lineRule="auto"/>
         <w:rPr>
           <w:rFonts w:ascii="Times New Roman" w:hAnsi="Times New Roman" w:cs="Times New Roman"/>
-          <w:b/>
-          <w:bCs/>
-          <w:sz w:val="22"/>
-          <w:szCs w:val="22"/>
-        </w:rPr>
-      </w:pPr>
-      <w:r>
-        <w:rPr>
-          <w:rFonts w:ascii="Times New Roman" w:hAnsi="Times New Roman" w:cs="Times New Roman"/>
-          <w:sz w:val="22"/>
-          <w:szCs w:val="22"/>
-        </w:rPr>
-        <w:t>Designed and fabricated a coffee roaster with a rotating drum and surrounding heating drum lined with electric resistance elements, creating an indirect radiant and convective heating system for roasting</w:t>
-      </w:r>
-      <w:r>
-        <w:rPr>
-          <w:rFonts w:ascii="Times New Roman" w:hAnsi="Times New Roman" w:cs="Times New Roman"/>
-          <w:sz w:val="22"/>
-          <w:szCs w:val="22"/>
-        </w:rPr>
-        <w:t xml:space="preserve"> </w:t>
+          <w:sz w:val="22"/>
+          <w:szCs w:val="22"/>
+        </w:rPr>
+      </w:pPr>
+      <w:r>
+        <w:rPr>
+          <w:rFonts w:ascii="Times New Roman" w:hAnsi="Times New Roman" w:cs="Times New Roman"/>
+          <w:sz w:val="22"/>
+          <w:szCs w:val="22"/>
+        </w:rPr>
+        <w:t>Designed and fabricated a rotating drum coffee roaster, integrating a motor-driven drum, shaft–bearing assembly, and electric heating system.</w:t>
       </w:r>
     </w:p>
     <w:p>
@@ -1338,7 +1506,7 @@
         <w:pStyle w:val="ListParagraph"/>
         <w:numPr>
           <w:ilvl w:val="0"/>
-          <w:numId w:val="47"/>
+          <w:numId w:val="50"/>
         </w:numPr>
         <w:tabs>
           <w:tab w:val="right" w:pos="10800"/>
@@ -1346,28 +1514,21 @@
         <w:spacing w:after="0" w:line="240" w:lineRule="auto"/>
         <w:rPr>
           <w:rFonts w:ascii="Times New Roman" w:hAnsi="Times New Roman" w:cs="Times New Roman"/>
-          <w:b/>
-          <w:bCs/>
-          <w:sz w:val="22"/>
-          <w:szCs w:val="22"/>
-        </w:rPr>
-      </w:pPr>
-      <w:r>
-        <w:rPr>
-          <w:rFonts w:ascii="Times New Roman" w:hAnsi="Times New Roman" w:cs="Times New Roman"/>
-          <w:sz w:val="22"/>
-          <w:szCs w:val="22"/>
-        </w:rPr>
-        <w:t>Performed structural analysis of the rotating assembly to size the shaft diameter and bearing supports.</w:t>
+          <w:sz w:val="22"/>
+          <w:szCs w:val="22"/>
+        </w:rPr>
+      </w:pPr>
+      <w:r>
+        <w:rPr>
+          <w:rFonts w:ascii="Times New Roman" w:hAnsi="Times New Roman" w:cs="Times New Roman"/>
+          <w:sz w:val="22"/>
+          <w:szCs w:val="22"/>
+        </w:rPr>
+        <w:t>Conducted load, stress, torque, and heat transfer calculations to right-size components, minimizing overdesign and reducing manufacturing cost while meeting roasting temperature and rotational performance requirements.</w:t>
       </w:r>
     </w:p>
     <w:p>
       <w:pPr>
-        <w:pStyle w:val="ListParagraph"/>
-        <w:numPr>
-          <w:ilvl w:val="0"/>
-          <w:numId w:val="47"/>
-        </w:numPr>
         <w:tabs>
           <w:tab w:val="right" w:pos="10800"/>
         </w:tabs>
@@ -1376,52 +1537,10 @@
           <w:rFonts w:ascii="Times New Roman" w:hAnsi="Times New Roman" w:cs="Times New Roman"/>
           <w:b/>
           <w:bCs/>
-          <w:sz w:val="22"/>
-          <w:szCs w:val="22"/>
-        </w:rPr>
-      </w:pPr>
-      <w:r>
-        <w:rPr>
-          <w:rFonts w:ascii="Times New Roman" w:hAnsi="Times New Roman" w:cs="Times New Roman"/>
-          <w:sz w:val="22"/>
-          <w:szCs w:val="22"/>
-        </w:rPr>
-        <w:t xml:space="preserve">Conducted heat transfer analysis </w:t>
-      </w:r>
-      <w:r>
-        <w:rPr>
-          <w:rFonts w:ascii="Times New Roman" w:hAnsi="Times New Roman" w:cs="Times New Roman"/>
-          <w:sz w:val="22"/>
-          <w:szCs w:val="22"/>
-        </w:rPr>
-        <w:t>to estimate heater power requirements to reach roasting temperature</w:t>
-      </w:r>
-      <w:r>
-        <w:rPr>
-          <w:rFonts w:ascii="Times New Roman" w:hAnsi="Times New Roman" w:cs="Times New Roman"/>
-          <w:sz w:val="22"/>
-          <w:szCs w:val="22"/>
-        </w:rPr>
-        <w:t xml:space="preserve"> of </w:t>
-      </w:r>
-      <w:r>
-        <w:rPr>
-          <w:rFonts w:ascii="Times New Roman" w:hAnsi="Times New Roman" w:cs="Times New Roman"/>
-          <w:sz w:val="22"/>
-          <w:szCs w:val="22"/>
-        </w:rPr>
-        <w:t>230</w:t>
-      </w:r>
-      <m:oMath>
-        <m:r>
-          <w:rPr>
-            <w:rFonts w:ascii="Cambria Math" w:hAnsi="Cambria Math" w:cs="Times New Roman"/>
-            <w:sz w:val="22"/>
-            <w:szCs w:val="22"/>
-          </w:rPr>
-          <m:t>°C</m:t>
-        </m:r>
-      </m:oMath>
+          <w:sz w:val="6"/>
+          <w:szCs w:val="6"/>
+        </w:rPr>
+      </w:pPr>
     </w:p>
     <w:p>
       <w:pPr>
@@ -1458,14 +1577,6 @@
       <w:r>
         <w:rPr>
           <w:rFonts w:ascii="Times New Roman" w:hAnsi="Times New Roman" w:cs="Times New Roman"/>
-          <w:sz w:val="22"/>
-          <w:szCs w:val="22"/>
-        </w:rPr>
-        <w:t>- Green Steel Startup</w:t>
-      </w:r>
-      <w:r>
-        <w:rPr>
-          <w:rFonts w:ascii="Times New Roman" w:hAnsi="Times New Roman" w:cs="Times New Roman"/>
           <w:b/>
           <w:bCs/>
           <w:sz w:val="22"/>
@@ -1532,7 +1643,23 @@
           <w:sz w:val="22"/>
           <w:szCs w:val="22"/>
         </w:rPr>
-        <w:t>(Rotating Shifts)</w:t>
+        <w:t>(</w:t>
+      </w:r>
+      <w:r>
+        <w:rPr>
+          <w:rFonts w:ascii="Times New Roman" w:hAnsi="Times New Roman" w:cs="Times New Roman"/>
+          <w:sz w:val="22"/>
+          <w:szCs w:val="22"/>
+        </w:rPr>
+        <w:t>Full-time</w:t>
+      </w:r>
+      <w:r>
+        <w:rPr>
+          <w:rFonts w:ascii="Times New Roman" w:hAnsi="Times New Roman" w:cs="Times New Roman"/>
+          <w:sz w:val="22"/>
+          <w:szCs w:val="22"/>
+        </w:rPr>
+        <w:t>)</w:t>
       </w:r>
       <w:r>
         <w:rPr>
@@ -1598,42 +1725,16 @@
           <w:sz w:val="22"/>
           <w:szCs w:val="22"/>
         </w:rPr>
-        <w:t>Directed field operations</w:t>
-      </w:r>
-      <w:r>
-        <w:rPr>
-          <w:rFonts w:ascii="Times New Roman" w:hAnsi="Times New Roman" w:cs="Times New Roman"/>
-          <w:sz w:val="22"/>
-          <w:szCs w:val="22"/>
-        </w:rPr>
-        <w:t xml:space="preserve"> </w:t>
-      </w:r>
-      <w:r>
-        <w:rPr>
-          <w:rFonts w:ascii="Times New Roman" w:hAnsi="Times New Roman" w:cs="Times New Roman"/>
-          <w:sz w:val="22"/>
-          <w:szCs w:val="22"/>
-        </w:rPr>
-        <w:t>for pilot-scale</w:t>
-      </w:r>
-      <w:r>
-        <w:rPr>
-          <w:rFonts w:ascii="Times New Roman" w:hAnsi="Times New Roman" w:cs="Times New Roman"/>
-          <w:sz w:val="22"/>
-          <w:szCs w:val="22"/>
-        </w:rPr>
-        <w:t xml:space="preserve"> Molten Oxide Electrolysis (MOE) systems at 1600</w:t>
-      </w:r>
-      <m:oMath>
-        <m:r>
-          <w:rPr>
-            <w:rFonts w:ascii="Cambria Math" w:hAnsi="Cambria Math" w:cs="Times New Roman"/>
-            <w:sz w:val="22"/>
-            <w:szCs w:val="22"/>
-          </w:rPr>
-          <m:t>℃</m:t>
-        </m:r>
-      </m:oMath>
+        <w:t>Sustained 24/7 pilot-scale Molten Oxide Electrolysis (MOE) operations at 1600 °C, generating operational data critical for validating a first-of-its-kind clean iron production process</w:t>
+      </w:r>
+      <w:r>
+        <w:rPr>
+          <w:rFonts w:ascii="Times New Roman" w:hAnsi="Times New Roman" w:cs="Times New Roman"/>
+          <w:sz w:val="22"/>
+          <w:szCs w:val="22"/>
+        </w:rPr>
+        <w:t>.</w:t>
+      </w:r>
     </w:p>
     <w:p>
       <w:pPr>
@@ -1654,11 +1755,11 @@
       </w:pPr>
       <w:r>
         <w:rPr>
-          <w:rFonts w:ascii="Times New Roman" w:eastAsiaTheme="minorEastAsia" w:hAnsi="Times New Roman" w:cs="Times New Roman"/>
-          <w:sz w:val="22"/>
-          <w:szCs w:val="22"/>
-        </w:rPr>
-        <w:t>Monitored voltage stability and thermal trends to detect early degradation</w:t>
+          <w:rFonts w:ascii="Times New Roman" w:hAnsi="Times New Roman" w:cs="Times New Roman"/>
+          <w:sz w:val="22"/>
+          <w:szCs w:val="22"/>
+        </w:rPr>
+        <w:t>Executed lab-scale DOE campaigns to evaluate alloy effects on MOE performance, generating experimental data to support inert anode material development.</w:t>
       </w:r>
     </w:p>
     <w:p>
@@ -1684,34 +1785,31 @@
           <w:sz w:val="22"/>
           <w:szCs w:val="22"/>
         </w:rPr>
-        <w:t xml:space="preserve">Executed lab-scale DOE campaigns to evaluate alloy effects on MOE performance </w:t>
+        <w:t>Analyzed XRF and LECO data to quantify iron purity and electrolyte composition, informing process adjustments to maintain product quality during pilot-scale runs</w:t>
+      </w:r>
+      <w:r>
+        <w:rPr>
+          <w:rFonts w:ascii="Times New Roman" w:hAnsi="Times New Roman" w:cs="Times New Roman"/>
+          <w:sz w:val="22"/>
+          <w:szCs w:val="22"/>
+        </w:rPr>
+        <w:t>.</w:t>
       </w:r>
     </w:p>
     <w:p>
       <w:pPr>
-        <w:pStyle w:val="ListParagraph"/>
-        <w:numPr>
-          <w:ilvl w:val="0"/>
-          <w:numId w:val="45"/>
-        </w:numPr>
         <w:tabs>
           <w:tab w:val="right" w:pos="10800"/>
         </w:tabs>
         <w:spacing w:after="0" w:line="240" w:lineRule="auto"/>
         <w:rPr>
           <w:rFonts w:ascii="Times New Roman" w:hAnsi="Times New Roman" w:cs="Times New Roman"/>
-          <w:sz w:val="22"/>
-          <w:szCs w:val="22"/>
-        </w:rPr>
-      </w:pPr>
-      <w:r>
-        <w:rPr>
-          <w:rFonts w:ascii="Times New Roman" w:hAnsi="Times New Roman" w:cs="Times New Roman"/>
-          <w:sz w:val="22"/>
-          <w:szCs w:val="22"/>
-        </w:rPr>
-        <w:t>Analyzed XRF and LECO data to quantify iron purity and electrolyte composition</w:t>
-      </w:r>
+          <w:b/>
+          <w:bCs/>
+          <w:sz w:val="6"/>
+          <w:szCs w:val="6"/>
+        </w:rPr>
+      </w:pPr>
     </w:p>
     <w:p>
       <w:pPr>
@@ -1746,14 +1844,6 @@
           <w:szCs w:val="22"/>
         </w:rPr>
         <w:t xml:space="preserve"> Medical Imaging</w:t>
-      </w:r>
-      <w:r>
-        <w:rPr>
-          <w:rFonts w:ascii="Times New Roman" w:hAnsi="Times New Roman" w:cs="Times New Roman"/>
-          <w:sz w:val="22"/>
-          <w:szCs w:val="22"/>
-        </w:rPr>
-        <w:t xml:space="preserve"> - Radiopharmaceutical Manufacturing</w:t>
       </w:r>
       <w:r>
         <w:rPr>
@@ -1828,49 +1918,99 @@
         <w:spacing w:after="0" w:line="240" w:lineRule="auto"/>
         <w:rPr>
           <w:rFonts w:ascii="Times New Roman" w:hAnsi="Times New Roman" w:cs="Times New Roman"/>
-          <w:sz w:val="22"/>
-          <w:szCs w:val="22"/>
-        </w:rPr>
-      </w:pPr>
-      <w:r>
-        <w:rPr>
-          <w:rFonts w:ascii="Times New Roman" w:hAnsi="Times New Roman" w:cs="Times New Roman"/>
-          <w:sz w:val="22"/>
-          <w:szCs w:val="22"/>
-        </w:rPr>
-        <w:t xml:space="preserve">Designed an innovative fixture </w:t>
-      </w:r>
-      <w:r>
-        <w:rPr>
-          <w:rFonts w:ascii="Times New Roman" w:hAnsi="Times New Roman" w:cs="Times New Roman"/>
-          <w:sz w:val="22"/>
-          <w:szCs w:val="22"/>
-        </w:rPr>
-        <w:t>using</w:t>
-      </w:r>
-      <w:r>
-        <w:rPr>
-          <w:rFonts w:ascii="Times New Roman" w:hAnsi="Times New Roman" w:cs="Times New Roman"/>
-          <w:sz w:val="22"/>
-          <w:szCs w:val="22"/>
-        </w:rPr>
-        <w:t xml:space="preserve"> SolidWorks</w:t>
-      </w:r>
-      <w:r>
-        <w:rPr>
-          <w:rFonts w:ascii="Times New Roman" w:hAnsi="Times New Roman" w:cs="Times New Roman"/>
-          <w:sz w:val="22"/>
-          <w:szCs w:val="22"/>
-        </w:rPr>
-        <w:t xml:space="preserve"> to resolve an employee safety risk on manufacturing floor</w:t>
-      </w:r>
-      <w:r>
-        <w:rPr>
-          <w:rFonts w:ascii="Times New Roman" w:hAnsi="Times New Roman" w:cs="Times New Roman"/>
-          <w:sz w:val="22"/>
-          <w:szCs w:val="22"/>
-        </w:rPr>
-        <w:t>.</w:t>
+          <w:b/>
+          <w:bCs/>
+          <w:sz w:val="22"/>
+          <w:szCs w:val="22"/>
+        </w:rPr>
+      </w:pPr>
+      <w:r>
+        <w:rPr>
+          <w:rFonts w:ascii="Times New Roman" w:hAnsi="Times New Roman" w:cs="Times New Roman"/>
+          <w:sz w:val="22"/>
+          <w:szCs w:val="22"/>
+        </w:rPr>
+        <w:t>De</w:t>
+      </w:r>
+      <w:r>
+        <w:rPr>
+          <w:rFonts w:ascii="Times New Roman" w:hAnsi="Times New Roman" w:cs="Times New Roman"/>
+          <w:sz w:val="22"/>
+          <w:szCs w:val="22"/>
+        </w:rPr>
+        <w:t>veloped</w:t>
+      </w:r>
+      <w:r>
+        <w:rPr>
+          <w:rFonts w:ascii="Times New Roman" w:hAnsi="Times New Roman" w:cs="Times New Roman"/>
+          <w:sz w:val="22"/>
+          <w:szCs w:val="22"/>
+        </w:rPr>
+        <w:t xml:space="preserve"> and implemented</w:t>
+      </w:r>
+      <w:r>
+        <w:rPr>
+          <w:rFonts w:ascii="Times New Roman" w:hAnsi="Times New Roman" w:cs="Times New Roman"/>
+          <w:sz w:val="22"/>
+          <w:szCs w:val="22"/>
+        </w:rPr>
+        <w:t xml:space="preserve"> a Form-Fit-Function</w:t>
+      </w:r>
+      <w:r>
+        <w:rPr>
+          <w:rFonts w:ascii="Times New Roman" w:hAnsi="Times New Roman" w:cs="Times New Roman"/>
+          <w:sz w:val="22"/>
+          <w:szCs w:val="22"/>
+        </w:rPr>
+        <w:t xml:space="preserve"> </w:t>
+      </w:r>
+      <w:r>
+        <w:rPr>
+          <w:rFonts w:ascii="Times New Roman" w:hAnsi="Times New Roman" w:cs="Times New Roman"/>
+          <w:sz w:val="22"/>
+          <w:szCs w:val="22"/>
+        </w:rPr>
+        <w:t xml:space="preserve">(FFF) </w:t>
+      </w:r>
+      <w:r>
+        <w:rPr>
+          <w:rFonts w:ascii="Times New Roman" w:hAnsi="Times New Roman" w:cs="Times New Roman"/>
+          <w:sz w:val="22"/>
+          <w:szCs w:val="22"/>
+        </w:rPr>
+        <w:t>a</w:t>
+      </w:r>
+      <w:r>
+        <w:rPr>
+          <w:rFonts w:ascii="Times New Roman" w:hAnsi="Times New Roman" w:cs="Times New Roman"/>
+          <w:sz w:val="22"/>
+          <w:szCs w:val="22"/>
+        </w:rPr>
+        <w:t xml:space="preserve">nalysis </w:t>
+      </w:r>
+      <w:r>
+        <w:rPr>
+          <w:rFonts w:ascii="Times New Roman" w:hAnsi="Times New Roman" w:cs="Times New Roman"/>
+          <w:sz w:val="22"/>
+          <w:szCs w:val="22"/>
+        </w:rPr>
+        <w:t>template</w:t>
+      </w:r>
+      <w:r>
+        <w:rPr>
+          <w:rFonts w:ascii="Times New Roman" w:hAnsi="Times New Roman" w:cs="Times New Roman"/>
+          <w:sz w:val="22"/>
+          <w:szCs w:val="22"/>
+        </w:rPr>
+        <w:t xml:space="preserve"> to </w:t>
+      </w:r>
+      <w:r>
+        <w:rPr>
+          <w:rFonts w:ascii="Times New Roman" w:hAnsi="Times New Roman" w:cs="Times New Roman"/>
+          <w:sz w:val="22"/>
+          <w:szCs w:val="22"/>
+        </w:rPr>
+        <w:t xml:space="preserve">evaluate functionally equivalent part substitutions, reducing replacement approval time from 1 week to 1 day. </w:t>
       </w:r>
     </w:p>
     <w:p>
@@ -1886,163 +2026,17 @@
         <w:spacing w:after="0" w:line="240" w:lineRule="auto"/>
         <w:rPr>
           <w:rFonts w:ascii="Times New Roman" w:hAnsi="Times New Roman" w:cs="Times New Roman"/>
-          <w:b/>
-          <w:bCs/>
-          <w:sz w:val="22"/>
-          <w:szCs w:val="22"/>
-        </w:rPr>
-      </w:pPr>
-      <w:r>
-        <w:rPr>
-          <w:rFonts w:ascii="Times New Roman" w:hAnsi="Times New Roman" w:cs="Times New Roman"/>
-          <w:sz w:val="22"/>
-          <w:szCs w:val="22"/>
-        </w:rPr>
-        <w:t>Designed and i</w:t>
-      </w:r>
-      <w:r>
-        <w:rPr>
-          <w:rFonts w:ascii="Times New Roman" w:hAnsi="Times New Roman" w:cs="Times New Roman"/>
-          <w:sz w:val="22"/>
-          <w:szCs w:val="22"/>
-        </w:rPr>
-        <w:t>mplemented</w:t>
-      </w:r>
-      <w:r>
-        <w:rPr>
-          <w:rFonts w:ascii="Times New Roman" w:hAnsi="Times New Roman" w:cs="Times New Roman"/>
-          <w:sz w:val="22"/>
-          <w:szCs w:val="22"/>
-        </w:rPr>
-        <w:t xml:space="preserve"> a Form-Fit-Function</w:t>
-      </w:r>
-      <w:r>
-        <w:rPr>
-          <w:rFonts w:ascii="Times New Roman" w:hAnsi="Times New Roman" w:cs="Times New Roman"/>
-          <w:sz w:val="22"/>
-          <w:szCs w:val="22"/>
-        </w:rPr>
-        <w:t xml:space="preserve"> </w:t>
-      </w:r>
-      <w:r>
-        <w:rPr>
-          <w:rFonts w:ascii="Times New Roman" w:hAnsi="Times New Roman" w:cs="Times New Roman"/>
-          <w:sz w:val="22"/>
-          <w:szCs w:val="22"/>
-        </w:rPr>
-        <w:t>a</w:t>
-      </w:r>
-      <w:r>
-        <w:rPr>
-          <w:rFonts w:ascii="Times New Roman" w:hAnsi="Times New Roman" w:cs="Times New Roman"/>
-          <w:sz w:val="22"/>
-          <w:szCs w:val="22"/>
-        </w:rPr>
-        <w:t xml:space="preserve">nalysis </w:t>
-      </w:r>
-      <w:r>
-        <w:rPr>
-          <w:rFonts w:ascii="Times New Roman" w:hAnsi="Times New Roman" w:cs="Times New Roman"/>
-          <w:sz w:val="22"/>
-          <w:szCs w:val="22"/>
-        </w:rPr>
-        <w:t>f</w:t>
-      </w:r>
-      <w:r>
-        <w:rPr>
-          <w:rFonts w:ascii="Times New Roman" w:hAnsi="Times New Roman" w:cs="Times New Roman"/>
-          <w:sz w:val="22"/>
-          <w:szCs w:val="22"/>
-        </w:rPr>
-        <w:t xml:space="preserve">orm to </w:t>
-      </w:r>
-      <w:r>
-        <w:rPr>
-          <w:rFonts w:ascii="Times New Roman" w:hAnsi="Times New Roman" w:cs="Times New Roman"/>
-          <w:sz w:val="22"/>
-          <w:szCs w:val="22"/>
-        </w:rPr>
-        <w:t>increase efficiency of</w:t>
-      </w:r>
-      <w:r>
-        <w:rPr>
-          <w:rFonts w:ascii="Times New Roman" w:hAnsi="Times New Roman" w:cs="Times New Roman"/>
-          <w:sz w:val="22"/>
-          <w:szCs w:val="22"/>
-        </w:rPr>
-        <w:t xml:space="preserve"> </w:t>
-      </w:r>
-      <w:r>
-        <w:rPr>
-          <w:rFonts w:ascii="Times New Roman" w:hAnsi="Times New Roman" w:cs="Times New Roman"/>
-          <w:sz w:val="22"/>
-          <w:szCs w:val="22"/>
-        </w:rPr>
-        <w:t>functionally equivalent</w:t>
-      </w:r>
-      <w:r>
-        <w:rPr>
-          <w:rFonts w:ascii="Times New Roman" w:hAnsi="Times New Roman" w:cs="Times New Roman"/>
-          <w:sz w:val="22"/>
-          <w:szCs w:val="22"/>
-        </w:rPr>
-        <w:t xml:space="preserve"> part replacements by </w:t>
-      </w:r>
-      <w:r>
-        <w:rPr>
-          <w:rFonts w:ascii="Times New Roman" w:hAnsi="Times New Roman" w:cs="Times New Roman"/>
-          <w:sz w:val="22"/>
-          <w:szCs w:val="22"/>
-        </w:rPr>
-        <w:t xml:space="preserve">95% </w:t>
-      </w:r>
-      <w:r>
-        <w:rPr>
-          <w:rFonts w:ascii="Times New Roman" w:hAnsi="Times New Roman" w:cs="Times New Roman"/>
-          <w:sz w:val="22"/>
-          <w:szCs w:val="22"/>
-        </w:rPr>
-        <w:t xml:space="preserve">- </w:t>
-      </w:r>
-      <w:r>
-        <w:rPr>
-          <w:rFonts w:ascii="Times New Roman" w:hAnsi="Times New Roman" w:cs="Times New Roman"/>
-          <w:sz w:val="22"/>
-          <w:szCs w:val="22"/>
-        </w:rPr>
-        <w:t xml:space="preserve">cutting </w:t>
-      </w:r>
-      <w:r>
-        <w:rPr>
-          <w:rFonts w:ascii="Times New Roman" w:hAnsi="Times New Roman" w:cs="Times New Roman"/>
-          <w:sz w:val="22"/>
-          <w:szCs w:val="22"/>
-        </w:rPr>
-        <w:t xml:space="preserve">Change Control </w:t>
-      </w:r>
-      <w:r>
-        <w:rPr>
-          <w:rFonts w:ascii="Times New Roman" w:hAnsi="Times New Roman" w:cs="Times New Roman"/>
-          <w:sz w:val="22"/>
-          <w:szCs w:val="22"/>
-        </w:rPr>
-        <w:t xml:space="preserve">time from </w:t>
-      </w:r>
-      <w:r>
-        <w:rPr>
-          <w:rFonts w:ascii="Times New Roman" w:hAnsi="Times New Roman" w:cs="Times New Roman"/>
-          <w:sz w:val="22"/>
-          <w:szCs w:val="22"/>
-        </w:rPr>
-        <w:t>1 week to 1 day</w:t>
-      </w:r>
-      <w:r>
-        <w:rPr>
-          <w:rFonts w:ascii="Times New Roman" w:hAnsi="Times New Roman" w:cs="Times New Roman"/>
-          <w:sz w:val="22"/>
-          <w:szCs w:val="22"/>
-        </w:rPr>
-        <w:t>.</w:t>
+          <w:sz w:val="22"/>
+          <w:szCs w:val="22"/>
+        </w:rPr>
+      </w:pPr>
+      <w:r>
+        <w:rPr>
+          <w:rFonts w:ascii="Times New Roman" w:hAnsi="Times New Roman" w:cs="Times New Roman"/>
+          <w:sz w:val="22"/>
+          <w:szCs w:val="22"/>
+        </w:rPr>
+        <w:t xml:space="preserve">Redesigned a vendor documentation repository (500+ files), implementing standardized folder hierarchy and naming conventions, reducing file retrieval time by 90%. </w:t>
       </w:r>
     </w:p>
     <w:p>
@@ -2068,87 +2062,7 @@
           <w:sz w:val="22"/>
           <w:szCs w:val="22"/>
         </w:rPr>
-        <w:t xml:space="preserve">Redesigned a </w:t>
-      </w:r>
-      <w:r>
-        <w:rPr>
-          <w:rFonts w:ascii="Times New Roman" w:hAnsi="Times New Roman" w:cs="Times New Roman"/>
-          <w:sz w:val="22"/>
-          <w:szCs w:val="22"/>
-        </w:rPr>
-        <w:t>documentation</w:t>
-      </w:r>
-      <w:r>
-        <w:rPr>
-          <w:rFonts w:ascii="Times New Roman" w:hAnsi="Times New Roman" w:cs="Times New Roman"/>
-          <w:sz w:val="22"/>
-          <w:szCs w:val="22"/>
-        </w:rPr>
-        <w:t xml:space="preserve"> </w:t>
-      </w:r>
-      <w:r>
-        <w:rPr>
-          <w:rFonts w:ascii="Times New Roman" w:hAnsi="Times New Roman" w:cs="Times New Roman"/>
-          <w:sz w:val="22"/>
-          <w:szCs w:val="22"/>
-        </w:rPr>
-        <w:t xml:space="preserve">management system </w:t>
-      </w:r>
-      <w:r>
-        <w:rPr>
-          <w:rFonts w:ascii="Times New Roman" w:hAnsi="Times New Roman" w:cs="Times New Roman"/>
-          <w:sz w:val="22"/>
-          <w:szCs w:val="22"/>
-        </w:rPr>
-        <w:t>reduc</w:t>
-      </w:r>
-      <w:r>
-        <w:rPr>
-          <w:rFonts w:ascii="Times New Roman" w:hAnsi="Times New Roman" w:cs="Times New Roman"/>
-          <w:sz w:val="22"/>
-          <w:szCs w:val="22"/>
-        </w:rPr>
-        <w:t>ing</w:t>
-      </w:r>
-      <w:r>
-        <w:rPr>
-          <w:rFonts w:ascii="Times New Roman" w:hAnsi="Times New Roman" w:cs="Times New Roman"/>
-          <w:sz w:val="22"/>
-          <w:szCs w:val="22"/>
-        </w:rPr>
-        <w:t xml:space="preserve"> </w:t>
-      </w:r>
-      <w:r>
-        <w:rPr>
-          <w:rFonts w:ascii="Times New Roman" w:hAnsi="Times New Roman" w:cs="Times New Roman"/>
-          <w:sz w:val="22"/>
-          <w:szCs w:val="22"/>
-        </w:rPr>
-        <w:t xml:space="preserve">file </w:t>
-      </w:r>
-      <w:r>
-        <w:rPr>
-          <w:rFonts w:ascii="Times New Roman" w:hAnsi="Times New Roman" w:cs="Times New Roman"/>
-          <w:sz w:val="22"/>
-          <w:szCs w:val="22"/>
-        </w:rPr>
-        <w:t>search</w:t>
-      </w:r>
-      <w:r>
-        <w:rPr>
-          <w:rFonts w:ascii="Times New Roman" w:hAnsi="Times New Roman" w:cs="Times New Roman"/>
-          <w:sz w:val="22"/>
-          <w:szCs w:val="22"/>
-        </w:rPr>
-        <w:t xml:space="preserve"> time by 90%</w:t>
-      </w:r>
-      <w:r>
-        <w:rPr>
-          <w:rFonts w:ascii="Times New Roman" w:hAnsi="Times New Roman" w:cs="Times New Roman"/>
-          <w:sz w:val="22"/>
-          <w:szCs w:val="22"/>
-        </w:rPr>
-        <w:t>.</w:t>
+        <w:t xml:space="preserve">Implemented a fixture for a wash station that secured the flush collection container to the outlet, eliminating manual support and reducing ergonomic and high-temperature exposure risk during sampling. </w:t>
       </w:r>
     </w:p>
     <w:p>
@@ -2174,15 +2088,7 @@
           <w:sz w:val="22"/>
           <w:szCs w:val="22"/>
         </w:rPr>
-        <w:t>Developed technical specifications for an Uninterruptable Power Supply (UPS)</w:t>
-      </w:r>
-      <w:r>
-        <w:rPr>
-          <w:rFonts w:ascii="Times New Roman" w:hAnsi="Times New Roman" w:cs="Times New Roman"/>
-          <w:sz w:val="22"/>
-          <w:szCs w:val="22"/>
-        </w:rPr>
-        <w:t xml:space="preserve"> to backup critical equipment.</w:t>
+        <w:t xml:space="preserve">Conducted electrical load analysis to develop technical specifications for a UPS backup system supporting a radiopharmaceutical production line. </w:t>
       </w:r>
     </w:p>
     <w:p>
@@ -2193,63 +2099,48 @@
         <w:spacing w:after="0" w:line="240" w:lineRule="auto"/>
         <w:rPr>
           <w:rFonts w:ascii="Times New Roman" w:hAnsi="Times New Roman" w:cs="Times New Roman"/>
-          <w:sz w:val="22"/>
-          <w:szCs w:val="22"/>
-        </w:rPr>
-      </w:pPr>
-      <w:r>
-        <w:rPr>
-          <w:rFonts w:ascii="Times New Roman" w:hAnsi="Times New Roman" w:cs="Times New Roman"/>
           <w:b/>
           <w:bCs/>
-          <w:sz w:val="22"/>
-          <w:szCs w:val="22"/>
-        </w:rPr>
-        <w:t>Mauser</w:t>
-      </w:r>
-      <w:r>
-        <w:rPr>
-          <w:rFonts w:ascii="Times New Roman" w:hAnsi="Times New Roman" w:cs="Times New Roman"/>
+          <w:sz w:val="6"/>
+          <w:szCs w:val="6"/>
+        </w:rPr>
+      </w:pPr>
+    </w:p>
+    <w:p>
+      <w:pPr>
+        <w:tabs>
+          <w:tab w:val="right" w:pos="9000"/>
+        </w:tabs>
+        <w:spacing w:after="0" w:line="240" w:lineRule="auto"/>
+        <w:rPr>
+          <w:rFonts w:ascii="Arial" w:hAnsi="Arial" w:cs="Arial"/>
           <w:b/>
           <w:bCs/>
-          <w:sz w:val="22"/>
-          <w:szCs w:val="22"/>
-        </w:rPr>
-        <w:t xml:space="preserve"> Packaging Solutions</w:t>
-      </w:r>
-      <w:r>
-        <w:rPr>
-          <w:rFonts w:ascii="Times New Roman" w:hAnsi="Times New Roman" w:cs="Times New Roman"/>
+          <w:color w:val="4C94D8" w:themeColor="text2" w:themeTint="80"/>
+          <w:sz w:val="6"/>
+          <w:szCs w:val="6"/>
+        </w:rPr>
+      </w:pPr>
+    </w:p>
+    <w:p>
+      <w:pPr>
+        <w:tabs>
+          <w:tab w:val="right" w:pos="9000"/>
+        </w:tabs>
+        <w:spacing w:after="0" w:line="240" w:lineRule="auto"/>
+        <w:rPr>
+          <w:rFonts w:ascii="Times New Roman" w:hAnsi="Times New Roman" w:cs="Times New Roman"/>
+          <w:color w:val="4C94D8" w:themeColor="text2" w:themeTint="80"/>
+        </w:rPr>
+      </w:pPr>
+      <w:r>
+        <w:rPr>
+          <w:rFonts w:ascii="Arial" w:hAnsi="Arial" w:cs="Arial"/>
           <w:b/>
           <w:bCs/>
-          <w:sz w:val="22"/>
-          <w:szCs w:val="22"/>
-        </w:rPr>
-        <w:tab/>
-      </w:r>
-      <w:r>
-        <w:rPr>
-          <w:rFonts w:ascii="Times New Roman" w:hAnsi="Times New Roman" w:cs="Times New Roman"/>
-          <w:sz w:val="22"/>
-          <w:szCs w:val="22"/>
-        </w:rPr>
-        <w:t>Chicago</w:t>
-      </w:r>
-      <w:r>
-        <w:rPr>
-          <w:rFonts w:ascii="Times New Roman" w:hAnsi="Times New Roman" w:cs="Times New Roman"/>
-          <w:sz w:val="22"/>
-          <w:szCs w:val="22"/>
-        </w:rPr>
-        <w:t xml:space="preserve">, </w:t>
-      </w:r>
-      <w:r>
-        <w:rPr>
-          <w:rFonts w:ascii="Times New Roman" w:hAnsi="Times New Roman" w:cs="Times New Roman"/>
-          <w:sz w:val="22"/>
-          <w:szCs w:val="22"/>
-        </w:rPr>
-        <w:t>IL</w:t>
+          <w:color w:val="4C94D8" w:themeColor="text2" w:themeTint="80"/>
+        </w:rPr>
+        <w:t>Projects</w:t>
       </w:r>
     </w:p>
     <w:p>
@@ -2260,153 +2151,10 @@
         <w:spacing w:after="0" w:line="240" w:lineRule="auto"/>
         <w:rPr>
           <w:rFonts w:ascii="Times New Roman" w:hAnsi="Times New Roman" w:cs="Times New Roman"/>
-          <w:sz w:val="22"/>
-          <w:szCs w:val="22"/>
-        </w:rPr>
-      </w:pPr>
-      <w:r>
-        <w:rPr>
-          <w:rFonts w:ascii="Times New Roman" w:hAnsi="Times New Roman" w:cs="Times New Roman"/>
           <w:b/>
           <w:bCs/>
-          <w:sz w:val="22"/>
-          <w:szCs w:val="22"/>
-        </w:rPr>
-        <w:t>Quality Engineer Intern</w:t>
-      </w:r>
-      <w:r>
-        <w:rPr>
-          <w:rFonts w:ascii="Times New Roman" w:hAnsi="Times New Roman" w:cs="Times New Roman"/>
-          <w:b/>
-          <w:bCs/>
-          <w:sz w:val="22"/>
-          <w:szCs w:val="22"/>
-        </w:rPr>
-        <w:tab/>
-      </w:r>
-      <w:r>
-        <w:rPr>
-          <w:rFonts w:ascii="Times New Roman" w:hAnsi="Times New Roman" w:cs="Times New Roman"/>
-          <w:sz w:val="22"/>
-          <w:szCs w:val="22"/>
-        </w:rPr>
-        <w:t>May - Aug</w:t>
-      </w:r>
-      <w:r>
-        <w:rPr>
-          <w:rFonts w:ascii="Times New Roman" w:hAnsi="Times New Roman" w:cs="Times New Roman"/>
-          <w:sz w:val="22"/>
-          <w:szCs w:val="22"/>
-        </w:rPr>
-        <w:t xml:space="preserve"> 20</w:t>
-      </w:r>
-      <w:r>
-        <w:rPr>
-          <w:rFonts w:ascii="Times New Roman" w:hAnsi="Times New Roman" w:cs="Times New Roman"/>
-          <w:sz w:val="22"/>
-          <w:szCs w:val="22"/>
-        </w:rPr>
-        <w:t>22</w:t>
-      </w:r>
-    </w:p>
-    <w:p>
-      <w:pPr>
-        <w:pStyle w:val="ListParagraph"/>
-        <w:numPr>
-          <w:ilvl w:val="0"/>
-          <w:numId w:val="44"/>
-        </w:numPr>
-        <w:tabs>
-          <w:tab w:val="right" w:pos="9000"/>
-        </w:tabs>
-        <w:spacing w:after="0"/>
-        <w:rPr>
-          <w:rFonts w:ascii="Times New Roman" w:hAnsi="Times New Roman" w:cs="Times New Roman"/>
-          <w:sz w:val="22"/>
-          <w:szCs w:val="22"/>
-        </w:rPr>
-      </w:pPr>
-      <w:r>
-        <w:rPr>
-          <w:rFonts w:ascii="Times New Roman" w:hAnsi="Times New Roman" w:cs="Times New Roman"/>
-          <w:sz w:val="22"/>
-          <w:szCs w:val="22"/>
-        </w:rPr>
-        <w:t>Reconciled</w:t>
-      </w:r>
-      <w:r>
-        <w:rPr>
-          <w:rFonts w:ascii="Times New Roman" w:hAnsi="Times New Roman" w:cs="Times New Roman"/>
-          <w:sz w:val="22"/>
-          <w:szCs w:val="22"/>
-        </w:rPr>
-        <w:t xml:space="preserve"> </w:t>
-      </w:r>
-      <w:r>
-        <w:rPr>
-          <w:rFonts w:ascii="Times New Roman" w:hAnsi="Times New Roman" w:cs="Times New Roman"/>
-          <w:sz w:val="22"/>
-          <w:szCs w:val="22"/>
-        </w:rPr>
-        <w:t>SPC control</w:t>
-      </w:r>
-      <w:r>
-        <w:rPr>
-          <w:rFonts w:ascii="Times New Roman" w:hAnsi="Times New Roman" w:cs="Times New Roman"/>
-          <w:sz w:val="22"/>
-          <w:szCs w:val="22"/>
-        </w:rPr>
-        <w:t xml:space="preserve"> limits </w:t>
-      </w:r>
-      <w:r>
-        <w:rPr>
-          <w:rFonts w:ascii="Times New Roman" w:hAnsi="Times New Roman" w:cs="Times New Roman"/>
-          <w:sz w:val="22"/>
-          <w:szCs w:val="22"/>
-        </w:rPr>
-        <w:t xml:space="preserve">with </w:t>
-      </w:r>
-      <w:r>
-        <w:rPr>
-          <w:rFonts w:ascii="Times New Roman" w:hAnsi="Times New Roman" w:cs="Times New Roman"/>
-          <w:sz w:val="22"/>
-          <w:szCs w:val="22"/>
-        </w:rPr>
-        <w:t>engineering drawing</w:t>
-      </w:r>
-      <w:r>
-        <w:rPr>
-          <w:rFonts w:ascii="Times New Roman" w:hAnsi="Times New Roman" w:cs="Times New Roman"/>
-          <w:sz w:val="22"/>
-          <w:szCs w:val="22"/>
-        </w:rPr>
-        <w:t xml:space="preserve"> tolerances, ensure statistical process monitoring accurately reflected engineering design requirements</w:t>
-      </w:r>
-    </w:p>
-    <w:p>
-      <w:pPr>
-        <w:tabs>
-          <w:tab w:val="right" w:pos="10800"/>
-        </w:tabs>
-        <w:spacing w:after="0"/>
-        <w:rPr>
-          <w:rFonts w:ascii="Times New Roman" w:hAnsi="Times New Roman" w:cs="Times New Roman"/>
-          <w:b/>
-          <w:bCs/>
-          <w:sz w:val="2"/>
-          <w:szCs w:val="2"/>
-        </w:rPr>
-      </w:pPr>
-    </w:p>
-    <w:p>
-      <w:pPr>
-        <w:tabs>
-          <w:tab w:val="right" w:pos="9000"/>
-        </w:tabs>
-        <w:spacing w:after="0"/>
-        <w:rPr>
-          <w:rFonts w:ascii="Times New Roman" w:hAnsi="Times New Roman" w:cs="Times New Roman"/>
-          <w:color w:val="4C94D8" w:themeColor="text2" w:themeTint="80"/>
+          <w:sz w:val="6"/>
+          <w:szCs w:val="6"/>
         </w:rPr>
       </w:pPr>
       <w:r>
@@ -2420,13 +2168,13 @@
         <mc:AlternateContent>
           <mc:Choice Requires="wps">
             <w:drawing>
-              <wp:anchor distT="0" distB="0" distL="114300" distR="114300" simplePos="0" relativeHeight="251664384" behindDoc="0" locked="0" layoutInCell="1" allowOverlap="1" wp14:anchorId="1896703C" wp14:editId="7B84B4CC">
+              <wp:anchor distT="0" distB="0" distL="114300" distR="114300" simplePos="0" relativeHeight="251670528" behindDoc="0" locked="0" layoutInCell="1" allowOverlap="1" wp14:anchorId="072B3545" wp14:editId="1FA75C1B">
                 <wp:simplePos x="0" y="0"/>
                 <wp:positionH relativeFrom="column">
                   <wp:posOffset>0</wp:posOffset>
                 </wp:positionH>
                 <wp:positionV relativeFrom="paragraph">
-                  <wp:posOffset>200025</wp:posOffset>
+                  <wp:posOffset>21715</wp:posOffset>
                 </wp:positionV>
                 <wp:extent cx="6842760" cy="0"/>
                 <wp:effectExtent l="0" t="12700" r="15240" b="12700"/>
@@ -2472,22 +2220,13 @@
           </mc:Choice>
           <mc:Fallback>
             <w:pict>
-              <v:line w14:anchorId="08CA57B4" id="Straight Connector 2" o:spid="_x0000_s1026" style="position:absolute;z-index:251664384;visibility:visible;mso-wrap-style:square;mso-width-percent:0;mso-wrap-distance-left:9pt;mso-wrap-distance-top:0;mso-wrap-distance-right:9pt;mso-wrap-distance-bottom:0;mso-position-horizontal:absolute;mso-position-horizontal-relative:text;mso-position-vertical:absolute;mso-position-vertical-relative:text;mso-width-percent:0;mso-width-relative:margin" from="0,15.75pt" to="538.8pt,15.75pt" o:gfxdata="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" strokecolor="black [3200]" strokeweight="1.5pt">
+              <v:line w14:anchorId="11986D1C" id="Straight Connector 2" o:spid="_x0000_s1026" style="position:absolute;z-index:251670528;visibility:visible;mso-wrap-style:square;mso-width-percent:0;mso-wrap-distance-left:9pt;mso-wrap-distance-top:0;mso-wrap-distance-right:9pt;mso-wrap-distance-bottom:0;mso-position-horizontal:absolute;mso-position-horizontal-relative:text;mso-position-vertical:absolute;mso-position-vertical-relative:text;mso-width-percent:0;mso-width-relative:margin" from="0,1.7pt" to="538.8pt,1.7pt" o:gfxdata="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" strokecolor="black [3200]" strokeweight="1.5pt">
                 <v:stroke joinstyle="miter"/>
               </v:line>
             </w:pict>
           </mc:Fallback>
         </mc:AlternateContent>
       </w:r>
-      <w:r>
-        <w:rPr>
-          <w:rFonts w:ascii="Arial" w:hAnsi="Arial" w:cs="Arial"/>
-          <w:b/>
-          <w:bCs/>
-          <w:color w:val="4C94D8" w:themeColor="text2" w:themeTint="80"/>
-        </w:rPr>
-        <w:t>Projects</w:t>
-      </w:r>
     </w:p>
     <w:p>
       <w:pPr>
@@ -2572,7 +2311,15 @@
           <w:sz w:val="22"/>
           <w:szCs w:val="22"/>
         </w:rPr>
-        <w:t>Spring 2021</w:t>
+        <w:t>Spring</w:t>
+      </w:r>
+      <w:r>
+        <w:rPr>
+          <w:rFonts w:ascii="Times New Roman" w:hAnsi="Times New Roman" w:cs="Times New Roman"/>
+          <w:sz w:val="22"/>
+          <w:szCs w:val="22"/>
+        </w:rPr>
+        <w:t xml:space="preserve"> 2021</w:t>
       </w:r>
     </w:p>
     <w:p>
@@ -2580,7 +2327,7 @@
         <w:pStyle w:val="ListParagraph"/>
         <w:numPr>
           <w:ilvl w:val="0"/>
-          <w:numId w:val="38"/>
+          <w:numId w:val="51"/>
         </w:numPr>
         <w:tabs>
           <w:tab w:val="right" w:pos="10800"/>
@@ -2598,71 +2345,23 @@
           <w:sz w:val="22"/>
           <w:szCs w:val="22"/>
         </w:rPr>
-        <w:t>Created an o</w:t>
-      </w:r>
-      <w:r>
-        <w:rPr>
-          <w:rFonts w:ascii="Times New Roman" w:hAnsi="Times New Roman" w:cs="Times New Roman"/>
-          <w:sz w:val="22"/>
-          <w:szCs w:val="22"/>
-        </w:rPr>
-        <w:t>ptim</w:t>
-      </w:r>
-      <w:r>
-        <w:rPr>
-          <w:rFonts w:ascii="Times New Roman" w:hAnsi="Times New Roman" w:cs="Times New Roman"/>
-          <w:sz w:val="22"/>
-          <w:szCs w:val="22"/>
-        </w:rPr>
-        <w:t xml:space="preserve">al </w:t>
-      </w:r>
-      <w:r>
-        <w:rPr>
-          <w:rFonts w:ascii="Times New Roman" w:hAnsi="Times New Roman" w:cs="Times New Roman"/>
-          <w:sz w:val="22"/>
-          <w:szCs w:val="22"/>
-        </w:rPr>
-        <w:t>cantilever I-beam</w:t>
-      </w:r>
-      <w:r>
-        <w:rPr>
-          <w:rFonts w:ascii="Times New Roman" w:hAnsi="Times New Roman" w:cs="Times New Roman"/>
-          <w:sz w:val="22"/>
-          <w:szCs w:val="22"/>
-        </w:rPr>
-        <w:t xml:space="preserve"> design</w:t>
-      </w:r>
-      <w:r>
-        <w:rPr>
-          <w:rFonts w:ascii="Times New Roman" w:hAnsi="Times New Roman" w:cs="Times New Roman"/>
-          <w:sz w:val="22"/>
-          <w:szCs w:val="22"/>
-        </w:rPr>
-        <w:t xml:space="preserve"> </w:t>
-      </w:r>
-      <w:r>
-        <w:rPr>
-          <w:rFonts w:ascii="Times New Roman" w:hAnsi="Times New Roman" w:cs="Times New Roman"/>
-          <w:sz w:val="22"/>
-          <w:szCs w:val="22"/>
-        </w:rPr>
-        <w:t>to maximize</w:t>
-      </w:r>
-      <w:r>
-        <w:rPr>
-          <w:rFonts w:ascii="Times New Roman" w:hAnsi="Times New Roman" w:cs="Times New Roman"/>
-          <w:sz w:val="22"/>
-          <w:szCs w:val="22"/>
-        </w:rPr>
-        <w:t xml:space="preserve"> length under fixed mass and loading constraints</w:t>
-      </w:r>
-      <w:r>
-        <w:rPr>
-          <w:rFonts w:ascii="Times New Roman" w:hAnsi="Times New Roman" w:cs="Times New Roman"/>
-          <w:sz w:val="22"/>
-          <w:szCs w:val="22"/>
-        </w:rPr>
-        <w:t>.</w:t>
+        <w:t>Designed an optimized cantilever I-beam under fixed mass and loading constraints, applying beam theory</w:t>
+      </w:r>
+      <w:r>
+        <w:rPr>
+          <w:rFonts w:ascii="Times New Roman" w:hAnsi="Times New Roman" w:cs="Times New Roman"/>
+          <w:sz w:val="22"/>
+          <w:szCs w:val="22"/>
+        </w:rPr>
+        <w:t xml:space="preserve"> and FEA in ANSYS</w:t>
+      </w:r>
+      <w:r>
+        <w:rPr>
+          <w:rFonts w:ascii="Times New Roman" w:hAnsi="Times New Roman" w:cs="Times New Roman"/>
+          <w:sz w:val="22"/>
+          <w:szCs w:val="22"/>
+        </w:rPr>
+        <w:t xml:space="preserve"> to strategically concentrate material near the fixed support where bending stresses were highest.</w:t>
       </w:r>
     </w:p>
     <w:p>
@@ -2670,7 +2369,7 @@
         <w:pStyle w:val="ListParagraph"/>
         <w:numPr>
           <w:ilvl w:val="0"/>
-          <w:numId w:val="38"/>
+          <w:numId w:val="51"/>
         </w:numPr>
         <w:tabs>
           <w:tab w:val="right" w:pos="10800"/>
@@ -2688,39 +2387,70 @@
           <w:sz w:val="22"/>
           <w:szCs w:val="22"/>
         </w:rPr>
-        <w:t>Applied beam theory to concentrate</w:t>
-      </w:r>
-      <w:r>
-        <w:rPr>
-          <w:rFonts w:ascii="Times New Roman" w:hAnsi="Times New Roman" w:cs="Times New Roman"/>
-          <w:sz w:val="22"/>
-          <w:szCs w:val="22"/>
-        </w:rPr>
-        <w:t xml:space="preserve"> material </w:t>
-      </w:r>
-      <w:r>
-        <w:rPr>
-          <w:rFonts w:ascii="Times New Roman" w:hAnsi="Times New Roman" w:cs="Times New Roman"/>
-          <w:sz w:val="22"/>
-          <w:szCs w:val="22"/>
-        </w:rPr>
-        <w:t>near</w:t>
-      </w:r>
-      <w:r>
-        <w:rPr>
-          <w:rFonts w:ascii="Times New Roman" w:hAnsi="Times New Roman" w:cs="Times New Roman"/>
-          <w:sz w:val="22"/>
-          <w:szCs w:val="22"/>
-        </w:rPr>
-        <w:t xml:space="preserve"> the fixed </w:t>
-      </w:r>
-      <w:r>
-        <w:rPr>
-          <w:rFonts w:ascii="Times New Roman" w:hAnsi="Times New Roman" w:cs="Times New Roman"/>
-          <w:sz w:val="22"/>
-          <w:szCs w:val="22"/>
-        </w:rPr>
-        <w:t xml:space="preserve">support to resist high bending moments and shear forces, tapering down toward the tip where loads are lower. </w:t>
+        <w:t>Manufactured the beam using a single milling tool and one fixture setup, achieving the longest beam design among 65 students while meeting structural and machining constraints.</w:t>
+      </w:r>
+    </w:p>
+    <w:p>
+      <w:pPr>
+        <w:tabs>
+          <w:tab w:val="right" w:pos="10800"/>
+        </w:tabs>
+        <w:spacing w:after="0" w:line="240" w:lineRule="auto"/>
+        <w:rPr>
+          <w:rFonts w:ascii="Times New Roman" w:hAnsi="Times New Roman" w:cs="Times New Roman"/>
+          <w:b/>
+          <w:bCs/>
+          <w:sz w:val="6"/>
+          <w:szCs w:val="6"/>
+        </w:rPr>
+      </w:pPr>
+    </w:p>
+    <w:p>
+      <w:pPr>
+        <w:tabs>
+          <w:tab w:val="right" w:pos="10800"/>
+        </w:tabs>
+        <w:spacing w:after="0" w:line="240" w:lineRule="auto"/>
+        <w:rPr>
+          <w:rFonts w:ascii="Times New Roman" w:hAnsi="Times New Roman" w:cs="Times New Roman"/>
+          <w:sz w:val="22"/>
+          <w:szCs w:val="22"/>
+        </w:rPr>
+      </w:pPr>
+      <w:r>
+        <w:rPr>
+          <w:rFonts w:ascii="Times New Roman" w:hAnsi="Times New Roman" w:cs="Times New Roman"/>
+          <w:b/>
+          <w:bCs/>
+          <w:sz w:val="22"/>
+          <w:szCs w:val="22"/>
+        </w:rPr>
+        <w:t>Refrigerated Trailer Design</w:t>
+      </w:r>
+      <w:r>
+        <w:rPr>
+          <w:rFonts w:ascii="Times New Roman" w:hAnsi="Times New Roman" w:cs="Times New Roman"/>
+          <w:sz w:val="22"/>
+          <w:szCs w:val="22"/>
+        </w:rPr>
+        <w:t xml:space="preserve"> - Mount Holyoke Community Garden</w:t>
+      </w:r>
+      <w:r>
+        <w:rPr>
+          <w:rFonts w:ascii="Times New Roman" w:hAnsi="Times New Roman" w:cs="Times New Roman"/>
+          <w:sz w:val="22"/>
+          <w:szCs w:val="22"/>
+        </w:rPr>
+        <w:t xml:space="preserve"> </w:t>
+      </w:r>
+      <w:r>
+        <w:rPr>
+          <w:rFonts w:ascii="Times New Roman" w:hAnsi="Times New Roman" w:cs="Times New Roman"/>
+          <w:sz w:val="22"/>
+          <w:szCs w:val="22"/>
+        </w:rPr>
+        <w:tab/>
+        <w:t>Fall 2022</w:t>
       </w:r>
     </w:p>
     <w:p>
@@ -2728,7 +2458,7 @@
         <w:pStyle w:val="ListParagraph"/>
         <w:numPr>
           <w:ilvl w:val="0"/>
-          <w:numId w:val="38"/>
+          <w:numId w:val="51"/>
         </w:numPr>
         <w:tabs>
           <w:tab w:val="right" w:pos="10800"/>
@@ -2746,44 +2476,20 @@
           <w:sz w:val="22"/>
           <w:szCs w:val="22"/>
         </w:rPr>
-        <w:t>Manufactured whole beam using</w:t>
-      </w:r>
-      <w:r>
-        <w:rPr>
-          <w:rFonts w:ascii="Times New Roman" w:hAnsi="Times New Roman" w:cs="Times New Roman"/>
-          <w:sz w:val="22"/>
-          <w:szCs w:val="22"/>
-        </w:rPr>
-        <w:t xml:space="preserve"> a single mill bit and only one fixture rotation</w:t>
-      </w:r>
-      <w:r>
-        <w:rPr>
-          <w:rFonts w:ascii="Times New Roman" w:hAnsi="Times New Roman" w:cs="Times New Roman"/>
-          <w:sz w:val="22"/>
-          <w:szCs w:val="22"/>
-        </w:rPr>
-        <w:t xml:space="preserve">; achieved longest </w:t>
-      </w:r>
-      <w:r>
-        <w:rPr>
-          <w:rFonts w:ascii="Times New Roman" w:hAnsi="Times New Roman" w:cs="Times New Roman"/>
-          <w:sz w:val="22"/>
-          <w:szCs w:val="22"/>
-        </w:rPr>
-        <w:t>beam</w:t>
-      </w:r>
-      <w:r>
-        <w:rPr>
-          <w:rFonts w:ascii="Times New Roman" w:hAnsi="Times New Roman" w:cs="Times New Roman"/>
-          <w:sz w:val="22"/>
-          <w:szCs w:val="22"/>
-        </w:rPr>
-        <w:t xml:space="preserve"> among 65 students </w:t>
+        <w:t xml:space="preserve">Performed thermal load analysis considering produce mass, conductive heat </w:t>
+      </w:r>
+      <w:r>
+        <w:rPr>
+          <w:rFonts w:ascii="Times New Roman" w:hAnsi="Times New Roman" w:cs="Times New Roman"/>
+          <w:sz w:val="22"/>
+          <w:szCs w:val="22"/>
+        </w:rPr>
+        <w:t xml:space="preserve">gain through trailer walls and air infiltration to determine required cooling capacity and insulation thickness. </w:t>
       </w:r>
     </w:p>
     <w:sectPr>
       <w:pgSz w:w="12240" w:h="15840"/>
-      <w:pgMar w:top="360" w:right="720" w:bottom="360" w:left="720" w:header="720" w:footer="720" w:gutter="0"/>
+      <w:pgMar w:top="288" w:right="720" w:bottom="288" w:left="720" w:header="720" w:footer="720" w:gutter="0"/>
       <w:cols w:space="720"/>
       <w:docGrid w:linePitch="360"/>
     </w:sectPr>
@@ -5673,6 +5379,119 @@
     </w:lvl>
   </w:abstractNum>
   <w:abstractNum w:abstractNumId="26" w15:restartNumberingAfterBreak="0">
+    <w:nsid w:val="3F612DC3"/>
+    <w:multiLevelType w:val="hybridMultilevel"/>
+    <w:tmpl w:val="7D8CC866"/>
+    <w:lvl w:ilvl="0" w:tplc="04090001">
+      <w:start w:val="1"/>
+      <w:numFmt w:val="bullet"/>
+      <w:lvlText w:val=""/>
+      <w:lvlJc w:val="left"/>
+      <w:pPr>
+        <w:ind w:left="720" w:hanging="360"/>
+      </w:pPr>
+      <w:rPr>
+        <w:rFonts w:ascii="Symbol" w:hAnsi="Symbol" w:hint="default"/>
+      </w:rPr>
+    </w:lvl>
+    <w:lvl w:ilvl="1" w:tplc="04090003" w:tentative="1">
+      <w:start w:val="1"/>
+      <w:numFmt w:val="bullet"/>
+      <w:lvlText w:val="o"/>
+      <w:lvlJc w:val="left"/>
+      <w:pPr>
+        <w:ind w:left="1440" w:hanging="360"/>
+      </w:pPr>
+      <w:rPr>
+        <w:rFonts w:ascii="Courier New" w:hAnsi="Courier New" w:cs="Courier New" w:hint="default"/>
+      </w:rPr>
+    </w:lvl>
+    <w:lvl w:ilvl="2" w:tplc="04090005" w:tentative="1">
+      <w:start w:val="1"/>
+      <w:numFmt w:val="bullet"/>
+      <w:lvlText w:val=""/>
+      <w:lvlJc w:val="left"/>
+      <w:pPr>
+        <w:ind w:left="2160" w:hanging="360"/>
+      </w:pPr>
+      <w:rPr>
+        <w:rFonts w:ascii="Wingdings" w:hAnsi="Wingdings" w:hint="default"/>
+      </w:rPr>
+    </w:lvl>
+    <w:lvl w:ilvl="3" w:tplc="04090001" w:tentative="1">
+      <w:start w:val="1"/>
+      <w:numFmt w:val="bullet"/>
+      <w:lvlText w:val=""/>
+      <w:lvlJc w:val="left"/>
+      <w:pPr>
+        <w:ind w:left="2880" w:hanging="360"/>
+      </w:pPr>
+      <w:rPr>
+        <w:rFonts w:ascii="Symbol" w:hAnsi="Symbol" w:hint="default"/>
+      </w:rPr>
+    </w:lvl>
+    <w:lvl w:ilvl="4" w:tplc="04090003" w:tentative="1">
+      <w:start w:val="1"/>
+      <w:numFmt w:val="bullet"/>
+      <w:lvlText w:val="o"/>
+      <w:lvlJc w:val="left"/>
+      <w:pPr>
+        <w:ind w:left="3600" w:hanging="360"/>
+      </w:pPr>
+      <w:rPr>
+        <w:rFonts w:ascii="Courier New" w:hAnsi="Courier New" w:cs="Courier New" w:hint="default"/>
+      </w:rPr>
+    </w:lvl>
+    <w:lvl w:ilvl="5" w:tplc="04090005" w:tentative="1">
+      <w:start w:val="1"/>
+      <w:numFmt w:val="bullet"/>
+      <w:lvlText w:val=""/>
+      <w:lvlJc w:val="left"/>
+      <w:pPr>
+        <w:ind w:left="4320" w:hanging="360"/>
+      </w:pPr>
+      <w:rPr>
+        <w:rFonts w:ascii="Wingdings" w:hAnsi="Wingdings" w:hint="default"/>
+      </w:rPr>
+    </w:lvl>
+    <w:lvl w:ilvl="6" w:tplc="04090001" w:tentative="1">
+      <w:start w:val="1"/>
+      <w:numFmt w:val="bullet"/>
+      <w:lvlText w:val=""/>
+      <w:lvlJc w:val="left"/>
+      <w:pPr>
+        <w:ind w:left="5040" w:hanging="360"/>
+      </w:pPr>
+      <w:rPr>
+        <w:rFonts w:ascii="Symbol" w:hAnsi="Symbol" w:hint="default"/>
+      </w:rPr>
+    </w:lvl>
+    <w:lvl w:ilvl="7" w:tplc="04090003" w:tentative="1">
+      <w:start w:val="1"/>
+      <w:numFmt w:val="bullet"/>
+      <w:lvlText w:val="o"/>
+      <w:lvlJc w:val="left"/>
+      <w:pPr>
+        <w:ind w:left="5760" w:hanging="360"/>
+      </w:pPr>
+      <w:rPr>
+        <w:rFonts w:ascii="Courier New" w:hAnsi="Courier New" w:cs="Courier New" w:hint="default"/>
+      </w:rPr>
+    </w:lvl>
+    <w:lvl w:ilvl="8" w:tplc="04090005" w:tentative="1">
+      <w:start w:val="1"/>
+      <w:numFmt w:val="bullet"/>
+      <w:lvlText w:val=""/>
+      <w:lvlJc w:val="left"/>
+      <w:pPr>
+        <w:ind w:left="6480" w:hanging="360"/>
+      </w:pPr>
+      <w:rPr>
+        <w:rFonts w:ascii="Wingdings" w:hAnsi="Wingdings" w:hint="default"/>
+      </w:rPr>
+    </w:lvl>
+  </w:abstractNum>
+  <w:abstractNum w:abstractNumId="27" w15:restartNumberingAfterBreak="0">
     <w:nsid w:val="409C725E"/>
     <w:multiLevelType w:val="hybridMultilevel"/>
     <w:tmpl w:val="B66C02A2"/>
@@ -5785,7 +5604,120 @@
       </w:rPr>
     </w:lvl>
   </w:abstractNum>
-  <w:abstractNum w:abstractNumId="27" w15:restartNumberingAfterBreak="0">
+  <w:abstractNum w:abstractNumId="28" w15:restartNumberingAfterBreak="0">
+    <w:nsid w:val="433805E0"/>
+    <w:multiLevelType w:val="hybridMultilevel"/>
+    <w:tmpl w:val="35E02A00"/>
+    <w:lvl w:ilvl="0" w:tplc="04090001">
+      <w:start w:val="1"/>
+      <w:numFmt w:val="bullet"/>
+      <w:lvlText w:val=""/>
+      <w:lvlJc w:val="left"/>
+      <w:pPr>
+        <w:ind w:left="720" w:hanging="360"/>
+      </w:pPr>
+      <w:rPr>
+        <w:rFonts w:ascii="Symbol" w:hAnsi="Symbol" w:hint="default"/>
+      </w:rPr>
+    </w:lvl>
+    <w:lvl w:ilvl="1" w:tplc="04090003" w:tentative="1">
+      <w:start w:val="1"/>
+      <w:numFmt w:val="bullet"/>
+      <w:lvlText w:val="o"/>
+      <w:lvlJc w:val="left"/>
+      <w:pPr>
+        <w:ind w:left="1440" w:hanging="360"/>
+      </w:pPr>
+      <w:rPr>
+        <w:rFonts w:ascii="Courier New" w:hAnsi="Courier New" w:cs="Courier New" w:hint="default"/>
+      </w:rPr>
+    </w:lvl>
+    <w:lvl w:ilvl="2" w:tplc="04090005" w:tentative="1">
+      <w:start w:val="1"/>
+      <w:numFmt w:val="bullet"/>
+      <w:lvlText w:val=""/>
+      <w:lvlJc w:val="left"/>
+      <w:pPr>
+        <w:ind w:left="2160" w:hanging="360"/>
+      </w:pPr>
+      <w:rPr>
+        <w:rFonts w:ascii="Wingdings" w:hAnsi="Wingdings" w:hint="default"/>
+      </w:rPr>
+    </w:lvl>
+    <w:lvl w:ilvl="3" w:tplc="04090001" w:tentative="1">
+      <w:start w:val="1"/>
+      <w:numFmt w:val="bullet"/>
+      <w:lvlText w:val=""/>
+      <w:lvlJc w:val="left"/>
+      <w:pPr>
+        <w:ind w:left="2880" w:hanging="360"/>
+      </w:pPr>
+      <w:rPr>
+        <w:rFonts w:ascii="Symbol" w:hAnsi="Symbol" w:hint="default"/>
+      </w:rPr>
+    </w:lvl>
+    <w:lvl w:ilvl="4" w:tplc="04090003" w:tentative="1">
+      <w:start w:val="1"/>
+      <w:numFmt w:val="bullet"/>
+      <w:lvlText w:val="o"/>
+      <w:lvlJc w:val="left"/>
+      <w:pPr>
+        <w:ind w:left="3600" w:hanging="360"/>
+      </w:pPr>
+      <w:rPr>
+        <w:rFonts w:ascii="Courier New" w:hAnsi="Courier New" w:cs="Courier New" w:hint="default"/>
+      </w:rPr>
+    </w:lvl>
+    <w:lvl w:ilvl="5" w:tplc="04090005" w:tentative="1">
+      <w:start w:val="1"/>
+      <w:numFmt w:val="bullet"/>
+      <w:lvlText w:val=""/>
+      <w:lvlJc w:val="left"/>
+      <w:pPr>
+        <w:ind w:left="4320" w:hanging="360"/>
+      </w:pPr>
+      <w:rPr>
+        <w:rFonts w:ascii="Wingdings" w:hAnsi="Wingdings" w:hint="default"/>
+      </w:rPr>
+    </w:lvl>
+    <w:lvl w:ilvl="6" w:tplc="04090001" w:tentative="1">
+      <w:start w:val="1"/>
+      <w:numFmt w:val="bullet"/>
+      <w:lvlText w:val=""/>
+      <w:lvlJc w:val="left"/>
+      <w:pPr>
+        <w:ind w:left="5040" w:hanging="360"/>
+      </w:pPr>
+      <w:rPr>
+        <w:rFonts w:ascii="Symbol" w:hAnsi="Symbol" w:hint="default"/>
+      </w:rPr>
+    </w:lvl>
+    <w:lvl w:ilvl="7" w:tplc="04090003" w:tentative="1">
+      <w:start w:val="1"/>
+      <w:numFmt w:val="bullet"/>
+      <w:lvlText w:val="o"/>
+      <w:lvlJc w:val="left"/>
+      <w:pPr>
+        <w:ind w:left="5760" w:hanging="360"/>
+      </w:pPr>
+      <w:rPr>
+        <w:rFonts w:ascii="Courier New" w:hAnsi="Courier New" w:cs="Courier New" w:hint="default"/>
+      </w:rPr>
+    </w:lvl>
+    <w:lvl w:ilvl="8" w:tplc="04090005" w:tentative="1">
+      <w:start w:val="1"/>
+      <w:numFmt w:val="bullet"/>
+      <w:lvlText w:val=""/>
+      <w:lvlJc w:val="left"/>
+      <w:pPr>
+        <w:ind w:left="6480" w:hanging="360"/>
+      </w:pPr>
+      <w:rPr>
+        <w:rFonts w:ascii="Wingdings" w:hAnsi="Wingdings" w:hint="default"/>
+      </w:rPr>
+    </w:lvl>
+  </w:abstractNum>
+  <w:abstractNum w:abstractNumId="29" w15:restartNumberingAfterBreak="0">
     <w:nsid w:val="44BC34FE"/>
     <w:multiLevelType w:val="hybridMultilevel"/>
     <w:tmpl w:val="53007D7E"/>
@@ -5898,7 +5830,7 @@
       </w:rPr>
     </w:lvl>
   </w:abstractNum>
-  <w:abstractNum w:abstractNumId="28" w15:restartNumberingAfterBreak="0">
+  <w:abstractNum w:abstractNumId="30" w15:restartNumberingAfterBreak="0">
     <w:nsid w:val="45D06E5C"/>
     <w:multiLevelType w:val="hybridMultilevel"/>
     <w:tmpl w:val="4282C4D6"/>
@@ -6011,7 +5943,7 @@
       </w:rPr>
     </w:lvl>
   </w:abstractNum>
-  <w:abstractNum w:abstractNumId="29" w15:restartNumberingAfterBreak="0">
+  <w:abstractNum w:abstractNumId="31" w15:restartNumberingAfterBreak="0">
     <w:nsid w:val="48897D53"/>
     <w:multiLevelType w:val="hybridMultilevel"/>
     <w:tmpl w:val="59B6216E"/>
@@ -6124,7 +6056,7 @@
       </w:rPr>
     </w:lvl>
   </w:abstractNum>
-  <w:abstractNum w:abstractNumId="30" w15:restartNumberingAfterBreak="0">
+  <w:abstractNum w:abstractNumId="32" w15:restartNumberingAfterBreak="0">
     <w:nsid w:val="4D8D54C3"/>
     <w:multiLevelType w:val="hybridMultilevel"/>
     <w:tmpl w:val="EDD83AFC"/>
@@ -6237,7 +6169,120 @@
       </w:rPr>
     </w:lvl>
   </w:abstractNum>
-  <w:abstractNum w:abstractNumId="31" w15:restartNumberingAfterBreak="0">
+  <w:abstractNum w:abstractNumId="33" w15:restartNumberingAfterBreak="0">
+    <w:nsid w:val="4E20747E"/>
+    <w:multiLevelType w:val="hybridMultilevel"/>
+    <w:tmpl w:val="BC4E9A80"/>
+    <w:lvl w:ilvl="0" w:tplc="04090001">
+      <w:start w:val="1"/>
+      <w:numFmt w:val="bullet"/>
+      <w:lvlText w:val=""/>
+      <w:lvlJc w:val="left"/>
+      <w:pPr>
+        <w:ind w:left="720" w:hanging="360"/>
+      </w:pPr>
+      <w:rPr>
+        <w:rFonts w:ascii="Symbol" w:hAnsi="Symbol" w:hint="default"/>
+      </w:rPr>
+    </w:lvl>
+    <w:lvl w:ilvl="1" w:tplc="04090003" w:tentative="1">
+      <w:start w:val="1"/>
+      <w:numFmt w:val="bullet"/>
+      <w:lvlText w:val="o"/>
+      <w:lvlJc w:val="left"/>
+      <w:pPr>
+        <w:ind w:left="1440" w:hanging="360"/>
+      </w:pPr>
+      <w:rPr>
+        <w:rFonts w:ascii="Courier New" w:hAnsi="Courier New" w:cs="Courier New" w:hint="default"/>
+      </w:rPr>
+    </w:lvl>
+    <w:lvl w:ilvl="2" w:tplc="04090005" w:tentative="1">
+      <w:start w:val="1"/>
+      <w:numFmt w:val="bullet"/>
+      <w:lvlText w:val=""/>
+      <w:lvlJc w:val="left"/>
+      <w:pPr>
+        <w:ind w:left="2160" w:hanging="360"/>
+      </w:pPr>
+      <w:rPr>
+        <w:rFonts w:ascii="Wingdings" w:hAnsi="Wingdings" w:hint="default"/>
+      </w:rPr>
+    </w:lvl>
+    <w:lvl w:ilvl="3" w:tplc="04090001" w:tentative="1">
+      <w:start w:val="1"/>
+      <w:numFmt w:val="bullet"/>
+      <w:lvlText w:val=""/>
+      <w:lvlJc w:val="left"/>
+      <w:pPr>
+        <w:ind w:left="2880" w:hanging="360"/>
+      </w:pPr>
+      <w:rPr>
+        <w:rFonts w:ascii="Symbol" w:hAnsi="Symbol" w:hint="default"/>
+      </w:rPr>
+    </w:lvl>
+    <w:lvl w:ilvl="4" w:tplc="04090003" w:tentative="1">
+      <w:start w:val="1"/>
+      <w:numFmt w:val="bullet"/>
+      <w:lvlText w:val="o"/>
+      <w:lvlJc w:val="left"/>
+      <w:pPr>
+        <w:ind w:left="3600" w:hanging="360"/>
+      </w:pPr>
+      <w:rPr>
+        <w:rFonts w:ascii="Courier New" w:hAnsi="Courier New" w:cs="Courier New" w:hint="default"/>
+      </w:rPr>
+    </w:lvl>
+    <w:lvl w:ilvl="5" w:tplc="04090005" w:tentative="1">
+      <w:start w:val="1"/>
+      <w:numFmt w:val="bullet"/>
+      <w:lvlText w:val=""/>
+      <w:lvlJc w:val="left"/>
+      <w:pPr>
+        <w:ind w:left="4320" w:hanging="360"/>
+      </w:pPr>
+      <w:rPr>
+        <w:rFonts w:ascii="Wingdings" w:hAnsi="Wingdings" w:hint="default"/>
+      </w:rPr>
+    </w:lvl>
+    <w:lvl w:ilvl="6" w:tplc="04090001" w:tentative="1">
+      <w:start w:val="1"/>
+      <w:numFmt w:val="bullet"/>
+      <w:lvlText w:val=""/>
+      <w:lvlJc w:val="left"/>
+      <w:pPr>
+        <w:ind w:left="5040" w:hanging="360"/>
+      </w:pPr>
+      <w:rPr>
+        <w:rFonts w:ascii="Symbol" w:hAnsi="Symbol" w:hint="default"/>
+      </w:rPr>
+    </w:lvl>
+    <w:lvl w:ilvl="7" w:tplc="04090003" w:tentative="1">
+      <w:start w:val="1"/>
+      <w:numFmt w:val="bullet"/>
+      <w:lvlText w:val="o"/>
+      <w:lvlJc w:val="left"/>
+      <w:pPr>
+        <w:ind w:left="5760" w:hanging="360"/>
+      </w:pPr>
+      <w:rPr>
+        <w:rFonts w:ascii="Courier New" w:hAnsi="Courier New" w:cs="Courier New" w:hint="default"/>
+      </w:rPr>
+    </w:lvl>
+    <w:lvl w:ilvl="8" w:tplc="04090005" w:tentative="1">
+      <w:start w:val="1"/>
+      <w:numFmt w:val="bullet"/>
+      <w:lvlText w:val=""/>
+      <w:lvlJc w:val="left"/>
+      <w:pPr>
+        <w:ind w:left="6480" w:hanging="360"/>
+      </w:pPr>
+      <w:rPr>
+        <w:rFonts w:ascii="Wingdings" w:hAnsi="Wingdings" w:hint="default"/>
+      </w:rPr>
+    </w:lvl>
+  </w:abstractNum>
+  <w:abstractNum w:abstractNumId="34" w15:restartNumberingAfterBreak="0">
     <w:nsid w:val="4E4F725D"/>
     <w:multiLevelType w:val="hybridMultilevel"/>
     <w:tmpl w:val="596041C2"/>
@@ -6350,7 +6395,7 @@
       </w:rPr>
     </w:lvl>
   </w:abstractNum>
-  <w:abstractNum w:abstractNumId="32" w15:restartNumberingAfterBreak="0">
+  <w:abstractNum w:abstractNumId="35" w15:restartNumberingAfterBreak="0">
     <w:nsid w:val="52956C57"/>
     <w:multiLevelType w:val="hybridMultilevel"/>
     <w:tmpl w:val="37566882"/>
@@ -6463,7 +6508,7 @@
       </w:rPr>
     </w:lvl>
   </w:abstractNum>
-  <w:abstractNum w:abstractNumId="33" w15:restartNumberingAfterBreak="0">
+  <w:abstractNum w:abstractNumId="36" w15:restartNumberingAfterBreak="0">
     <w:nsid w:val="5A8E3080"/>
     <w:multiLevelType w:val="hybridMultilevel"/>
     <w:tmpl w:val="7044509C"/>
@@ -6576,7 +6621,7 @@
       </w:rPr>
     </w:lvl>
   </w:abstractNum>
-  <w:abstractNum w:abstractNumId="34" w15:restartNumberingAfterBreak="0">
+  <w:abstractNum w:abstractNumId="37" w15:restartNumberingAfterBreak="0">
     <w:nsid w:val="5D7D4ACB"/>
     <w:multiLevelType w:val="hybridMultilevel"/>
     <w:tmpl w:val="04AEE37A"/>
@@ -6689,7 +6734,233 @@
       </w:rPr>
     </w:lvl>
   </w:abstractNum>
-  <w:abstractNum w:abstractNumId="35" w15:restartNumberingAfterBreak="0">
+  <w:abstractNum w:abstractNumId="38" w15:restartNumberingAfterBreak="0">
+    <w:nsid w:val="605020C8"/>
+    <w:multiLevelType w:val="hybridMultilevel"/>
+    <w:tmpl w:val="959053EE"/>
+    <w:lvl w:ilvl="0" w:tplc="04090001">
+      <w:start w:val="1"/>
+      <w:numFmt w:val="bullet"/>
+      <w:lvlText w:val=""/>
+      <w:lvlJc w:val="left"/>
+      <w:pPr>
+        <w:ind w:left="720" w:hanging="360"/>
+      </w:pPr>
+      <w:rPr>
+        <w:rFonts w:ascii="Symbol" w:hAnsi="Symbol" w:hint="default"/>
+      </w:rPr>
+    </w:lvl>
+    <w:lvl w:ilvl="1" w:tplc="04090003" w:tentative="1">
+      <w:start w:val="1"/>
+      <w:numFmt w:val="bullet"/>
+      <w:lvlText w:val="o"/>
+      <w:lvlJc w:val="left"/>
+      <w:pPr>
+        <w:ind w:left="1440" w:hanging="360"/>
+      </w:pPr>
+      <w:rPr>
+        <w:rFonts w:ascii="Courier New" w:hAnsi="Courier New" w:cs="Courier New" w:hint="default"/>
+      </w:rPr>
+    </w:lvl>
+    <w:lvl w:ilvl="2" w:tplc="04090005" w:tentative="1">
+      <w:start w:val="1"/>
+      <w:numFmt w:val="bullet"/>
+      <w:lvlText w:val=""/>
+      <w:lvlJc w:val="left"/>
+      <w:pPr>
+        <w:ind w:left="2160" w:hanging="360"/>
+      </w:pPr>
+      <w:rPr>
+        <w:rFonts w:ascii="Wingdings" w:hAnsi="Wingdings" w:hint="default"/>
+      </w:rPr>
+    </w:lvl>
+    <w:lvl w:ilvl="3" w:tplc="04090001" w:tentative="1">
+      <w:start w:val="1"/>
+      <w:numFmt w:val="bullet"/>
+      <w:lvlText w:val=""/>
+      <w:lvlJc w:val="left"/>
+      <w:pPr>
+        <w:ind w:left="2880" w:hanging="360"/>
+      </w:pPr>
+      <w:rPr>
+        <w:rFonts w:ascii="Symbol" w:hAnsi="Symbol" w:hint="default"/>
+      </w:rPr>
+    </w:lvl>
+    <w:lvl w:ilvl="4" w:tplc="04090003" w:tentative="1">
+      <w:start w:val="1"/>
+      <w:numFmt w:val="bullet"/>
+      <w:lvlText w:val="o"/>
+      <w:lvlJc w:val="left"/>
+      <w:pPr>
+        <w:ind w:left="3600" w:hanging="360"/>
+      </w:pPr>
+      <w:rPr>
+        <w:rFonts w:ascii="Courier New" w:hAnsi="Courier New" w:cs="Courier New" w:hint="default"/>
+      </w:rPr>
+    </w:lvl>
+    <w:lvl w:ilvl="5" w:tplc="04090005" w:tentative="1">
+      <w:start w:val="1"/>
+      <w:numFmt w:val="bullet"/>
+      <w:lvlText w:val=""/>
+      <w:lvlJc w:val="left"/>
+      <w:pPr>
+        <w:ind w:left="4320" w:hanging="360"/>
+      </w:pPr>
+      <w:rPr>
+        <w:rFonts w:ascii="Wingdings" w:hAnsi="Wingdings" w:hint="default"/>
+      </w:rPr>
+    </w:lvl>
+    <w:lvl w:ilvl="6" w:tplc="04090001" w:tentative="1">
+      <w:start w:val="1"/>
+      <w:numFmt w:val="bullet"/>
+      <w:lvlText w:val=""/>
+      <w:lvlJc w:val="left"/>
+      <w:pPr>
+        <w:ind w:left="5040" w:hanging="360"/>
+      </w:pPr>
+      <w:rPr>
+        <w:rFonts w:ascii="Symbol" w:hAnsi="Symbol" w:hint="default"/>
+      </w:rPr>
+    </w:lvl>
+    <w:lvl w:ilvl="7" w:tplc="04090003" w:tentative="1">
+      <w:start w:val="1"/>
+      <w:numFmt w:val="bullet"/>
+      <w:lvlText w:val="o"/>
+      <w:lvlJc w:val="left"/>
+      <w:pPr>
+        <w:ind w:left="5760" w:hanging="360"/>
+      </w:pPr>
+      <w:rPr>
+        <w:rFonts w:ascii="Courier New" w:hAnsi="Courier New" w:cs="Courier New" w:hint="default"/>
+      </w:rPr>
+    </w:lvl>
+    <w:lvl w:ilvl="8" w:tplc="04090005" w:tentative="1">
+      <w:start w:val="1"/>
+      <w:numFmt w:val="bullet"/>
+      <w:lvlText w:val=""/>
+      <w:lvlJc w:val="left"/>
+      <w:pPr>
+        <w:ind w:left="6480" w:hanging="360"/>
+      </w:pPr>
+      <w:rPr>
+        <w:rFonts w:ascii="Wingdings" w:hAnsi="Wingdings" w:hint="default"/>
+      </w:rPr>
+    </w:lvl>
+  </w:abstractNum>
+  <w:abstractNum w:abstractNumId="39" w15:restartNumberingAfterBreak="0">
+    <w:nsid w:val="658B539E"/>
+    <w:multiLevelType w:val="hybridMultilevel"/>
+    <w:tmpl w:val="21AC424E"/>
+    <w:lvl w:ilvl="0" w:tplc="04090001">
+      <w:start w:val="1"/>
+      <w:numFmt w:val="bullet"/>
+      <w:lvlText w:val=""/>
+      <w:lvlJc w:val="left"/>
+      <w:pPr>
+        <w:ind w:left="720" w:hanging="360"/>
+      </w:pPr>
+      <w:rPr>
+        <w:rFonts w:ascii="Symbol" w:hAnsi="Symbol" w:hint="default"/>
+      </w:rPr>
+    </w:lvl>
+    <w:lvl w:ilvl="1" w:tplc="04090003" w:tentative="1">
+      <w:start w:val="1"/>
+      <w:numFmt w:val="bullet"/>
+      <w:lvlText w:val="o"/>
+      <w:lvlJc w:val="left"/>
+      <w:pPr>
+        <w:ind w:left="1440" w:hanging="360"/>
+      </w:pPr>
+      <w:rPr>
+        <w:rFonts w:ascii="Courier New" w:hAnsi="Courier New" w:cs="Courier New" w:hint="default"/>
+      </w:rPr>
+    </w:lvl>
+    <w:lvl w:ilvl="2" w:tplc="04090005" w:tentative="1">
+      <w:start w:val="1"/>
+      <w:numFmt w:val="bullet"/>
+      <w:lvlText w:val=""/>
+      <w:lvlJc w:val="left"/>
+      <w:pPr>
+        <w:ind w:left="2160" w:hanging="360"/>
+      </w:pPr>
+      <w:rPr>
+        <w:rFonts w:ascii="Wingdings" w:hAnsi="Wingdings" w:hint="default"/>
+      </w:rPr>
+    </w:lvl>
+    <w:lvl w:ilvl="3" w:tplc="04090001" w:tentative="1">
+      <w:start w:val="1"/>
+      <w:numFmt w:val="bullet"/>
+      <w:lvlText w:val=""/>
+      <w:lvlJc w:val="left"/>
+      <w:pPr>
+        <w:ind w:left="2880" w:hanging="360"/>
+      </w:pPr>
+      <w:rPr>
+        <w:rFonts w:ascii="Symbol" w:hAnsi="Symbol" w:hint="default"/>
+      </w:rPr>
+    </w:lvl>
+    <w:lvl w:ilvl="4" w:tplc="04090003" w:tentative="1">
+      <w:start w:val="1"/>
+      <w:numFmt w:val="bullet"/>
+      <w:lvlText w:val="o"/>
+      <w:lvlJc w:val="left"/>
+      <w:pPr>
+        <w:ind w:left="3600" w:hanging="360"/>
+      </w:pPr>
+      <w:rPr>
+        <w:rFonts w:ascii="Courier New" w:hAnsi="Courier New" w:cs="Courier New" w:hint="default"/>
+      </w:rPr>
+    </w:lvl>
+    <w:lvl w:ilvl="5" w:tplc="04090005" w:tentative="1">
+      <w:start w:val="1"/>
+      <w:numFmt w:val="bullet"/>
+      <w:lvlText w:val=""/>
+      <w:lvlJc w:val="left"/>
+      <w:pPr>
+        <w:ind w:left="4320" w:hanging="360"/>
+      </w:pPr>
+      <w:rPr>
+        <w:rFonts w:ascii="Wingdings" w:hAnsi="Wingdings" w:hint="default"/>
+      </w:rPr>
+    </w:lvl>
+    <w:lvl w:ilvl="6" w:tplc="04090001" w:tentative="1">
+      <w:start w:val="1"/>
+      <w:numFmt w:val="bullet"/>
+      <w:lvlText w:val=""/>
+      <w:lvlJc w:val="left"/>
+      <w:pPr>
+        <w:ind w:left="5040" w:hanging="360"/>
+      </w:pPr>
+      <w:rPr>
+        <w:rFonts w:ascii="Symbol" w:hAnsi="Symbol" w:hint="default"/>
+      </w:rPr>
+    </w:lvl>
+    <w:lvl w:ilvl="7" w:tplc="04090003" w:tentative="1">
+      <w:start w:val="1"/>
+      <w:numFmt w:val="bullet"/>
+      <w:lvlText w:val="o"/>
+      <w:lvlJc w:val="left"/>
+      <w:pPr>
+        <w:ind w:left="5760" w:hanging="360"/>
+      </w:pPr>
+      <w:rPr>
+        <w:rFonts w:ascii="Courier New" w:hAnsi="Courier New" w:cs="Courier New" w:hint="default"/>
+      </w:rPr>
+    </w:lvl>
+    <w:lvl w:ilvl="8" w:tplc="04090005" w:tentative="1">
+      <w:start w:val="1"/>
+      <w:numFmt w:val="bullet"/>
+      <w:lvlText w:val=""/>
+      <w:lvlJc w:val="left"/>
+      <w:pPr>
+        <w:ind w:left="6480" w:hanging="360"/>
+      </w:pPr>
+      <w:rPr>
+        <w:rFonts w:ascii="Wingdings" w:hAnsi="Wingdings" w:hint="default"/>
+      </w:rPr>
+    </w:lvl>
+  </w:abstractNum>
+  <w:abstractNum w:abstractNumId="40" w15:restartNumberingAfterBreak="0">
     <w:nsid w:val="66633C11"/>
     <w:multiLevelType w:val="hybridMultilevel"/>
     <w:tmpl w:val="149870D0"/>
@@ -6802,7 +7073,120 @@
       </w:rPr>
     </w:lvl>
   </w:abstractNum>
-  <w:abstractNum w:abstractNumId="36" w15:restartNumberingAfterBreak="0">
+  <w:abstractNum w:abstractNumId="41" w15:restartNumberingAfterBreak="0">
+    <w:nsid w:val="67AE423F"/>
+    <w:multiLevelType w:val="hybridMultilevel"/>
+    <w:tmpl w:val="44527CC8"/>
+    <w:lvl w:ilvl="0" w:tplc="04090001">
+      <w:start w:val="1"/>
+      <w:numFmt w:val="bullet"/>
+      <w:lvlText w:val=""/>
+      <w:lvlJc w:val="left"/>
+      <w:pPr>
+        <w:ind w:left="720" w:hanging="360"/>
+      </w:pPr>
+      <w:rPr>
+        <w:rFonts w:ascii="Symbol" w:hAnsi="Symbol" w:hint="default"/>
+      </w:rPr>
+    </w:lvl>
+    <w:lvl w:ilvl="1" w:tplc="04090003" w:tentative="1">
+      <w:start w:val="1"/>
+      <w:numFmt w:val="bullet"/>
+      <w:lvlText w:val="o"/>
+      <w:lvlJc w:val="left"/>
+      <w:pPr>
+        <w:ind w:left="1440" w:hanging="360"/>
+      </w:pPr>
+      <w:rPr>
+        <w:rFonts w:ascii="Courier New" w:hAnsi="Courier New" w:cs="Courier New" w:hint="default"/>
+      </w:rPr>
+    </w:lvl>
+    <w:lvl w:ilvl="2" w:tplc="04090005" w:tentative="1">
+      <w:start w:val="1"/>
+      <w:numFmt w:val="bullet"/>
+      <w:lvlText w:val=""/>
+      <w:lvlJc w:val="left"/>
+      <w:pPr>
+        <w:ind w:left="2160" w:hanging="360"/>
+      </w:pPr>
+      <w:rPr>
+        <w:rFonts w:ascii="Wingdings" w:hAnsi="Wingdings" w:hint="default"/>
+      </w:rPr>
+    </w:lvl>
+    <w:lvl w:ilvl="3" w:tplc="04090001" w:tentative="1">
+      <w:start w:val="1"/>
+      <w:numFmt w:val="bullet"/>
+      <w:lvlText w:val=""/>
+      <w:lvlJc w:val="left"/>
+      <w:pPr>
+        <w:ind w:left="2880" w:hanging="360"/>
+      </w:pPr>
+      <w:rPr>
+        <w:rFonts w:ascii="Symbol" w:hAnsi="Symbol" w:hint="default"/>
+      </w:rPr>
+    </w:lvl>
+    <w:lvl w:ilvl="4" w:tplc="04090003" w:tentative="1">
+      <w:start w:val="1"/>
+      <w:numFmt w:val="bullet"/>
+      <w:lvlText w:val="o"/>
+      <w:lvlJc w:val="left"/>
+      <w:pPr>
+        <w:ind w:left="3600" w:hanging="360"/>
+      </w:pPr>
+      <w:rPr>
+        <w:rFonts w:ascii="Courier New" w:hAnsi="Courier New" w:cs="Courier New" w:hint="default"/>
+      </w:rPr>
+    </w:lvl>
+    <w:lvl w:ilvl="5" w:tplc="04090005" w:tentative="1">
+      <w:start w:val="1"/>
+      <w:numFmt w:val="bullet"/>
+      <w:lvlText w:val=""/>
+      <w:lvlJc w:val="left"/>
+      <w:pPr>
+        <w:ind w:left="4320" w:hanging="360"/>
+      </w:pPr>
+      <w:rPr>
+        <w:rFonts w:ascii="Wingdings" w:hAnsi="Wingdings" w:hint="default"/>
+      </w:rPr>
+    </w:lvl>
+    <w:lvl w:ilvl="6" w:tplc="04090001" w:tentative="1">
+      <w:start w:val="1"/>
+      <w:numFmt w:val="bullet"/>
+      <w:lvlText w:val=""/>
+      <w:lvlJc w:val="left"/>
+      <w:pPr>
+        <w:ind w:left="5040" w:hanging="360"/>
+      </w:pPr>
+      <w:rPr>
+        <w:rFonts w:ascii="Symbol" w:hAnsi="Symbol" w:hint="default"/>
+      </w:rPr>
+    </w:lvl>
+    <w:lvl w:ilvl="7" w:tplc="04090003" w:tentative="1">
+      <w:start w:val="1"/>
+      <w:numFmt w:val="bullet"/>
+      <w:lvlText w:val="o"/>
+      <w:lvlJc w:val="left"/>
+      <w:pPr>
+        <w:ind w:left="5760" w:hanging="360"/>
+      </w:pPr>
+      <w:rPr>
+        <w:rFonts w:ascii="Courier New" w:hAnsi="Courier New" w:cs="Courier New" w:hint="default"/>
+      </w:rPr>
+    </w:lvl>
+    <w:lvl w:ilvl="8" w:tplc="04090005" w:tentative="1">
+      <w:start w:val="1"/>
+      <w:numFmt w:val="bullet"/>
+      <w:lvlText w:val=""/>
+      <w:lvlJc w:val="left"/>
+      <w:pPr>
+        <w:ind w:left="6480" w:hanging="360"/>
+      </w:pPr>
+      <w:rPr>
+        <w:rFonts w:ascii="Wingdings" w:hAnsi="Wingdings" w:hint="default"/>
+      </w:rPr>
+    </w:lvl>
+  </w:abstractNum>
+  <w:abstractNum w:abstractNumId="42" w15:restartNumberingAfterBreak="0">
     <w:nsid w:val="68985324"/>
     <w:multiLevelType w:val="hybridMultilevel"/>
     <w:tmpl w:val="A7F28EFA"/>
@@ -6915,7 +7299,7 @@
       </w:rPr>
     </w:lvl>
   </w:abstractNum>
-  <w:abstractNum w:abstractNumId="37" w15:restartNumberingAfterBreak="0">
+  <w:abstractNum w:abstractNumId="43" w15:restartNumberingAfterBreak="0">
     <w:nsid w:val="68A84F18"/>
     <w:multiLevelType w:val="hybridMultilevel"/>
     <w:tmpl w:val="3078C6A8"/>
@@ -7028,7 +7412,7 @@
       </w:rPr>
     </w:lvl>
   </w:abstractNum>
-  <w:abstractNum w:abstractNumId="38" w15:restartNumberingAfterBreak="0">
+  <w:abstractNum w:abstractNumId="44" w15:restartNumberingAfterBreak="0">
     <w:nsid w:val="69342FD7"/>
     <w:multiLevelType w:val="hybridMultilevel"/>
     <w:tmpl w:val="EEEC966A"/>
@@ -7141,7 +7525,7 @@
       </w:rPr>
     </w:lvl>
   </w:abstractNum>
-  <w:abstractNum w:abstractNumId="39" w15:restartNumberingAfterBreak="0">
+  <w:abstractNum w:abstractNumId="45" w15:restartNumberingAfterBreak="0">
     <w:nsid w:val="69621777"/>
     <w:multiLevelType w:val="hybridMultilevel"/>
     <w:tmpl w:val="A79451F4"/>
@@ -7254,7 +7638,120 @@
       </w:rPr>
     </w:lvl>
   </w:abstractNum>
-  <w:abstractNum w:abstractNumId="40" w15:restartNumberingAfterBreak="0">
+  <w:abstractNum w:abstractNumId="46" w15:restartNumberingAfterBreak="0">
+    <w:nsid w:val="6B0A3843"/>
+    <w:multiLevelType w:val="hybridMultilevel"/>
+    <w:tmpl w:val="59EE5E0C"/>
+    <w:lvl w:ilvl="0" w:tplc="04090001">
+      <w:start w:val="1"/>
+      <w:numFmt w:val="bullet"/>
+      <w:lvlText w:val=""/>
+      <w:lvlJc w:val="left"/>
+      <w:pPr>
+        <w:ind w:left="720" w:hanging="360"/>
+      </w:pPr>
+      <w:rPr>
+        <w:rFonts w:ascii="Symbol" w:hAnsi="Symbol" w:hint="default"/>
+      </w:rPr>
+    </w:lvl>
+    <w:lvl w:ilvl="1" w:tplc="04090003" w:tentative="1">
+      <w:start w:val="1"/>
+      <w:numFmt w:val="bullet"/>
+      <w:lvlText w:val="o"/>
+      <w:lvlJc w:val="left"/>
+      <w:pPr>
+        <w:ind w:left="1440" w:hanging="360"/>
+      </w:pPr>
+      <w:rPr>
+        <w:rFonts w:ascii="Courier New" w:hAnsi="Courier New" w:cs="Courier New" w:hint="default"/>
+      </w:rPr>
+    </w:lvl>
+    <w:lvl w:ilvl="2" w:tplc="04090005" w:tentative="1">
+      <w:start w:val="1"/>
+      <w:numFmt w:val="bullet"/>
+      <w:lvlText w:val=""/>
+      <w:lvlJc w:val="left"/>
+      <w:pPr>
+        <w:ind w:left="2160" w:hanging="360"/>
+      </w:pPr>
+      <w:rPr>
+        <w:rFonts w:ascii="Wingdings" w:hAnsi="Wingdings" w:hint="default"/>
+      </w:rPr>
+    </w:lvl>
+    <w:lvl w:ilvl="3" w:tplc="04090001" w:tentative="1">
+      <w:start w:val="1"/>
+      <w:numFmt w:val="bullet"/>
+      <w:lvlText w:val=""/>
+      <w:lvlJc w:val="left"/>
+      <w:pPr>
+        <w:ind w:left="2880" w:hanging="360"/>
+      </w:pPr>
+      <w:rPr>
+        <w:rFonts w:ascii="Symbol" w:hAnsi="Symbol" w:hint="default"/>
+      </w:rPr>
+    </w:lvl>
+    <w:lvl w:ilvl="4" w:tplc="04090003" w:tentative="1">
+      <w:start w:val="1"/>
+      <w:numFmt w:val="bullet"/>
+      <w:lvlText w:val="o"/>
+      <w:lvlJc w:val="left"/>
+      <w:pPr>
+        <w:ind w:left="3600" w:hanging="360"/>
+      </w:pPr>
+      <w:rPr>
+        <w:rFonts w:ascii="Courier New" w:hAnsi="Courier New" w:cs="Courier New" w:hint="default"/>
+      </w:rPr>
+    </w:lvl>
+    <w:lvl w:ilvl="5" w:tplc="04090005" w:tentative="1">
+      <w:start w:val="1"/>
+      <w:numFmt w:val="bullet"/>
+      <w:lvlText w:val=""/>
+      <w:lvlJc w:val="left"/>
+      <w:pPr>
+        <w:ind w:left="4320" w:hanging="360"/>
+      </w:pPr>
+      <w:rPr>
+        <w:rFonts w:ascii="Wingdings" w:hAnsi="Wingdings" w:hint="default"/>
+      </w:rPr>
+    </w:lvl>
+    <w:lvl w:ilvl="6" w:tplc="04090001" w:tentative="1">
+      <w:start w:val="1"/>
+      <w:numFmt w:val="bullet"/>
+      <w:lvlText w:val=""/>
+      <w:lvlJc w:val="left"/>
+      <w:pPr>
+        <w:ind w:left="5040" w:hanging="360"/>
+      </w:pPr>
+      <w:rPr>
+        <w:rFonts w:ascii="Symbol" w:hAnsi="Symbol" w:hint="default"/>
+      </w:rPr>
+    </w:lvl>
+    <w:lvl w:ilvl="7" w:tplc="04090003" w:tentative="1">
+      <w:start w:val="1"/>
+      <w:numFmt w:val="bullet"/>
+      <w:lvlText w:val="o"/>
+      <w:lvlJc w:val="left"/>
+      <w:pPr>
+        <w:ind w:left="5760" w:hanging="360"/>
+      </w:pPr>
+      <w:rPr>
+        <w:rFonts w:ascii="Courier New" w:hAnsi="Courier New" w:cs="Courier New" w:hint="default"/>
+      </w:rPr>
+    </w:lvl>
+    <w:lvl w:ilvl="8" w:tplc="04090005" w:tentative="1">
+      <w:start w:val="1"/>
+      <w:numFmt w:val="bullet"/>
+      <w:lvlText w:val=""/>
+      <w:lvlJc w:val="left"/>
+      <w:pPr>
+        <w:ind w:left="6480" w:hanging="360"/>
+      </w:pPr>
+      <w:rPr>
+        <w:rFonts w:ascii="Wingdings" w:hAnsi="Wingdings" w:hint="default"/>
+      </w:rPr>
+    </w:lvl>
+  </w:abstractNum>
+  <w:abstractNum w:abstractNumId="47" w15:restartNumberingAfterBreak="0">
     <w:nsid w:val="6E1D2BD3"/>
     <w:multiLevelType w:val="hybridMultilevel"/>
     <w:tmpl w:val="E06EA030"/>
@@ -7367,7 +7864,7 @@
       </w:rPr>
     </w:lvl>
   </w:abstractNum>
-  <w:abstractNum w:abstractNumId="41" w15:restartNumberingAfterBreak="0">
+  <w:abstractNum w:abstractNumId="48" w15:restartNumberingAfterBreak="0">
     <w:nsid w:val="6EAC1399"/>
     <w:multiLevelType w:val="hybridMultilevel"/>
     <w:tmpl w:val="515CBC54"/>
@@ -7480,7 +7977,7 @@
       </w:rPr>
     </w:lvl>
   </w:abstractNum>
-  <w:abstractNum w:abstractNumId="42" w15:restartNumberingAfterBreak="0">
+  <w:abstractNum w:abstractNumId="49" w15:restartNumberingAfterBreak="0">
     <w:nsid w:val="70EA1A73"/>
     <w:multiLevelType w:val="hybridMultilevel"/>
     <w:tmpl w:val="E968D3FC"/>
@@ -7593,7 +8090,7 @@
       </w:rPr>
     </w:lvl>
   </w:abstractNum>
-  <w:abstractNum w:abstractNumId="43" w15:restartNumberingAfterBreak="0">
+  <w:abstractNum w:abstractNumId="50" w15:restartNumberingAfterBreak="0">
     <w:nsid w:val="76F9736E"/>
     <w:multiLevelType w:val="multilevel"/>
     <w:tmpl w:val="396AED1C"/>
@@ -7742,7 +8239,7 @@
       </w:rPr>
     </w:lvl>
   </w:abstractNum>
-  <w:abstractNum w:abstractNumId="44" w15:restartNumberingAfterBreak="0">
+  <w:abstractNum w:abstractNumId="51" w15:restartNumberingAfterBreak="0">
     <w:nsid w:val="776776E9"/>
     <w:multiLevelType w:val="hybridMultilevel"/>
     <w:tmpl w:val="5B5A20AA"/>
@@ -7855,7 +8352,7 @@
       </w:rPr>
     </w:lvl>
   </w:abstractNum>
-  <w:abstractNum w:abstractNumId="45" w15:restartNumberingAfterBreak="0">
+  <w:abstractNum w:abstractNumId="52" w15:restartNumberingAfterBreak="0">
     <w:nsid w:val="7BEA0A8F"/>
     <w:multiLevelType w:val="hybridMultilevel"/>
     <w:tmpl w:val="0A06D7B4"/>
@@ -7968,7 +8465,7 @@
       </w:rPr>
     </w:lvl>
   </w:abstractNum>
-  <w:abstractNum w:abstractNumId="46" w15:restartNumberingAfterBreak="0">
+  <w:abstractNum w:abstractNumId="53" w15:restartNumberingAfterBreak="0">
     <w:nsid w:val="7D1D250B"/>
     <w:multiLevelType w:val="hybridMultilevel"/>
     <w:tmpl w:val="7DDE36F8"/>
@@ -8081,7 +8578,7 @@
       </w:rPr>
     </w:lvl>
   </w:abstractNum>
-  <w:abstractNum w:abstractNumId="47" w15:restartNumberingAfterBreak="0">
+  <w:abstractNum w:abstractNumId="54" w15:restartNumberingAfterBreak="0">
     <w:nsid w:val="7DE20E47"/>
     <w:multiLevelType w:val="hybridMultilevel"/>
     <w:tmpl w:val="B300A1A2"/>
@@ -8195,34 +8692,34 @@
     </w:lvl>
   </w:abstractNum>
   <w:num w:numId="1" w16cid:durableId="828862710">
-    <w:abstractNumId w:val="34"/>
+    <w:abstractNumId w:val="37"/>
   </w:num>
   <w:num w:numId="2" w16cid:durableId="1356692034">
-    <w:abstractNumId w:val="46"/>
+    <w:abstractNumId w:val="53"/>
   </w:num>
   <w:num w:numId="3" w16cid:durableId="756830097">
     <w:abstractNumId w:val="21"/>
   </w:num>
   <w:num w:numId="4" w16cid:durableId="1341852627">
-    <w:abstractNumId w:val="30"/>
+    <w:abstractNumId w:val="32"/>
   </w:num>
   <w:num w:numId="5" w16cid:durableId="680158528">
     <w:abstractNumId w:val="11"/>
   </w:num>
   <w:num w:numId="6" w16cid:durableId="2006785698">
-    <w:abstractNumId w:val="36"/>
+    <w:abstractNumId w:val="42"/>
   </w:num>
   <w:num w:numId="7" w16cid:durableId="219486840">
     <w:abstractNumId w:val="13"/>
   </w:num>
   <w:num w:numId="8" w16cid:durableId="1253509742">
-    <w:abstractNumId w:val="27"/>
+    <w:abstractNumId w:val="29"/>
   </w:num>
   <w:num w:numId="9" w16cid:durableId="95488419">
-    <w:abstractNumId w:val="40"/>
+    <w:abstractNumId w:val="47"/>
   </w:num>
   <w:num w:numId="10" w16cid:durableId="806163805">
-    <w:abstractNumId w:val="32"/>
+    <w:abstractNumId w:val="35"/>
   </w:num>
   <w:num w:numId="11" w16cid:durableId="912352183">
     <w:abstractNumId w:val="16"/>
@@ -8234,16 +8731,16 @@
     <w:abstractNumId w:val="19"/>
   </w:num>
   <w:num w:numId="14" w16cid:durableId="263415914">
-    <w:abstractNumId w:val="35"/>
+    <w:abstractNumId w:val="40"/>
   </w:num>
   <w:num w:numId="15" w16cid:durableId="92630070">
     <w:abstractNumId w:val="17"/>
   </w:num>
   <w:num w:numId="16" w16cid:durableId="2029671194">
-    <w:abstractNumId w:val="31"/>
+    <w:abstractNumId w:val="34"/>
   </w:num>
   <w:num w:numId="17" w16cid:durableId="728959302">
-    <w:abstractNumId w:val="47"/>
+    <w:abstractNumId w:val="54"/>
   </w:num>
   <w:num w:numId="18" w16cid:durableId="1258370805">
     <w:abstractNumId w:val="6"/>
@@ -8252,19 +8749,19 @@
     <w:abstractNumId w:val="0"/>
   </w:num>
   <w:num w:numId="20" w16cid:durableId="1424378757">
-    <w:abstractNumId w:val="44"/>
+    <w:abstractNumId w:val="51"/>
   </w:num>
   <w:num w:numId="21" w16cid:durableId="1290938039">
-    <w:abstractNumId w:val="45"/>
+    <w:abstractNumId w:val="52"/>
   </w:num>
   <w:num w:numId="22" w16cid:durableId="459105670">
     <w:abstractNumId w:val="7"/>
   </w:num>
   <w:num w:numId="23" w16cid:durableId="505637807">
-    <w:abstractNumId w:val="38"/>
+    <w:abstractNumId w:val="44"/>
   </w:num>
   <w:num w:numId="24" w16cid:durableId="1843545721">
-    <w:abstractNumId w:val="43"/>
+    <w:abstractNumId w:val="50"/>
   </w:num>
   <w:num w:numId="25" w16cid:durableId="1808279424">
     <w:abstractNumId w:val="4"/>
@@ -8273,28 +8770,28 @@
     <w:abstractNumId w:val="20"/>
   </w:num>
   <w:num w:numId="27" w16cid:durableId="129788310">
-    <w:abstractNumId w:val="33"/>
+    <w:abstractNumId w:val="36"/>
   </w:num>
   <w:num w:numId="28" w16cid:durableId="1095327119">
     <w:abstractNumId w:val="1"/>
   </w:num>
   <w:num w:numId="29" w16cid:durableId="1199666349">
-    <w:abstractNumId w:val="41"/>
+    <w:abstractNumId w:val="48"/>
   </w:num>
   <w:num w:numId="30" w16cid:durableId="1091463587">
-    <w:abstractNumId w:val="42"/>
+    <w:abstractNumId w:val="49"/>
   </w:num>
   <w:num w:numId="31" w16cid:durableId="815924855">
     <w:abstractNumId w:val="23"/>
   </w:num>
   <w:num w:numId="32" w16cid:durableId="1139807878">
-    <w:abstractNumId w:val="26"/>
+    <w:abstractNumId w:val="27"/>
   </w:num>
   <w:num w:numId="33" w16cid:durableId="1238200991">
     <w:abstractNumId w:val="2"/>
   </w:num>
   <w:num w:numId="34" w16cid:durableId="2007439656">
-    <w:abstractNumId w:val="28"/>
+    <w:abstractNumId w:val="30"/>
   </w:num>
   <w:num w:numId="35" w16cid:durableId="195385350">
     <w:abstractNumId w:val="14"/>
@@ -8303,7 +8800,7 @@
     <w:abstractNumId w:val="12"/>
   </w:num>
   <w:num w:numId="37" w16cid:durableId="1356074323">
-    <w:abstractNumId w:val="37"/>
+    <w:abstractNumId w:val="43"/>
   </w:num>
   <w:num w:numId="38" w16cid:durableId="746608782">
     <w:abstractNumId w:val="9"/>
@@ -8324,7 +8821,7 @@
     <w:abstractNumId w:val="5"/>
   </w:num>
   <w:num w:numId="44" w16cid:durableId="331952820">
-    <w:abstractNumId w:val="39"/>
+    <w:abstractNumId w:val="45"/>
   </w:num>
   <w:num w:numId="45" w16cid:durableId="1569539938">
     <w:abstractNumId w:val="22"/>
@@ -8333,10 +8830,31 @@
     <w:abstractNumId w:val="15"/>
   </w:num>
   <w:num w:numId="47" w16cid:durableId="2070765148">
-    <w:abstractNumId w:val="29"/>
+    <w:abstractNumId w:val="31"/>
   </w:num>
   <w:num w:numId="48" w16cid:durableId="666981989">
     <w:abstractNumId w:val="25"/>
+  </w:num>
+  <w:num w:numId="49" w16cid:durableId="1645427173">
+    <w:abstractNumId w:val="28"/>
+  </w:num>
+  <w:num w:numId="50" w16cid:durableId="684983865">
+    <w:abstractNumId w:val="46"/>
+  </w:num>
+  <w:num w:numId="51" w16cid:durableId="1500541868">
+    <w:abstractNumId w:val="33"/>
+  </w:num>
+  <w:num w:numId="52" w16cid:durableId="405223586">
+    <w:abstractNumId w:val="39"/>
+  </w:num>
+  <w:num w:numId="53" w16cid:durableId="561527743">
+    <w:abstractNumId w:val="26"/>
+  </w:num>
+  <w:num w:numId="54" w16cid:durableId="326136511">
+    <w:abstractNumId w:val="41"/>
+  </w:num>
+  <w:num w:numId="55" w16cid:durableId="712123152">
+    <w:abstractNumId w:val="38"/>
   </w:num>
 </w:numbering>
 </file>
@@ -8945,7 +9463,6 @@
   <w:style w:type="character" w:default="1" w:styleId="DefaultParagraphFont">
     <w:name w:val="Default Paragraph Font"/>
     <w:uiPriority w:val="1"/>
-    <w:semiHidden/>
     <w:unhideWhenUsed/>
   </w:style>
   <w:style w:type="table" w:default="1" w:styleId="TableNormal">

</xml_diff>